<commit_message>
Use real sensor product photos in handout
</commit_message>
<xml_diff>
--- a/THESIS DOCUMENTATION/FALCON Sensor Approval List for Panel.docx
+++ b/THESIS DOCUMENTATION/FALCON Sensor Approval List for Panel.docx
@@ -486,7 +486,7 @@
     </w:p>
     <w:p>
       <w:r>
-        <w:t>Each card shows the role, the current planning price, where to verify the item, and the approval note. Product pictures are reference visuals only; the exact SKU and seller must be checked again before buying.</w:t>
+        <w:t>Each card shows the role, the current planning price, where to verify the item, and the approval note. Product pictures are real reference photos from online product listings or product photo sources; the exact SKU and seller must still be checked again before buying.</w:t>
       </w:r>
     </w:p>
     <w:tbl>
@@ -529,7 +529,7 @@
             <w:r>
               <w:drawing>
                 <wp:inline xmlns:a="http://schemas.openxmlformats.org/drawingml/2006/main" xmlns:pic="http://schemas.openxmlformats.org/drawingml/2006/picture">
-                  <wp:extent cx="1572768" cy="1094099"/>
+                  <wp:extent cx="1572768" cy="1092009"/>
                   <wp:docPr id="1" name="Picture 1"/>
                   <wp:cNvGraphicFramePr>
                     <a:graphicFrameLocks noChangeAspect="1"/>
@@ -550,7 +550,7 @@
                         <pic:spPr>
                           <a:xfrm>
                             <a:off x="0" y="0"/>
-                            <a:ext cx="1572768" cy="1094099"/>
+                            <a:ext cx="1572768" cy="1092009"/>
                           </a:xfrm>
                           <a:prstGeom prst="rect"/>
                         </pic:spPr>
@@ -580,7 +580,6 @@
             <w:r>
               <w:rPr>
                 <w:b/>
-                <w:color w:val="000000"/>
                 <w:sz w:val="17"/>
               </w:rPr>
               <w:t>Water pressure and wave input</w:t>
@@ -593,6 +592,12 @@
             <w:r>
               <w:rPr>
                 <w:b/>
+                <w:sz w:val="17"/>
+              </w:rPr>
+              <w:t xml:space="preserve">Priority: </w:t>
+            </w:r>
+            <w:r>
+              <w:rPr>
                 <w:sz w:val="17"/>
               </w:rPr>
               <w:t>Required</w:t>
@@ -718,7 +723,7 @@
             <w:r>
               <w:drawing>
                 <wp:inline xmlns:a="http://schemas.openxmlformats.org/drawingml/2006/main" xmlns:pic="http://schemas.openxmlformats.org/drawingml/2006/picture">
-                  <wp:extent cx="1572768" cy="1094099"/>
+                  <wp:extent cx="1572768" cy="1092009"/>
                   <wp:docPr id="2" name="Picture 2"/>
                   <wp:cNvGraphicFramePr>
                     <a:graphicFrameLocks noChangeAspect="1"/>
@@ -739,7 +744,7 @@
                         <pic:spPr>
                           <a:xfrm>
                             <a:off x="0" y="0"/>
-                            <a:ext cx="1572768" cy="1094099"/>
+                            <a:ext cx="1572768" cy="1092009"/>
                           </a:xfrm>
                           <a:prstGeom prst="rect"/>
                         </pic:spPr>
@@ -769,7 +774,6 @@
             <w:r>
               <w:rPr>
                 <w:b/>
-                <w:color w:val="000000"/>
                 <w:sz w:val="17"/>
               </w:rPr>
               <w:t>Pressure signal interface</w:t>
@@ -782,6 +786,12 @@
             <w:r>
               <w:rPr>
                 <w:b/>
+                <w:sz w:val="17"/>
+              </w:rPr>
+              <w:t xml:space="preserve">Priority: </w:t>
+            </w:r>
+            <w:r>
+              <w:rPr>
                 <w:sz w:val="17"/>
               </w:rPr>
               <w:t>Required interface</w:t>
@@ -907,7 +917,7 @@
             <w:r>
               <w:drawing>
                 <wp:inline xmlns:a="http://schemas.openxmlformats.org/drawingml/2006/main" xmlns:pic="http://schemas.openxmlformats.org/drawingml/2006/picture">
-                  <wp:extent cx="1572768" cy="1094099"/>
+                  <wp:extent cx="1572768" cy="1092009"/>
                   <wp:docPr id="3" name="Picture 3"/>
                   <wp:cNvGraphicFramePr>
                     <a:graphicFrameLocks noChangeAspect="1"/>
@@ -928,7 +938,7 @@
                         <pic:spPr>
                           <a:xfrm>
                             <a:off x="0" y="0"/>
-                            <a:ext cx="1572768" cy="1094099"/>
+                            <a:ext cx="1572768" cy="1092009"/>
                           </a:xfrm>
                           <a:prstGeom prst="rect"/>
                         </pic:spPr>
@@ -958,7 +968,6 @@
             <w:r>
               <w:rPr>
                 <w:b/>
-                <w:color w:val="000000"/>
                 <w:sz w:val="17"/>
               </w:rPr>
               <w:t>Wind speed and direction</w:t>
@@ -971,6 +980,12 @@
             <w:r>
               <w:rPr>
                 <w:b/>
+                <w:sz w:val="17"/>
+              </w:rPr>
+              <w:t xml:space="preserve">Priority: </w:t>
+            </w:r>
+            <w:r>
+              <w:rPr>
                 <w:sz w:val="17"/>
               </w:rPr>
               <w:t>Required</w:t>
@@ -1096,7 +1111,7 @@
             <w:r>
               <w:drawing>
                 <wp:inline xmlns:a="http://schemas.openxmlformats.org/drawingml/2006/main" xmlns:pic="http://schemas.openxmlformats.org/drawingml/2006/picture">
-                  <wp:extent cx="1572768" cy="1083462"/>
+                  <wp:extent cx="1572768" cy="1092009"/>
                   <wp:docPr id="4" name="Picture 4"/>
                   <wp:cNvGraphicFramePr>
                     <a:graphicFrameLocks noChangeAspect="1"/>
@@ -1117,7 +1132,7 @@
                         <pic:spPr>
                           <a:xfrm>
                             <a:off x="0" y="0"/>
-                            <a:ext cx="1572768" cy="1083462"/>
+                            <a:ext cx="1572768" cy="1092009"/>
                           </a:xfrm>
                           <a:prstGeom prst="rect"/>
                         </pic:spPr>
@@ -1147,7 +1162,6 @@
             <w:r>
               <w:rPr>
                 <w:b/>
-                <w:color w:val="000000"/>
                 <w:sz w:val="17"/>
               </w:rPr>
               <w:t>GPS position and security</w:t>
@@ -1160,6 +1174,12 @@
             <w:r>
               <w:rPr>
                 <w:b/>
+                <w:sz w:val="17"/>
+              </w:rPr>
+              <w:t xml:space="preserve">Priority: </w:t>
+            </w:r>
+            <w:r>
+              <w:rPr>
                 <w:sz w:val="17"/>
               </w:rPr>
               <w:t>Required</w:t>
@@ -1245,9 +1265,6 @@
         <w:spacing w:after="40"/>
       </w:pPr>
     </w:p>
-    <w:p>
-      <w:r/>
-    </w:p>
     <w:tbl>
       <w:tblPr>
         <w:tblW w:type="auto" w:w="0"/>
@@ -1288,7 +1305,7 @@
             <w:r>
               <w:drawing>
                 <wp:inline xmlns:a="http://schemas.openxmlformats.org/drawingml/2006/main" xmlns:pic="http://schemas.openxmlformats.org/drawingml/2006/picture">
-                  <wp:extent cx="1572768" cy="1083462"/>
+                  <wp:extent cx="1572768" cy="1092009"/>
                   <wp:docPr id="5" name="Picture 5"/>
                   <wp:cNvGraphicFramePr>
                     <a:graphicFrameLocks noChangeAspect="1"/>
@@ -1309,7 +1326,7 @@
                         <pic:spPr>
                           <a:xfrm>
                             <a:off x="0" y="0"/>
-                            <a:ext cx="1572768" cy="1083462"/>
+                            <a:ext cx="1572768" cy="1092009"/>
                           </a:xfrm>
                           <a:prstGeom prst="rect"/>
                         </pic:spPr>
@@ -1339,7 +1356,6 @@
             <w:r>
               <w:rPr>
                 <w:b/>
-                <w:color w:val="000000"/>
                 <w:sz w:val="17"/>
               </w:rPr>
               <w:t>Battery and solar monitor</w:t>
@@ -1352,6 +1368,12 @@
             <w:r>
               <w:rPr>
                 <w:b/>
+                <w:sz w:val="17"/>
+              </w:rPr>
+              <w:t xml:space="preserve">Priority: </w:t>
+            </w:r>
+            <w:r>
+              <w:rPr>
                 <w:sz w:val="17"/>
               </w:rPr>
               <w:t>Required support</w:t>
@@ -1477,7 +1499,7 @@
             <w:r>
               <w:drawing>
                 <wp:inline xmlns:a="http://schemas.openxmlformats.org/drawingml/2006/main" xmlns:pic="http://schemas.openxmlformats.org/drawingml/2006/picture">
-                  <wp:extent cx="1572768" cy="1083462"/>
+                  <wp:extent cx="1572768" cy="1092009"/>
                   <wp:docPr id="6" name="Picture 6"/>
                   <wp:cNvGraphicFramePr>
                     <a:graphicFrameLocks noChangeAspect="1"/>
@@ -1498,7 +1520,7 @@
                         <pic:spPr>
                           <a:xfrm>
                             <a:off x="0" y="0"/>
-                            <a:ext cx="1572768" cy="1083462"/>
+                            <a:ext cx="1572768" cy="1092009"/>
                           </a:xfrm>
                           <a:prstGeom prst="rect"/>
                         </pic:spPr>
@@ -1528,7 +1550,6 @@
             <w:r>
               <w:rPr>
                 <w:b/>
-                <w:color w:val="000000"/>
                 <w:sz w:val="17"/>
               </w:rPr>
               <w:t>Internet module</w:t>
@@ -1541,6 +1562,12 @@
             <w:r>
               <w:rPr>
                 <w:b/>
+                <w:sz w:val="17"/>
+              </w:rPr>
+              <w:t xml:space="preserve">Priority: </w:t>
+            </w:r>
+            <w:r>
+              <w:rPr>
                 <w:sz w:val="17"/>
               </w:rPr>
               <w:t>Required communication support</w:t>
@@ -1666,7 +1693,7 @@
             <w:r>
               <w:drawing>
                 <wp:inline xmlns:a="http://schemas.openxmlformats.org/drawingml/2006/main" xmlns:pic="http://schemas.openxmlformats.org/drawingml/2006/picture">
-                  <wp:extent cx="1572768" cy="1083462"/>
+                  <wp:extent cx="1572768" cy="1092009"/>
                   <wp:docPr id="7" name="Picture 7"/>
                   <wp:cNvGraphicFramePr>
                     <a:graphicFrameLocks noChangeAspect="1"/>
@@ -1687,7 +1714,7 @@
                         <pic:spPr>
                           <a:xfrm>
                             <a:off x="0" y="0"/>
-                            <a:ext cx="1572768" cy="1083462"/>
+                            <a:ext cx="1572768" cy="1092009"/>
                           </a:xfrm>
                           <a:prstGeom prst="rect"/>
                         </pic:spPr>
@@ -1717,7 +1744,6 @@
             <w:r>
               <w:rPr>
                 <w:b/>
-                <w:color w:val="000000"/>
                 <w:sz w:val="17"/>
               </w:rPr>
               <w:t>Tilt and motion</w:t>
@@ -1730,6 +1756,12 @@
             <w:r>
               <w:rPr>
                 <w:b/>
+                <w:sz w:val="17"/>
+              </w:rPr>
+              <w:t xml:space="preserve">Priority: </w:t>
+            </w:r>
+            <w:r>
+              <w:rPr>
                 <w:sz w:val="17"/>
               </w:rPr>
               <w:t>Optional event/security</w:t>
@@ -1855,7 +1887,7 @@
             <w:r>
               <w:drawing>
                 <wp:inline xmlns:a="http://schemas.openxmlformats.org/drawingml/2006/main" xmlns:pic="http://schemas.openxmlformats.org/drawingml/2006/picture">
-                  <wp:extent cx="1572768" cy="1083462"/>
+                  <wp:extent cx="1572768" cy="1092009"/>
                   <wp:docPr id="8" name="Picture 8"/>
                   <wp:cNvGraphicFramePr>
                     <a:graphicFrameLocks noChangeAspect="1"/>
@@ -1876,7 +1908,7 @@
                         <pic:spPr>
                           <a:xfrm>
                             <a:off x="0" y="0"/>
-                            <a:ext cx="1572768" cy="1083462"/>
+                            <a:ext cx="1572768" cy="1092009"/>
                           </a:xfrm>
                           <a:prstGeom prst="rect"/>
                         </pic:spPr>
@@ -1906,7 +1938,6 @@
             <w:r>
               <w:rPr>
                 <w:b/>
-                <w:color w:val="000000"/>
                 <w:sz w:val="17"/>
               </w:rPr>
               <w:t>Vibration and tamper</w:t>
@@ -1919,6 +1950,12 @@
             <w:r>
               <w:rPr>
                 <w:b/>
+                <w:sz w:val="17"/>
+              </w:rPr>
+              <w:t xml:space="preserve">Priority: </w:t>
+            </w:r>
+            <w:r>
+              <w:rPr>
                 <w:sz w:val="17"/>
               </w:rPr>
               <w:t>Optional event/security</w:t>
@@ -2004,9 +2041,6 @@
         <w:spacing w:after="40"/>
       </w:pPr>
     </w:p>
-    <w:p>
-      <w:r/>
-    </w:p>
     <w:tbl>
       <w:tblPr>
         <w:tblW w:type="auto" w:w="0"/>
@@ -2047,7 +2081,7 @@
             <w:r>
               <w:drawing>
                 <wp:inline xmlns:a="http://schemas.openxmlformats.org/drawingml/2006/main" xmlns:pic="http://schemas.openxmlformats.org/drawingml/2006/picture">
-                  <wp:extent cx="1572768" cy="1083462"/>
+                  <wp:extent cx="1572768" cy="1092009"/>
                   <wp:docPr id="9" name="Picture 9"/>
                   <wp:cNvGraphicFramePr>
                     <a:graphicFrameLocks noChangeAspect="1"/>
@@ -2068,7 +2102,7 @@
                         <pic:spPr>
                           <a:xfrm>
                             <a:off x="0" y="0"/>
-                            <a:ext cx="1572768" cy="1083462"/>
+                            <a:ext cx="1572768" cy="1092009"/>
                           </a:xfrm>
                           <a:prstGeom prst="rect"/>
                         </pic:spPr>
@@ -2098,7 +2132,6 @@
             <w:r>
               <w:rPr>
                 <w:b/>
-                <w:color w:val="000000"/>
                 <w:sz w:val="17"/>
               </w:rPr>
               <w:t>Lid-open tamper</w:t>
@@ -2111,6 +2144,12 @@
             <w:r>
               <w:rPr>
                 <w:b/>
+                <w:sz w:val="17"/>
+              </w:rPr>
+              <w:t xml:space="preserve">Priority: </w:t>
+            </w:r>
+            <w:r>
+              <w:rPr>
                 <w:sz w:val="17"/>
               </w:rPr>
               <w:t>Optional event/security</w:t>
@@ -2236,7 +2275,7 @@
             <w:r>
               <w:drawing>
                 <wp:inline xmlns:a="http://schemas.openxmlformats.org/drawingml/2006/main" xmlns:pic="http://schemas.openxmlformats.org/drawingml/2006/picture">
-                  <wp:extent cx="1572768" cy="1083462"/>
+                  <wp:extent cx="1572768" cy="1092009"/>
                   <wp:docPr id="10" name="Picture 10"/>
                   <wp:cNvGraphicFramePr>
                     <a:graphicFrameLocks noChangeAspect="1"/>
@@ -2257,7 +2296,7 @@
                         <pic:spPr>
                           <a:xfrm>
                             <a:off x="0" y="0"/>
-                            <a:ext cx="1572768" cy="1083462"/>
+                            <a:ext cx="1572768" cy="1092009"/>
                           </a:xfrm>
                           <a:prstGeom prst="rect"/>
                         </pic:spPr>
@@ -2287,7 +2326,6 @@
             <w:r>
               <w:rPr>
                 <w:b/>
-                <w:color w:val="000000"/>
                 <w:sz w:val="17"/>
               </w:rPr>
               <w:t>Water temperature</w:t>
@@ -2300,6 +2338,12 @@
             <w:r>
               <w:rPr>
                 <w:b/>
+                <w:sz w:val="17"/>
+              </w:rPr>
+              <w:t xml:space="preserve">Priority: </w:t>
+            </w:r>
+            <w:r>
+              <w:rPr>
                 <w:sz w:val="17"/>
               </w:rPr>
               <w:t>Optional context</w:t>

</xml_diff>

<commit_message>
Option C replaced with ring-buoy donut, distinct from can and catamaran
</commit_message>
<xml_diff>
--- a/THESIS DOCUMENTATION/FALCON Sensor Approval List for Panel.docx
+++ b/THESIS DOCUMENTATION/FALCON Sensor Approval List for Panel.docx
@@ -8,7 +8,7 @@
         <w:jc w:val="center"/>
       </w:pPr>
       <w:r>
-        <w:t>Project FALCON Sensor Approval List</w:t>
+        <w:t>Project FALCON Sensor Power and Visibility Approval List</w:t>
       </w:r>
     </w:p>
     <w:p>
@@ -18,7 +18,7 @@
       <w:r>
         <w:rPr>
           <w:color w:val="505050"/>
-          <w:sz w:val="22"/>
+          <w:sz w:val="21"/>
         </w:rPr>
         <w:t>Printable panel handout for revised compact event driven buoy proposal</w:t>
       </w:r>
@@ -33,7 +33,7 @@
     </w:p>
     <w:p>
       <w:r>
-        <w:t>This document consolidates the required and optional sensors for the revised Project FALCON compact buoy. The purpose is to help the panel approve the sensor set before any purchase. The recommended direction is a low cost event driven ESP32 buoy that measures water pressure, wind, position, and power status, then uploads only important packets through Wi-Fi or LTE.</w:t>
+        <w:t>This document consolidates the required sensors, power components, and night visibility equipment for the revised Project FALCON compact buoy. The purpose is to help the panel approve what will be reused, what must still be bought, and which optional modules can be deferred. The recommended direction is a low cost ESP32 buoy that samples locally, sends summary packets, and uses solar assisted battery power.</w:t>
       </w:r>
     </w:p>
     <w:p>
@@ -44,7 +44,7 @@
         <w:t>Main recommendation:</w:t>
       </w:r>
       <w:r>
-        <w:t xml:space="preserve"> approve the field ready low cost validation package, but buy in stages. Confirm the water pressure sensor first because it is the core research sensor. Use Wi-Fi during bench validation and buy LTE only if the field site has no stable internet coverage.</w:t>
+        <w:t xml:space="preserve"> approve the field ready low cost validation package, but buy in stages. Confirm the water pressure sensor first, then validate the power budget using the ESP32, internet module, GPS, wind sensor, pressure interface, battery, solar panel, and night light current draw.</w:t>
       </w:r>
     </w:p>
     <w:p>
@@ -82,19 +82,19 @@
         </w:trPr>
         <w:tc>
           <w:tcPr>
-            <w:tcW w:type="dxa" w:w="2088"/>
+            <w:tcW w:type="dxa" w:w="1944"/>
             <w:shd w:fill="1F4E5F"/>
             <w:tcMar>
-              <w:top w:w="90" w:type="dxa"/>
-              <w:start w:w="90" w:type="dxa"/>
-              <w:bottom w:w="90" w:type="dxa"/>
-              <w:end w:w="90" w:type="dxa"/>
+              <w:top w:w="85" w:type="dxa"/>
+              <w:start w:w="85" w:type="dxa"/>
+              <w:bottom w:w="85" w:type="dxa"/>
+              <w:end w:w="85" w:type="dxa"/>
             </w:tcMar>
             <w:vAlign w:val="center"/>
           </w:tcPr>
           <w:p>
             <w:pPr>
-              <w:spacing w:after="20" w:line="252" w:lineRule="auto"/>
+              <w:spacing w:after="20" w:line="245" w:lineRule="auto"/>
             </w:pPr>
             <w:r>
               <w:rPr>
@@ -108,19 +108,19 @@
         </w:tc>
         <w:tc>
           <w:tcPr>
-            <w:tcW w:type="dxa" w:w="4464"/>
+            <w:tcW w:type="dxa" w:w="4680"/>
             <w:shd w:fill="1F4E5F"/>
             <w:tcMar>
-              <w:top w:w="90" w:type="dxa"/>
-              <w:start w:w="90" w:type="dxa"/>
-              <w:bottom w:w="90" w:type="dxa"/>
-              <w:end w:w="90" w:type="dxa"/>
+              <w:top w:w="85" w:type="dxa"/>
+              <w:start w:w="85" w:type="dxa"/>
+              <w:bottom w:w="85" w:type="dxa"/>
+              <w:end w:w="85" w:type="dxa"/>
             </w:tcMar>
             <w:vAlign w:val="center"/>
           </w:tcPr>
           <w:p>
             <w:pPr>
-              <w:spacing w:after="20" w:line="252" w:lineRule="auto"/>
+              <w:spacing w:after="20" w:line="245" w:lineRule="auto"/>
             </w:pPr>
             <w:r>
               <w:rPr>
@@ -137,16 +137,16 @@
             <w:tcW w:type="dxa" w:w="1944"/>
             <w:shd w:fill="1F4E5F"/>
             <w:tcMar>
-              <w:top w:w="90" w:type="dxa"/>
-              <w:start w:w="90" w:type="dxa"/>
-              <w:bottom w:w="90" w:type="dxa"/>
-              <w:end w:w="90" w:type="dxa"/>
+              <w:top w:w="85" w:type="dxa"/>
+              <w:start w:w="85" w:type="dxa"/>
+              <w:bottom w:w="85" w:type="dxa"/>
+              <w:end w:w="85" w:type="dxa"/>
             </w:tcMar>
             <w:vAlign w:val="center"/>
           </w:tcPr>
           <w:p>
             <w:pPr>
-              <w:spacing w:after="20" w:line="252" w:lineRule="auto"/>
+              <w:spacing w:after="20" w:line="245" w:lineRule="auto"/>
             </w:pPr>
             <w:r>
               <w:rPr>
@@ -154,7 +154,7 @@
                 <w:color w:val="FFFFFF"/>
                 <w:sz w:val="17"/>
               </w:rPr>
-              <w:t>Estimated sensor and telemetry cost</w:t>
+              <w:t>Estimated equipment cost</w:t>
             </w:r>
           </w:p>
         </w:tc>
@@ -163,16 +163,16 @@
             <w:tcW w:type="dxa" w:w="2664"/>
             <w:shd w:fill="1F4E5F"/>
             <w:tcMar>
-              <w:top w:w="90" w:type="dxa"/>
-              <w:start w:w="90" w:type="dxa"/>
-              <w:bottom w:w="90" w:type="dxa"/>
-              <w:end w:w="90" w:type="dxa"/>
+              <w:top w:w="85" w:type="dxa"/>
+              <w:start w:w="85" w:type="dxa"/>
+              <w:bottom w:w="85" w:type="dxa"/>
+              <w:end w:w="85" w:type="dxa"/>
             </w:tcMar>
             <w:vAlign w:val="center"/>
           </w:tcPr>
           <w:p>
             <w:pPr>
-              <w:spacing w:after="20" w:line="252" w:lineRule="auto"/>
+              <w:spacing w:after="20" w:line="245" w:lineRule="auto"/>
             </w:pPr>
             <w:r>
               <w:rPr>
@@ -188,49 +188,49 @@
       <w:tr>
         <w:tc>
           <w:tcPr>
-            <w:tcW w:type="dxa" w:w="2088"/>
+            <w:tcW w:type="dxa" w:w="1944"/>
             <w:tcMar>
-              <w:top w:w="90" w:type="dxa"/>
-              <w:start w:w="90" w:type="dxa"/>
-              <w:bottom w:w="90" w:type="dxa"/>
-              <w:end w:w="90" w:type="dxa"/>
+              <w:top w:w="80" w:type="dxa"/>
+              <w:start w:w="80" w:type="dxa"/>
+              <w:bottom w:w="80" w:type="dxa"/>
+              <w:end w:w="80" w:type="dxa"/>
             </w:tcMar>
             <w:vAlign w:val="center"/>
             <w:shd w:fill="F5F8FA"/>
           </w:tcPr>
           <w:p>
             <w:pPr>
-              <w:spacing w:after="20" w:line="252" w:lineRule="auto"/>
+              <w:spacing w:after="20" w:line="245" w:lineRule="auto"/>
             </w:pPr>
             <w:r>
               <w:rPr>
                 <w:sz w:val="16"/>
               </w:rPr>
-              <w:t>Minimum lab validation</w:t>
+              <w:t>Minimum bench validation</w:t>
             </w:r>
           </w:p>
         </w:tc>
         <w:tc>
           <w:tcPr>
-            <w:tcW w:type="dxa" w:w="4464"/>
+            <w:tcW w:type="dxa" w:w="4680"/>
             <w:tcMar>
-              <w:top w:w="90" w:type="dxa"/>
-              <w:start w:w="90" w:type="dxa"/>
-              <w:bottom w:w="90" w:type="dxa"/>
-              <w:end w:w="90" w:type="dxa"/>
+              <w:top w:w="80" w:type="dxa"/>
+              <w:start w:w="80" w:type="dxa"/>
+              <w:bottom w:w="80" w:type="dxa"/>
+              <w:end w:w="80" w:type="dxa"/>
             </w:tcMar>
             <w:vAlign w:val="center"/>
             <w:shd w:fill="F5F8FA"/>
           </w:tcPr>
           <w:p>
             <w:pPr>
-              <w:spacing w:after="20" w:line="252" w:lineRule="auto"/>
+              <w:spacing w:after="20" w:line="245" w:lineRule="auto"/>
             </w:pPr>
             <w:r>
               <w:rPr>
                 <w:sz w:val="16"/>
               </w:rPr>
-              <w:t>Pressure transmitter, ADS1115/shunt, wind speed/direction, GPS, INA219, ESP32 Wi-Fi</w:t>
+              <w:t>ESP32, pressure interface, simulated inputs, GPS, INA219, Wi-Fi, LEDs/buttons from existing kit</w:t>
             </w:r>
           </w:p>
         </w:tc>
@@ -238,23 +238,23 @@
           <w:tcPr>
             <w:tcW w:type="dxa" w:w="1944"/>
             <w:tcMar>
-              <w:top w:w="90" w:type="dxa"/>
-              <w:start w:w="90" w:type="dxa"/>
-              <w:bottom w:w="90" w:type="dxa"/>
-              <w:end w:w="90" w:type="dxa"/>
+              <w:top w:w="80" w:type="dxa"/>
+              <w:start w:w="80" w:type="dxa"/>
+              <w:bottom w:w="80" w:type="dxa"/>
+              <w:end w:w="80" w:type="dxa"/>
             </w:tcMar>
             <w:vAlign w:val="center"/>
             <w:shd w:fill="F5F8FA"/>
           </w:tcPr>
           <w:p>
             <w:pPr>
-              <w:spacing w:after="20" w:line="252" w:lineRule="auto"/>
+              <w:spacing w:after="20" w:line="245" w:lineRule="auto"/>
             </w:pPr>
             <w:r>
               <w:rPr>
                 <w:sz w:val="16"/>
               </w:rPr>
-              <w:t>PHP 4,700-7,900 plus ESP32 and wiring/enclosure</w:t>
+              <w:t>PHP 4,700-7,900 plus existing kit parts</w:t>
             </w:r>
           </w:p>
         </w:tc>
@@ -262,17 +262,17 @@
           <w:tcPr>
             <w:tcW w:type="dxa" w:w="2664"/>
             <w:tcMar>
-              <w:top w:w="90" w:type="dxa"/>
-              <w:start w:w="90" w:type="dxa"/>
-              <w:bottom w:w="90" w:type="dxa"/>
-              <w:end w:w="90" w:type="dxa"/>
+              <w:top w:w="80" w:type="dxa"/>
+              <w:start w:w="80" w:type="dxa"/>
+              <w:bottom w:w="80" w:type="dxa"/>
+              <w:end w:w="80" w:type="dxa"/>
             </w:tcMar>
             <w:vAlign w:val="center"/>
             <w:shd w:fill="F5F8FA"/>
           </w:tcPr>
           <w:p>
             <w:pPr>
-              <w:spacing w:after="20" w:line="252" w:lineRule="auto"/>
+              <w:spacing w:after="20" w:line="245" w:lineRule="auto"/>
             </w:pPr>
             <w:r>
               <w:rPr>
@@ -286,18 +286,18 @@
       <w:tr>
         <w:tc>
           <w:tcPr>
-            <w:tcW w:type="dxa" w:w="2088"/>
+            <w:tcW w:type="dxa" w:w="1944"/>
             <w:tcMar>
-              <w:top w:w="90" w:type="dxa"/>
-              <w:start w:w="90" w:type="dxa"/>
-              <w:bottom w:w="90" w:type="dxa"/>
-              <w:end w:w="90" w:type="dxa"/>
+              <w:top w:w="80" w:type="dxa"/>
+              <w:start w:w="80" w:type="dxa"/>
+              <w:bottom w:w="80" w:type="dxa"/>
+              <w:end w:w="80" w:type="dxa"/>
             </w:tcMar>
             <w:vAlign w:val="center"/>
           </w:tcPr>
           <w:p>
             <w:pPr>
-              <w:spacing w:after="20" w:line="252" w:lineRule="auto"/>
+              <w:spacing w:after="20" w:line="245" w:lineRule="auto"/>
             </w:pPr>
             <w:r>
               <w:rPr>
@@ -309,24 +309,24 @@
         </w:tc>
         <w:tc>
           <w:tcPr>
-            <w:tcW w:type="dxa" w:w="4464"/>
+            <w:tcW w:type="dxa" w:w="4680"/>
             <w:tcMar>
-              <w:top w:w="90" w:type="dxa"/>
-              <w:start w:w="90" w:type="dxa"/>
-              <w:bottom w:w="90" w:type="dxa"/>
-              <w:end w:w="90" w:type="dxa"/>
+              <w:top w:w="80" w:type="dxa"/>
+              <w:start w:w="80" w:type="dxa"/>
+              <w:bottom w:w="80" w:type="dxa"/>
+              <w:end w:w="80" w:type="dxa"/>
             </w:tcMar>
             <w:vAlign w:val="center"/>
           </w:tcPr>
           <w:p>
             <w:pPr>
-              <w:spacing w:after="20" w:line="252" w:lineRule="auto"/>
+              <w:spacing w:after="20" w:line="245" w:lineRule="auto"/>
             </w:pPr>
             <w:r>
               <w:rPr>
                 <w:sz w:val="16"/>
               </w:rPr>
-              <w:t>Minimum lab package plus A7670E LTE, microSD buffer, SW-420 or reed tamper</w:t>
+              <w:t>Core sensors plus battery, solar panel, solar charger/BMS, LTE if needed, marine night beacon, waterproofing, buoy body, chain, anchor</w:t>
             </w:r>
           </w:p>
         </w:tc>
@@ -334,22 +334,22 @@
           <w:tcPr>
             <w:tcW w:type="dxa" w:w="1944"/>
             <w:tcMar>
-              <w:top w:w="90" w:type="dxa"/>
-              <w:start w:w="90" w:type="dxa"/>
-              <w:bottom w:w="90" w:type="dxa"/>
-              <w:end w:w="90" w:type="dxa"/>
+              <w:top w:w="80" w:type="dxa"/>
+              <w:start w:w="80" w:type="dxa"/>
+              <w:bottom w:w="80" w:type="dxa"/>
+              <w:end w:w="80" w:type="dxa"/>
             </w:tcMar>
             <w:vAlign w:val="center"/>
           </w:tcPr>
           <w:p>
             <w:pPr>
-              <w:spacing w:after="20" w:line="252" w:lineRule="auto"/>
+              <w:spacing w:after="20" w:line="245" w:lineRule="auto"/>
             </w:pPr>
             <w:r>
               <w:rPr>
                 <w:sz w:val="16"/>
               </w:rPr>
-              <w:t>PHP 6,000-10,500 plus SIM load, waterproofing, battery/solar, buoy body, chain, and anchor</w:t>
+              <w:t>PHP 8,000-16,000+ depending battery, solar and LTE choices</w:t>
             </w:r>
           </w:p>
         </w:tc>
@@ -357,16 +357,16 @@
           <w:tcPr>
             <w:tcW w:type="dxa" w:w="2664"/>
             <w:tcMar>
-              <w:top w:w="90" w:type="dxa"/>
-              <w:start w:w="90" w:type="dxa"/>
-              <w:bottom w:w="90" w:type="dxa"/>
-              <w:end w:w="90" w:type="dxa"/>
+              <w:top w:w="80" w:type="dxa"/>
+              <w:start w:w="80" w:type="dxa"/>
+              <w:bottom w:w="80" w:type="dxa"/>
+              <w:end w:w="80" w:type="dxa"/>
             </w:tcMar>
             <w:vAlign w:val="center"/>
           </w:tcPr>
           <w:p>
             <w:pPr>
-              <w:spacing w:after="20" w:line="252" w:lineRule="auto"/>
+              <w:spacing w:after="20" w:line="245" w:lineRule="auto"/>
             </w:pPr>
             <w:r>
               <w:rPr>
@@ -380,49 +380,49 @@
       <w:tr>
         <w:tc>
           <w:tcPr>
-            <w:tcW w:type="dxa" w:w="2088"/>
+            <w:tcW w:type="dxa" w:w="1944"/>
             <w:tcMar>
-              <w:top w:w="90" w:type="dxa"/>
-              <w:start w:w="90" w:type="dxa"/>
-              <w:bottom w:w="90" w:type="dxa"/>
-              <w:end w:w="90" w:type="dxa"/>
+              <w:top w:w="80" w:type="dxa"/>
+              <w:start w:w="80" w:type="dxa"/>
+              <w:bottom w:w="80" w:type="dxa"/>
+              <w:end w:w="80" w:type="dxa"/>
             </w:tcMar>
             <w:vAlign w:val="center"/>
             <w:shd w:fill="F5F8FA"/>
           </w:tcPr>
           <w:p>
             <w:pPr>
-              <w:spacing w:after="20" w:line="252" w:lineRule="auto"/>
+              <w:spacing w:after="20" w:line="245" w:lineRule="auto"/>
             </w:pPr>
             <w:r>
               <w:rPr>
                 <w:sz w:val="16"/>
               </w:rPr>
-              <w:t>Safer industrial sensor option</w:t>
+              <w:t>Safer marine option</w:t>
             </w:r>
           </w:p>
         </w:tc>
         <w:tc>
           <w:tcPr>
-            <w:tcW w:type="dxa" w:w="4464"/>
+            <w:tcW w:type="dxa" w:w="4680"/>
             <w:tcMar>
-              <w:top w:w="90" w:type="dxa"/>
-              <w:start w:w="90" w:type="dxa"/>
-              <w:bottom w:w="90" w:type="dxa"/>
-              <w:end w:w="90" w:type="dxa"/>
+              <w:top w:w="80" w:type="dxa"/>
+              <w:start w:w="80" w:type="dxa"/>
+              <w:bottom w:w="80" w:type="dxa"/>
+              <w:end w:w="80" w:type="dxa"/>
             </w:tcMar>
             <w:vAlign w:val="center"/>
             <w:shd w:fill="F5F8FA"/>
           </w:tcPr>
           <w:p>
             <w:pPr>
-              <w:spacing w:after="20" w:line="252" w:lineRule="auto"/>
+              <w:spacing w:after="20" w:line="245" w:lineRule="auto"/>
             </w:pPr>
             <w:r>
               <w:rPr>
                 <w:sz w:val="16"/>
               </w:rPr>
-              <w:t>Field ready package plus better pressure unit and industrial wind sensor</w:t>
+              <w:t>Better pressure transmitter, industrial wind sensor, LiFePO4 battery, IP68 beacon, better waterproof connectors</w:t>
             </w:r>
           </w:p>
         </w:tc>
@@ -430,23 +430,23 @@
           <w:tcPr>
             <w:tcW w:type="dxa" w:w="1944"/>
             <w:tcMar>
-              <w:top w:w="90" w:type="dxa"/>
-              <w:start w:w="90" w:type="dxa"/>
-              <w:bottom w:w="90" w:type="dxa"/>
-              <w:end w:w="90" w:type="dxa"/>
+              <w:top w:w="80" w:type="dxa"/>
+              <w:start w:w="80" w:type="dxa"/>
+              <w:bottom w:w="80" w:type="dxa"/>
+              <w:end w:w="80" w:type="dxa"/>
             </w:tcMar>
             <w:vAlign w:val="center"/>
             <w:shd w:fill="F5F8FA"/>
           </w:tcPr>
           <w:p>
             <w:pPr>
-              <w:spacing w:after="20" w:line="252" w:lineRule="auto"/>
+              <w:spacing w:after="20" w:line="245" w:lineRule="auto"/>
             </w:pPr>
             <w:r>
               <w:rPr>
                 <w:sz w:val="16"/>
               </w:rPr>
-              <w:t>PHP 10,000-20,000+ depending quotations</w:t>
+              <w:t>PHP 15,000-30,000+ depending quotations</w:t>
             </w:r>
           </w:p>
         </w:tc>
@@ -454,17 +454,17 @@
           <w:tcPr>
             <w:tcW w:type="dxa" w:w="2664"/>
             <w:tcMar>
-              <w:top w:w="90" w:type="dxa"/>
-              <w:start w:w="90" w:type="dxa"/>
-              <w:bottom w:w="90" w:type="dxa"/>
-              <w:end w:w="90" w:type="dxa"/>
+              <w:top w:w="80" w:type="dxa"/>
+              <w:start w:w="80" w:type="dxa"/>
+              <w:bottom w:w="80" w:type="dxa"/>
+              <w:end w:w="80" w:type="dxa"/>
             </w:tcMar>
             <w:vAlign w:val="center"/>
             <w:shd w:fill="F5F8FA"/>
           </w:tcPr>
           <w:p>
             <w:pPr>
-              <w:spacing w:after="20" w:line="252" w:lineRule="auto"/>
+              <w:spacing w:after="20" w:line="245" w:lineRule="auto"/>
             </w:pPr>
             <w:r>
               <w:rPr>
@@ -481,7 +481,7 @@
         <w:pStyle w:val="Heading1"/>
       </w:pPr>
       <w:r>
-        <w:t>Sensor cards for panel approval</w:t>
+        <w:t>Equipment cards for panel approval</w:t>
       </w:r>
     </w:p>
     <w:p>
@@ -511,25 +511,25 @@
       <w:tr>
         <w:tc>
           <w:tcPr>
-            <w:tcW w:type="dxa" w:w="2880"/>
+            <w:tcW w:type="dxa" w:w="2736"/>
             <w:tcMar>
-              <w:top w:w="80" w:type="dxa"/>
-              <w:start w:w="80" w:type="dxa"/>
-              <w:bottom w:w="80" w:type="dxa"/>
-              <w:end w:w="80" w:type="dxa"/>
+              <w:top w:w="70" w:type="dxa"/>
+              <w:start w:w="70" w:type="dxa"/>
+              <w:bottom w:w="70" w:type="dxa"/>
+              <w:end w:w="70" w:type="dxa"/>
             </w:tcMar>
             <w:shd w:fill="F7F9FB"/>
             <w:vAlign w:val="center"/>
           </w:tcPr>
           <w:p>
             <w:pPr>
-              <w:spacing w:after="20" w:line="252" w:lineRule="auto"/>
+              <w:spacing w:after="20" w:line="245" w:lineRule="auto"/>
               <w:jc w:val="center"/>
             </w:pPr>
             <w:r>
               <w:drawing>
                 <wp:inline xmlns:a="http://schemas.openxmlformats.org/drawingml/2006/main" xmlns:pic="http://schemas.openxmlformats.org/drawingml/2006/picture">
-                  <wp:extent cx="1572768" cy="1092009"/>
+                  <wp:extent cx="1417320" cy="984078"/>
                   <wp:docPr id="1" name="Picture 1"/>
                   <wp:cNvGraphicFramePr>
                     <a:graphicFrameLocks noChangeAspect="1"/>
@@ -550,7 +550,7 @@
                         <pic:spPr>
                           <a:xfrm>
                             <a:off x="0" y="0"/>
-                            <a:ext cx="1572768" cy="1092009"/>
+                            <a:ext cx="1417320" cy="984078"/>
                           </a:xfrm>
                           <a:prstGeom prst="rect"/>
                         </pic:spPr>
@@ -564,113 +564,131 @@
         </w:tc>
         <w:tc>
           <w:tcPr>
-            <w:tcW w:type="dxa" w:w="7343"/>
+            <w:tcW w:type="dxa" w:w="7488"/>
             <w:tcMar>
-              <w:top w:w="110" w:type="dxa"/>
-              <w:start w:w="110" w:type="dxa"/>
-              <w:bottom w:w="110" w:type="dxa"/>
-              <w:end w:w="110" w:type="dxa"/>
+              <w:top w:w="95" w:type="dxa"/>
+              <w:start w:w="95" w:type="dxa"/>
+              <w:bottom w:w="95" w:type="dxa"/>
+              <w:end w:w="95" w:type="dxa"/>
             </w:tcMar>
             <w:vAlign w:val="center"/>
           </w:tcPr>
           <w:p>
             <w:pPr>
-              <w:spacing w:after="20" w:line="252" w:lineRule="auto"/>
+              <w:spacing w:after="20" w:line="245" w:lineRule="auto"/>
             </w:pPr>
             <w:r>
               <w:rPr>
                 <w:b/>
-                <w:sz w:val="17"/>
+                <w:sz w:val="16"/>
               </w:rPr>
               <w:t>Water pressure and wave input</w:t>
             </w:r>
           </w:p>
           <w:p>
             <w:pPr>
-              <w:spacing w:after="20" w:line="252" w:lineRule="auto"/>
+              <w:spacing w:after="20" w:line="245" w:lineRule="auto"/>
             </w:pPr>
             <w:r>
               <w:rPr>
                 <w:b/>
-                <w:sz w:val="17"/>
+                <w:sz w:val="16"/>
+              </w:rPr>
+              <w:t xml:space="preserve">Group: </w:t>
+            </w:r>
+            <w:r>
+              <w:rPr>
+                <w:sz w:val="16"/>
+              </w:rPr>
+              <w:t>Core sensor</w:t>
+            </w:r>
+          </w:p>
+          <w:p>
+            <w:pPr>
+              <w:spacing w:after="20" w:line="245" w:lineRule="auto"/>
+            </w:pPr>
+            <w:r>
+              <w:rPr>
+                <w:b/>
+                <w:sz w:val="16"/>
               </w:rPr>
               <w:t xml:space="preserve">Priority: </w:t>
             </w:r>
             <w:r>
               <w:rPr>
-                <w:sz w:val="17"/>
+                <w:sz w:val="16"/>
               </w:rPr>
               <w:t>Required</w:t>
             </w:r>
           </w:p>
           <w:p>
             <w:pPr>
-              <w:spacing w:after="20" w:line="252" w:lineRule="auto"/>
+              <w:spacing w:after="20" w:line="245" w:lineRule="auto"/>
             </w:pPr>
             <w:r>
               <w:rPr>
                 <w:b/>
-                <w:sz w:val="17"/>
+                <w:sz w:val="16"/>
               </w:rPr>
               <w:t xml:space="preserve">Recommended item: </w:t>
             </w:r>
             <w:r>
               <w:rPr>
-                <w:sz w:val="17"/>
+                <w:sz w:val="16"/>
               </w:rPr>
               <w:t>Low-range submersible hydrostatic level transmitter, 4-20 mA preferred, target 0-1 mH2O or 0-2 mH2O</w:t>
             </w:r>
           </w:p>
           <w:p>
             <w:pPr>
-              <w:spacing w:after="20" w:line="252" w:lineRule="auto"/>
+              <w:spacing w:after="20" w:line="245" w:lineRule="auto"/>
             </w:pPr>
             <w:r>
               <w:rPr>
                 <w:b/>
-                <w:sz w:val="17"/>
+                <w:sz w:val="16"/>
               </w:rPr>
               <w:t xml:space="preserve">Planning price: </w:t>
             </w:r>
             <w:r>
               <w:rPr>
-                <w:sz w:val="17"/>
+                <w:sz w:val="16"/>
               </w:rPr>
               <w:t>PHP 2,897-3,720 typical; lower listings around PHP 1,471 need strict verification</w:t>
             </w:r>
           </w:p>
           <w:p>
             <w:pPr>
-              <w:spacing w:after="20" w:line="252" w:lineRule="auto"/>
+              <w:spacing w:after="20" w:line="245" w:lineRule="auto"/>
             </w:pPr>
             <w:r>
               <w:rPr>
                 <w:b/>
-                <w:sz w:val="17"/>
+                <w:sz w:val="16"/>
               </w:rPr>
               <w:t xml:space="preserve">Buy from or verify at: </w:t>
             </w:r>
             <w:r>
               <w:rPr>
-                <w:sz w:val="17"/>
+                <w:sz w:val="16"/>
               </w:rPr>
               <w:t>Lazada QDY30A / hydrostatic transmitter listings</w:t>
             </w:r>
           </w:p>
           <w:p>
             <w:pPr>
-              <w:spacing w:after="20" w:line="252" w:lineRule="auto"/>
+              <w:spacing w:after="20" w:line="245" w:lineRule="auto"/>
             </w:pPr>
             <w:r>
               <w:rPr>
                 <w:b/>
-                <w:sz w:val="17"/>
+                <w:sz w:val="16"/>
               </w:rPr>
               <w:t xml:space="preserve">Approval note: </w:t>
             </w:r>
             <w:r>
               <w:rPr>
-                <w:sz w:val="17"/>
+                <w:sz w:val="16"/>
               </w:rPr>
               <w:t>Approve first. Main research sensor. Avoid high-range pump or automotive pressure sensors unless low-range water-level units cannot be verified.</w:t>
             </w:r>
@@ -680,7 +698,7 @@
     </w:tbl>
     <w:p>
       <w:pPr>
-        <w:spacing w:after="40"/>
+        <w:spacing w:after="20"/>
       </w:pPr>
     </w:p>
     <w:tbl>
@@ -705,25 +723,25 @@
       <w:tr>
         <w:tc>
           <w:tcPr>
-            <w:tcW w:type="dxa" w:w="2880"/>
+            <w:tcW w:type="dxa" w:w="2736"/>
             <w:tcMar>
-              <w:top w:w="80" w:type="dxa"/>
-              <w:start w:w="80" w:type="dxa"/>
-              <w:bottom w:w="80" w:type="dxa"/>
-              <w:end w:w="80" w:type="dxa"/>
+              <w:top w:w="70" w:type="dxa"/>
+              <w:start w:w="70" w:type="dxa"/>
+              <w:bottom w:w="70" w:type="dxa"/>
+              <w:end w:w="70" w:type="dxa"/>
             </w:tcMar>
             <w:shd w:fill="F7F9FB"/>
             <w:vAlign w:val="center"/>
           </w:tcPr>
           <w:p>
             <w:pPr>
-              <w:spacing w:after="20" w:line="252" w:lineRule="auto"/>
+              <w:spacing w:after="20" w:line="245" w:lineRule="auto"/>
               <w:jc w:val="center"/>
             </w:pPr>
             <w:r>
               <w:drawing>
                 <wp:inline xmlns:a="http://schemas.openxmlformats.org/drawingml/2006/main" xmlns:pic="http://schemas.openxmlformats.org/drawingml/2006/picture">
-                  <wp:extent cx="1572768" cy="1092009"/>
+                  <wp:extent cx="1417320" cy="984078"/>
                   <wp:docPr id="2" name="Picture 2"/>
                   <wp:cNvGraphicFramePr>
                     <a:graphicFrameLocks noChangeAspect="1"/>
@@ -744,7 +762,7 @@
                         <pic:spPr>
                           <a:xfrm>
                             <a:off x="0" y="0"/>
-                            <a:ext cx="1572768" cy="1092009"/>
+                            <a:ext cx="1417320" cy="984078"/>
                           </a:xfrm>
                           <a:prstGeom prst="rect"/>
                         </pic:spPr>
@@ -758,113 +776,131 @@
         </w:tc>
         <w:tc>
           <w:tcPr>
-            <w:tcW w:type="dxa" w:w="7343"/>
+            <w:tcW w:type="dxa" w:w="7488"/>
             <w:tcMar>
-              <w:top w:w="110" w:type="dxa"/>
-              <w:start w:w="110" w:type="dxa"/>
-              <w:bottom w:w="110" w:type="dxa"/>
-              <w:end w:w="110" w:type="dxa"/>
+              <w:top w:w="95" w:type="dxa"/>
+              <w:start w:w="95" w:type="dxa"/>
+              <w:bottom w:w="95" w:type="dxa"/>
+              <w:end w:w="95" w:type="dxa"/>
             </w:tcMar>
             <w:vAlign w:val="center"/>
           </w:tcPr>
           <w:p>
             <w:pPr>
-              <w:spacing w:after="20" w:line="252" w:lineRule="auto"/>
+              <w:spacing w:after="20" w:line="245" w:lineRule="auto"/>
             </w:pPr>
             <w:r>
               <w:rPr>
                 <w:b/>
-                <w:sz w:val="17"/>
+                <w:sz w:val="16"/>
               </w:rPr>
               <w:t>Pressure signal interface</w:t>
             </w:r>
           </w:p>
           <w:p>
             <w:pPr>
-              <w:spacing w:after="20" w:line="252" w:lineRule="auto"/>
+              <w:spacing w:after="20" w:line="245" w:lineRule="auto"/>
             </w:pPr>
             <w:r>
               <w:rPr>
                 <w:b/>
-                <w:sz w:val="17"/>
+                <w:sz w:val="16"/>
+              </w:rPr>
+              <w:t xml:space="preserve">Group: </w:t>
+            </w:r>
+            <w:r>
+              <w:rPr>
+                <w:sz w:val="16"/>
+              </w:rPr>
+              <w:t>Interface</w:t>
+            </w:r>
+          </w:p>
+          <w:p>
+            <w:pPr>
+              <w:spacing w:after="20" w:line="245" w:lineRule="auto"/>
+            </w:pPr>
+            <w:r>
+              <w:rPr>
+                <w:b/>
+                <w:sz w:val="16"/>
               </w:rPr>
               <w:t xml:space="preserve">Priority: </w:t>
             </w:r>
             <w:r>
               <w:rPr>
-                <w:sz w:val="17"/>
+                <w:sz w:val="16"/>
               </w:rPr>
               <w:t>Required interface</w:t>
             </w:r>
           </w:p>
           <w:p>
             <w:pPr>
-              <w:spacing w:after="20" w:line="252" w:lineRule="auto"/>
+              <w:spacing w:after="20" w:line="245" w:lineRule="auto"/>
             </w:pPr>
             <w:r>
               <w:rPr>
                 <w:b/>
-                <w:sz w:val="17"/>
+                <w:sz w:val="16"/>
               </w:rPr>
               <w:t xml:space="preserve">Recommended item: </w:t>
             </w:r>
             <w:r>
               <w:rPr>
-                <w:sz w:val="17"/>
+                <w:sz w:val="16"/>
               </w:rPr>
               <w:t>ADS1115 16-bit ADC plus 150 ohm precision shunt, RC filter and protection parts</w:t>
             </w:r>
           </w:p>
           <w:p>
             <w:pPr>
-              <w:spacing w:after="20" w:line="252" w:lineRule="auto"/>
+              <w:spacing w:after="20" w:line="245" w:lineRule="auto"/>
             </w:pPr>
             <w:r>
               <w:rPr>
                 <w:b/>
-                <w:sz w:val="17"/>
+                <w:sz w:val="16"/>
               </w:rPr>
               <w:t xml:space="preserve">Planning price: </w:t>
             </w:r>
             <w:r>
               <w:rPr>
-                <w:sz w:val="17"/>
+                <w:sz w:val="16"/>
               </w:rPr>
               <w:t>PHP 135-290 for ADS1115; add PHP 100-250 for shunt/protection</w:t>
             </w:r>
           </w:p>
           <w:p>
             <w:pPr>
-              <w:spacing w:after="20" w:line="252" w:lineRule="auto"/>
+              <w:spacing w:after="20" w:line="245" w:lineRule="auto"/>
             </w:pPr>
             <w:r>
               <w:rPr>
                 <w:b/>
-                <w:sz w:val="17"/>
+                <w:sz w:val="16"/>
               </w:rPr>
               <w:t xml:space="preserve">Buy from or verify at: </w:t>
             </w:r>
             <w:r>
               <w:rPr>
-                <w:sz w:val="17"/>
+                <w:sz w:val="16"/>
               </w:rPr>
               <w:t>Lazada ADS1115 module listings</w:t>
             </w:r>
           </w:p>
           <w:p>
             <w:pPr>
-              <w:spacing w:after="20" w:line="252" w:lineRule="auto"/>
+              <w:spacing w:after="20" w:line="245" w:lineRule="auto"/>
             </w:pPr>
             <w:r>
               <w:rPr>
                 <w:b/>
-                <w:sz w:val="17"/>
+                <w:sz w:val="16"/>
               </w:rPr>
               <w:t xml:space="preserve">Approval note: </w:t>
             </w:r>
             <w:r>
               <w:rPr>
-                <w:sz w:val="17"/>
+                <w:sz w:val="16"/>
               </w:rPr>
               <w:t>Approve with pressure sensor. ESP32 cannot directly read a 4-20 mA loop without interface parts.</w:t>
             </w:r>
@@ -874,7 +910,7 @@
     </w:tbl>
     <w:p>
       <w:pPr>
-        <w:spacing w:after="40"/>
+        <w:spacing w:after="20"/>
       </w:pPr>
     </w:p>
     <w:tbl>
@@ -899,25 +935,25 @@
       <w:tr>
         <w:tc>
           <w:tcPr>
-            <w:tcW w:type="dxa" w:w="2880"/>
+            <w:tcW w:type="dxa" w:w="2736"/>
             <w:tcMar>
-              <w:top w:w="80" w:type="dxa"/>
-              <w:start w:w="80" w:type="dxa"/>
-              <w:bottom w:w="80" w:type="dxa"/>
-              <w:end w:w="80" w:type="dxa"/>
+              <w:top w:w="70" w:type="dxa"/>
+              <w:start w:w="70" w:type="dxa"/>
+              <w:bottom w:w="70" w:type="dxa"/>
+              <w:end w:w="70" w:type="dxa"/>
             </w:tcMar>
             <w:shd w:fill="F7F9FB"/>
             <w:vAlign w:val="center"/>
           </w:tcPr>
           <w:p>
             <w:pPr>
-              <w:spacing w:after="20" w:line="252" w:lineRule="auto"/>
+              <w:spacing w:after="20" w:line="245" w:lineRule="auto"/>
               <w:jc w:val="center"/>
             </w:pPr>
             <w:r>
               <w:drawing>
                 <wp:inline xmlns:a="http://schemas.openxmlformats.org/drawingml/2006/main" xmlns:pic="http://schemas.openxmlformats.org/drawingml/2006/picture">
-                  <wp:extent cx="1572768" cy="1092009"/>
+                  <wp:extent cx="1417320" cy="984078"/>
                   <wp:docPr id="3" name="Picture 3"/>
                   <wp:cNvGraphicFramePr>
                     <a:graphicFrameLocks noChangeAspect="1"/>
@@ -938,7 +974,7 @@
                         <pic:spPr>
                           <a:xfrm>
                             <a:off x="0" y="0"/>
-                            <a:ext cx="1572768" cy="1092009"/>
+                            <a:ext cx="1417320" cy="984078"/>
                           </a:xfrm>
                           <a:prstGeom prst="rect"/>
                         </pic:spPr>
@@ -952,113 +988,131 @@
         </w:tc>
         <w:tc>
           <w:tcPr>
-            <w:tcW w:type="dxa" w:w="7343"/>
+            <w:tcW w:type="dxa" w:w="7488"/>
             <w:tcMar>
-              <w:top w:w="110" w:type="dxa"/>
-              <w:start w:w="110" w:type="dxa"/>
-              <w:bottom w:w="110" w:type="dxa"/>
-              <w:end w:w="110" w:type="dxa"/>
+              <w:top w:w="95" w:type="dxa"/>
+              <w:start w:w="95" w:type="dxa"/>
+              <w:bottom w:w="95" w:type="dxa"/>
+              <w:end w:w="95" w:type="dxa"/>
             </w:tcMar>
             <w:vAlign w:val="center"/>
           </w:tcPr>
           <w:p>
             <w:pPr>
-              <w:spacing w:after="20" w:line="252" w:lineRule="auto"/>
+              <w:spacing w:after="20" w:line="245" w:lineRule="auto"/>
             </w:pPr>
             <w:r>
               <w:rPr>
                 <w:b/>
-                <w:sz w:val="17"/>
+                <w:sz w:val="16"/>
               </w:rPr>
               <w:t>Wind speed and direction</w:t>
             </w:r>
           </w:p>
           <w:p>
             <w:pPr>
-              <w:spacing w:after="20" w:line="252" w:lineRule="auto"/>
+              <w:spacing w:after="20" w:line="245" w:lineRule="auto"/>
             </w:pPr>
             <w:r>
               <w:rPr>
                 <w:b/>
-                <w:sz w:val="17"/>
+                <w:sz w:val="16"/>
+              </w:rPr>
+              <w:t xml:space="preserve">Group: </w:t>
+            </w:r>
+            <w:r>
+              <w:rPr>
+                <w:sz w:val="16"/>
+              </w:rPr>
+              <w:t>Core sensor</w:t>
+            </w:r>
+          </w:p>
+          <w:p>
+            <w:pPr>
+              <w:spacing w:after="20" w:line="245" w:lineRule="auto"/>
+            </w:pPr>
+            <w:r>
+              <w:rPr>
+                <w:b/>
+                <w:sz w:val="16"/>
               </w:rPr>
               <w:t xml:space="preserve">Priority: </w:t>
             </w:r>
             <w:r>
               <w:rPr>
-                <w:sz w:val="17"/>
+                <w:sz w:val="16"/>
               </w:rPr>
               <w:t>Required</w:t>
             </w:r>
           </w:p>
           <w:p>
             <w:pPr>
-              <w:spacing w:after="20" w:line="252" w:lineRule="auto"/>
+              <w:spacing w:after="20" w:line="245" w:lineRule="auto"/>
             </w:pPr>
             <w:r>
               <w:rPr>
                 <w:b/>
-                <w:sz w:val="17"/>
+                <w:sz w:val="16"/>
               </w:rPr>
               <w:t xml:space="preserve">Recommended item: </w:t>
             </w:r>
             <w:r>
               <w:rPr>
-                <w:sz w:val="17"/>
+                <w:sz w:val="16"/>
               </w:rPr>
               <w:t>Combined cup anemometer plus wind vane, RS485 / 0-5 V / 4-20 mA output preferred</w:t>
             </w:r>
           </w:p>
           <w:p>
             <w:pPr>
-              <w:spacing w:after="20" w:line="252" w:lineRule="auto"/>
+              <w:spacing w:after="20" w:line="245" w:lineRule="auto"/>
             </w:pPr>
             <w:r>
               <w:rPr>
                 <w:b/>
-                <w:sz w:val="17"/>
+                <w:sz w:val="16"/>
               </w:rPr>
               <w:t xml:space="preserve">Planning price: </w:t>
             </w:r>
             <w:r>
               <w:rPr>
-                <w:sz w:val="17"/>
+                <w:sz w:val="16"/>
               </w:rPr>
               <w:t>PHP 1,204-1,639 low-cost; industrial units PHP 3,666-9,282</w:t>
             </w:r>
           </w:p>
           <w:p>
             <w:pPr>
-              <w:spacing w:after="20" w:line="252" w:lineRule="auto"/>
+              <w:spacing w:after="20" w:line="245" w:lineRule="auto"/>
             </w:pPr>
             <w:r>
               <w:rPr>
                 <w:b/>
-                <w:sz w:val="17"/>
+                <w:sz w:val="16"/>
               </w:rPr>
               <w:t xml:space="preserve">Buy from or verify at: </w:t>
             </w:r>
             <w:r>
               <w:rPr>
-                <w:sz w:val="17"/>
+                <w:sz w:val="16"/>
               </w:rPr>
               <w:t>Shopee anemometer listings; Lazada industrial anemometer listings</w:t>
             </w:r>
           </w:p>
           <w:p>
             <w:pPr>
-              <w:spacing w:after="20" w:line="252" w:lineRule="auto"/>
+              <w:spacing w:after="20" w:line="245" w:lineRule="auto"/>
             </w:pPr>
             <w:r>
               <w:rPr>
                 <w:b/>
-                <w:sz w:val="17"/>
+                <w:sz w:val="16"/>
               </w:rPr>
               <w:t xml:space="preserve">Approval note: </w:t>
             </w:r>
             <w:r>
               <w:rPr>
-                <w:sz w:val="17"/>
+                <w:sz w:val="16"/>
               </w:rPr>
               <w:t>Approve low-cost combined speed and direction model first. If only speed is included, buy separate wind vane or mark wind direction as pending.</w:t>
             </w:r>
@@ -1068,7 +1122,7 @@
     </w:tbl>
     <w:p>
       <w:pPr>
-        <w:spacing w:after="40"/>
+        <w:spacing w:after="20"/>
       </w:pPr>
     </w:p>
     <w:tbl>
@@ -1093,25 +1147,25 @@
       <w:tr>
         <w:tc>
           <w:tcPr>
-            <w:tcW w:type="dxa" w:w="2880"/>
+            <w:tcW w:type="dxa" w:w="2736"/>
             <w:tcMar>
-              <w:top w:w="80" w:type="dxa"/>
-              <w:start w:w="80" w:type="dxa"/>
-              <w:bottom w:w="80" w:type="dxa"/>
-              <w:end w:w="80" w:type="dxa"/>
+              <w:top w:w="70" w:type="dxa"/>
+              <w:start w:w="70" w:type="dxa"/>
+              <w:bottom w:w="70" w:type="dxa"/>
+              <w:end w:w="70" w:type="dxa"/>
             </w:tcMar>
             <w:shd w:fill="F7F9FB"/>
             <w:vAlign w:val="center"/>
           </w:tcPr>
           <w:p>
             <w:pPr>
-              <w:spacing w:after="20" w:line="252" w:lineRule="auto"/>
+              <w:spacing w:after="20" w:line="245" w:lineRule="auto"/>
               <w:jc w:val="center"/>
             </w:pPr>
             <w:r>
               <w:drawing>
                 <wp:inline xmlns:a="http://schemas.openxmlformats.org/drawingml/2006/main" xmlns:pic="http://schemas.openxmlformats.org/drawingml/2006/picture">
-                  <wp:extent cx="1572768" cy="1092009"/>
+                  <wp:extent cx="1417320" cy="984078"/>
                   <wp:docPr id="4" name="Picture 4"/>
                   <wp:cNvGraphicFramePr>
                     <a:graphicFrameLocks noChangeAspect="1"/>
@@ -1132,7 +1186,7 @@
                         <pic:spPr>
                           <a:xfrm>
                             <a:off x="0" y="0"/>
-                            <a:ext cx="1572768" cy="1092009"/>
+                            <a:ext cx="1417320" cy="984078"/>
                           </a:xfrm>
                           <a:prstGeom prst="rect"/>
                         </pic:spPr>
@@ -1146,113 +1200,131 @@
         </w:tc>
         <w:tc>
           <w:tcPr>
-            <w:tcW w:type="dxa" w:w="7343"/>
+            <w:tcW w:type="dxa" w:w="7488"/>
             <w:tcMar>
-              <w:top w:w="110" w:type="dxa"/>
-              <w:start w:w="110" w:type="dxa"/>
-              <w:bottom w:w="110" w:type="dxa"/>
-              <w:end w:w="110" w:type="dxa"/>
+              <w:top w:w="95" w:type="dxa"/>
+              <w:start w:w="95" w:type="dxa"/>
+              <w:bottom w:w="95" w:type="dxa"/>
+              <w:end w:w="95" w:type="dxa"/>
             </w:tcMar>
             <w:vAlign w:val="center"/>
           </w:tcPr>
           <w:p>
             <w:pPr>
-              <w:spacing w:after="20" w:line="252" w:lineRule="auto"/>
+              <w:spacing w:after="20" w:line="245" w:lineRule="auto"/>
             </w:pPr>
             <w:r>
               <w:rPr>
                 <w:b/>
-                <w:sz w:val="17"/>
+                <w:sz w:val="16"/>
               </w:rPr>
               <w:t>GPS position and security</w:t>
             </w:r>
           </w:p>
           <w:p>
             <w:pPr>
-              <w:spacing w:after="20" w:line="252" w:lineRule="auto"/>
+              <w:spacing w:after="20" w:line="245" w:lineRule="auto"/>
             </w:pPr>
             <w:r>
               <w:rPr>
                 <w:b/>
-                <w:sz w:val="17"/>
+                <w:sz w:val="16"/>
+              </w:rPr>
+              <w:t xml:space="preserve">Group: </w:t>
+            </w:r>
+            <w:r>
+              <w:rPr>
+                <w:sz w:val="16"/>
+              </w:rPr>
+              <w:t>Core support</w:t>
+            </w:r>
+          </w:p>
+          <w:p>
+            <w:pPr>
+              <w:spacing w:after="20" w:line="245" w:lineRule="auto"/>
+            </w:pPr>
+            <w:r>
+              <w:rPr>
+                <w:b/>
+                <w:sz w:val="16"/>
               </w:rPr>
               <w:t xml:space="preserve">Priority: </w:t>
             </w:r>
             <w:r>
               <w:rPr>
-                <w:sz w:val="17"/>
+                <w:sz w:val="16"/>
               </w:rPr>
               <w:t>Required</w:t>
             </w:r>
           </w:p>
           <w:p>
             <w:pPr>
-              <w:spacing w:after="20" w:line="252" w:lineRule="auto"/>
+              <w:spacing w:after="20" w:line="245" w:lineRule="auto"/>
             </w:pPr>
             <w:r>
               <w:rPr>
                 <w:b/>
-                <w:sz w:val="17"/>
+                <w:sz w:val="16"/>
               </w:rPr>
               <w:t xml:space="preserve">Recommended item: </w:t>
             </w:r>
             <w:r>
               <w:rPr>
-                <w:sz w:val="17"/>
+                <w:sz w:val="16"/>
               </w:rPr>
               <w:t>NEO-6M GPS module with ceramic antenna or equivalent GNSS board</w:t>
             </w:r>
           </w:p>
           <w:p>
             <w:pPr>
-              <w:spacing w:after="20" w:line="252" w:lineRule="auto"/>
+              <w:spacing w:after="20" w:line="245" w:lineRule="auto"/>
             </w:pPr>
             <w:r>
               <w:rPr>
                 <w:b/>
-                <w:sz w:val="17"/>
+                <w:sz w:val="16"/>
               </w:rPr>
               <w:t xml:space="preserve">Planning price: </w:t>
             </w:r>
             <w:r>
               <w:rPr>
-                <w:sz w:val="17"/>
+                <w:sz w:val="16"/>
               </w:rPr>
               <w:t>PHP 299-497 common; higher listings up to PHP 1,143</w:t>
             </w:r>
           </w:p>
           <w:p>
             <w:pPr>
-              <w:spacing w:after="20" w:line="252" w:lineRule="auto"/>
+              <w:spacing w:after="20" w:line="245" w:lineRule="auto"/>
             </w:pPr>
             <w:r>
               <w:rPr>
                 <w:b/>
-                <w:sz w:val="17"/>
+                <w:sz w:val="16"/>
               </w:rPr>
               <w:t xml:space="preserve">Buy from or verify at: </w:t>
             </w:r>
             <w:r>
               <w:rPr>
-                <w:sz w:val="17"/>
+                <w:sz w:val="16"/>
               </w:rPr>
               <w:t>MakerLab PH / Lazada NEO-6M GPS listings</w:t>
             </w:r>
           </w:p>
           <w:p>
             <w:pPr>
-              <w:spacing w:after="20" w:line="252" w:lineRule="auto"/>
+              <w:spacing w:after="20" w:line="245" w:lineRule="auto"/>
             </w:pPr>
             <w:r>
               <w:rPr>
                 <w:b/>
-                <w:sz w:val="17"/>
+                <w:sz w:val="16"/>
               </w:rPr>
               <w:t xml:space="preserve">Approval note: </w:t>
             </w:r>
             <w:r>
               <w:rPr>
-                <w:sz w:val="17"/>
+                <w:sz w:val="16"/>
               </w:rPr>
               <w:t>Approve. Provides exact position, drift/geofence evidence, timestamp support and anti-loss/security proof.</w:t>
             </w:r>
@@ -1262,7 +1334,7 @@
     </w:tbl>
     <w:p>
       <w:pPr>
-        <w:spacing w:after="40"/>
+        <w:spacing w:after="20"/>
       </w:pPr>
     </w:p>
     <w:tbl>
@@ -1287,25 +1359,25 @@
       <w:tr>
         <w:tc>
           <w:tcPr>
-            <w:tcW w:type="dxa" w:w="2880"/>
+            <w:tcW w:type="dxa" w:w="2736"/>
             <w:tcMar>
-              <w:top w:w="80" w:type="dxa"/>
-              <w:start w:w="80" w:type="dxa"/>
-              <w:bottom w:w="80" w:type="dxa"/>
-              <w:end w:w="80" w:type="dxa"/>
+              <w:top w:w="70" w:type="dxa"/>
+              <w:start w:w="70" w:type="dxa"/>
+              <w:bottom w:w="70" w:type="dxa"/>
+              <w:end w:w="70" w:type="dxa"/>
             </w:tcMar>
             <w:shd w:fill="F7F9FB"/>
             <w:vAlign w:val="center"/>
           </w:tcPr>
           <w:p>
             <w:pPr>
-              <w:spacing w:after="20" w:line="252" w:lineRule="auto"/>
+              <w:spacing w:after="20" w:line="245" w:lineRule="auto"/>
               <w:jc w:val="center"/>
             </w:pPr>
             <w:r>
               <w:drawing>
                 <wp:inline xmlns:a="http://schemas.openxmlformats.org/drawingml/2006/main" xmlns:pic="http://schemas.openxmlformats.org/drawingml/2006/picture">
-                  <wp:extent cx="1572768" cy="1092009"/>
+                  <wp:extent cx="1417320" cy="984078"/>
                   <wp:docPr id="5" name="Picture 5"/>
                   <wp:cNvGraphicFramePr>
                     <a:graphicFrameLocks noChangeAspect="1"/>
@@ -1326,7 +1398,7 @@
                         <pic:spPr>
                           <a:xfrm>
                             <a:off x="0" y="0"/>
-                            <a:ext cx="1572768" cy="1092009"/>
+                            <a:ext cx="1417320" cy="984078"/>
                           </a:xfrm>
                           <a:prstGeom prst="rect"/>
                         </pic:spPr>
@@ -1340,115 +1412,133 @@
         </w:tc>
         <w:tc>
           <w:tcPr>
-            <w:tcW w:type="dxa" w:w="7343"/>
+            <w:tcW w:type="dxa" w:w="7488"/>
             <w:tcMar>
-              <w:top w:w="110" w:type="dxa"/>
-              <w:start w:w="110" w:type="dxa"/>
-              <w:bottom w:w="110" w:type="dxa"/>
-              <w:end w:w="110" w:type="dxa"/>
+              <w:top w:w="95" w:type="dxa"/>
+              <w:start w:w="95" w:type="dxa"/>
+              <w:bottom w:w="95" w:type="dxa"/>
+              <w:end w:w="95" w:type="dxa"/>
             </w:tcMar>
             <w:vAlign w:val="center"/>
           </w:tcPr>
           <w:p>
             <w:pPr>
-              <w:spacing w:after="20" w:line="252" w:lineRule="auto"/>
+              <w:spacing w:after="20" w:line="245" w:lineRule="auto"/>
             </w:pPr>
             <w:r>
               <w:rPr>
                 <w:b/>
-                <w:sz w:val="17"/>
+                <w:sz w:val="16"/>
               </w:rPr>
               <w:t>Battery and solar monitor</w:t>
             </w:r>
           </w:p>
           <w:p>
             <w:pPr>
-              <w:spacing w:after="20" w:line="252" w:lineRule="auto"/>
+              <w:spacing w:after="20" w:line="245" w:lineRule="auto"/>
             </w:pPr>
             <w:r>
               <w:rPr>
                 <w:b/>
-                <w:sz w:val="17"/>
+                <w:sz w:val="16"/>
+              </w:rPr>
+              <w:t xml:space="preserve">Group: </w:t>
+            </w:r>
+            <w:r>
+              <w:rPr>
+                <w:sz w:val="16"/>
+              </w:rPr>
+              <w:t>Power monitor</w:t>
+            </w:r>
+          </w:p>
+          <w:p>
+            <w:pPr>
+              <w:spacing w:after="20" w:line="245" w:lineRule="auto"/>
+            </w:pPr>
+            <w:r>
+              <w:rPr>
+                <w:b/>
+                <w:sz w:val="16"/>
               </w:rPr>
               <w:t xml:space="preserve">Priority: </w:t>
             </w:r>
             <w:r>
               <w:rPr>
-                <w:sz w:val="17"/>
+                <w:sz w:val="16"/>
               </w:rPr>
               <w:t>Required support</w:t>
             </w:r>
           </w:p>
           <w:p>
             <w:pPr>
-              <w:spacing w:after="20" w:line="252" w:lineRule="auto"/>
+              <w:spacing w:after="20" w:line="245" w:lineRule="auto"/>
             </w:pPr>
             <w:r>
               <w:rPr>
                 <w:b/>
-                <w:sz w:val="17"/>
+                <w:sz w:val="16"/>
               </w:rPr>
               <w:t xml:space="preserve">Recommended item: </w:t>
             </w:r>
             <w:r>
               <w:rPr>
-                <w:sz w:val="17"/>
+                <w:sz w:val="16"/>
               </w:rPr>
               <w:t>INA219 current and power monitor module; INA260 as upgrade option</w:t>
             </w:r>
           </w:p>
           <w:p>
             <w:pPr>
-              <w:spacing w:after="20" w:line="252" w:lineRule="auto"/>
+              <w:spacing w:after="20" w:line="245" w:lineRule="auto"/>
             </w:pPr>
             <w:r>
               <w:rPr>
                 <w:b/>
-                <w:sz w:val="17"/>
+                <w:sz w:val="16"/>
               </w:rPr>
               <w:t xml:space="preserve">Planning price: </w:t>
             </w:r>
             <w:r>
               <w:rPr>
-                <w:sz w:val="17"/>
+                <w:sz w:val="16"/>
               </w:rPr>
               <w:t>PHP 83-180 for INA219; INA260 around PHP 593</w:t>
             </w:r>
           </w:p>
           <w:p>
             <w:pPr>
-              <w:spacing w:after="20" w:line="252" w:lineRule="auto"/>
+              <w:spacing w:after="20" w:line="245" w:lineRule="auto"/>
             </w:pPr>
             <w:r>
               <w:rPr>
                 <w:b/>
-                <w:sz w:val="17"/>
+                <w:sz w:val="16"/>
               </w:rPr>
               <w:t xml:space="preserve">Buy from or verify at: </w:t>
             </w:r>
             <w:r>
               <w:rPr>
-                <w:sz w:val="17"/>
+                <w:sz w:val="16"/>
               </w:rPr>
               <w:t>Shopee INA219, imBento Cebu, Lazada INA260 tag result</w:t>
             </w:r>
           </w:p>
           <w:p>
             <w:pPr>
-              <w:spacing w:after="20" w:line="252" w:lineRule="auto"/>
+              <w:spacing w:after="20" w:line="245" w:lineRule="auto"/>
             </w:pPr>
             <w:r>
               <w:rPr>
                 <w:b/>
-                <w:sz w:val="17"/>
+                <w:sz w:val="16"/>
               </w:rPr>
               <w:t xml:space="preserve">Approval note: </w:t>
             </w:r>
             <w:r>
               <w:rPr>
-                <w:sz w:val="17"/>
+                <w:sz w:val="16"/>
               </w:rPr>
-              <w:t>Approve INA219 first for low cost. Upgrade only if current range or accuracy becomes a problem.</w:t>
+              <w:t>Approve INA219 first for low cost. It validates battery voltage, charging behavior, and power budget.</w:t>
             </w:r>
           </w:p>
         </w:tc>
@@ -1456,7 +1546,7 @@
     </w:tbl>
     <w:p>
       <w:pPr>
-        <w:spacing w:after="40"/>
+        <w:spacing w:after="20"/>
       </w:pPr>
     </w:p>
     <w:tbl>
@@ -1481,25 +1571,25 @@
       <w:tr>
         <w:tc>
           <w:tcPr>
-            <w:tcW w:type="dxa" w:w="2880"/>
+            <w:tcW w:type="dxa" w:w="2736"/>
             <w:tcMar>
-              <w:top w:w="80" w:type="dxa"/>
-              <w:start w:w="80" w:type="dxa"/>
-              <w:bottom w:w="80" w:type="dxa"/>
-              <w:end w:w="80" w:type="dxa"/>
+              <w:top w:w="70" w:type="dxa"/>
+              <w:start w:w="70" w:type="dxa"/>
+              <w:bottom w:w="70" w:type="dxa"/>
+              <w:end w:w="70" w:type="dxa"/>
             </w:tcMar>
             <w:shd w:fill="F7F9FB"/>
             <w:vAlign w:val="center"/>
           </w:tcPr>
           <w:p>
             <w:pPr>
-              <w:spacing w:after="20" w:line="252" w:lineRule="auto"/>
+              <w:spacing w:after="20" w:line="245" w:lineRule="auto"/>
               <w:jc w:val="center"/>
             </w:pPr>
             <w:r>
               <w:drawing>
                 <wp:inline xmlns:a="http://schemas.openxmlformats.org/drawingml/2006/main" xmlns:pic="http://schemas.openxmlformats.org/drawingml/2006/picture">
-                  <wp:extent cx="1572768" cy="1092009"/>
+                  <wp:extent cx="1417320" cy="984078"/>
                   <wp:docPr id="6" name="Picture 6"/>
                   <wp:cNvGraphicFramePr>
                     <a:graphicFrameLocks noChangeAspect="1"/>
@@ -1508,7 +1598,7 @@
                     <a:graphicData uri="http://schemas.openxmlformats.org/drawingml/2006/picture">
                       <pic:pic>
                         <pic:nvPicPr>
-                          <pic:cNvPr id="0" name="lte.png"/>
+                          <pic:cNvPr id="0" name="battery.png"/>
                           <pic:cNvPicPr/>
                         </pic:nvPicPr>
                         <pic:blipFill>
@@ -1520,7 +1610,7 @@
                         <pic:spPr>
                           <a:xfrm>
                             <a:off x="0" y="0"/>
-                            <a:ext cx="1572768" cy="1092009"/>
+                            <a:ext cx="1417320" cy="984078"/>
                           </a:xfrm>
                           <a:prstGeom prst="rect"/>
                         </pic:spPr>
@@ -1534,115 +1624,133 @@
         </w:tc>
         <w:tc>
           <w:tcPr>
-            <w:tcW w:type="dxa" w:w="7343"/>
+            <w:tcW w:type="dxa" w:w="7488"/>
             <w:tcMar>
-              <w:top w:w="110" w:type="dxa"/>
-              <w:start w:w="110" w:type="dxa"/>
-              <w:bottom w:w="110" w:type="dxa"/>
-              <w:end w:w="110" w:type="dxa"/>
+              <w:top w:w="95" w:type="dxa"/>
+              <w:start w:w="95" w:type="dxa"/>
+              <w:bottom w:w="95" w:type="dxa"/>
+              <w:end w:w="95" w:type="dxa"/>
             </w:tcMar>
             <w:vAlign w:val="center"/>
           </w:tcPr>
           <w:p>
             <w:pPr>
-              <w:spacing w:after="20" w:line="252" w:lineRule="auto"/>
+              <w:spacing w:after="20" w:line="245" w:lineRule="auto"/>
             </w:pPr>
             <w:r>
               <w:rPr>
                 <w:b/>
-                <w:sz w:val="17"/>
+                <w:sz w:val="16"/>
               </w:rPr>
-              <w:t>Internet module</w:t>
+              <w:t>Rechargeable battery pack</w:t>
             </w:r>
           </w:p>
           <w:p>
             <w:pPr>
-              <w:spacing w:after="20" w:line="252" w:lineRule="auto"/>
+              <w:spacing w:after="20" w:line="245" w:lineRule="auto"/>
             </w:pPr>
             <w:r>
               <w:rPr>
                 <w:b/>
-                <w:sz w:val="17"/>
+                <w:sz w:val="16"/>
+              </w:rPr>
+              <w:t xml:space="preserve">Group: </w:t>
+            </w:r>
+            <w:r>
+              <w:rPr>
+                <w:sz w:val="16"/>
+              </w:rPr>
+              <w:t>Power system</w:t>
+            </w:r>
+          </w:p>
+          <w:p>
+            <w:pPr>
+              <w:spacing w:after="20" w:line="245" w:lineRule="auto"/>
+            </w:pPr>
+            <w:r>
+              <w:rPr>
+                <w:b/>
+                <w:sz w:val="16"/>
               </w:rPr>
               <w:t xml:space="preserve">Priority: </w:t>
             </w:r>
             <w:r>
               <w:rPr>
-                <w:sz w:val="17"/>
+                <w:sz w:val="16"/>
               </w:rPr>
-              <w:t>Required communication support</w:t>
+              <w:t>Required power</w:t>
             </w:r>
           </w:p>
           <w:p>
             <w:pPr>
-              <w:spacing w:after="20" w:line="252" w:lineRule="auto"/>
+              <w:spacing w:after="20" w:line="245" w:lineRule="auto"/>
             </w:pPr>
             <w:r>
               <w:rPr>
                 <w:b/>
-                <w:sz w:val="17"/>
+                <w:sz w:val="16"/>
               </w:rPr>
               <w:t xml:space="preserve">Recommended item: </w:t>
             </w:r>
             <w:r>
               <w:rPr>
-                <w:sz w:val="17"/>
+                <w:sz w:val="16"/>
               </w:rPr>
-              <w:t>ESP32 Wi-Fi for lab; A7670E LTE Cat-1 or Waveshare ESP32-S3 A7670E for field</w:t>
+              <w:t>Small 12 V LiFePO4 pack with built-in BMS, or protected 18650 pack for prototype validation</w:t>
             </w:r>
           </w:p>
           <w:p>
             <w:pPr>
-              <w:spacing w:after="20" w:line="252" w:lineRule="auto"/>
+              <w:spacing w:after="20" w:line="245" w:lineRule="auto"/>
             </w:pPr>
             <w:r>
               <w:rPr>
                 <w:b/>
-                <w:sz w:val="17"/>
+                <w:sz w:val="16"/>
               </w:rPr>
               <w:t xml:space="preserve">Planning price: </w:t>
             </w:r>
             <w:r>
               <w:rPr>
-                <w:sz w:val="17"/>
+                <w:sz w:val="16"/>
               </w:rPr>
-              <w:t>A7670E core PHP 1,015-1,151; Waveshare ESP32-S3 A7670E PHP 2,614; T-SIM7600 class PHP 4,192</w:t>
+              <w:t>Prototype holders/cases from PHP 15-499; small 12 V LiFePO4 planning range PHP 1,500-3,500+</w:t>
             </w:r>
           </w:p>
           <w:p>
             <w:pPr>
-              <w:spacing w:after="20" w:line="252" w:lineRule="auto"/>
+              <w:spacing w:after="20" w:line="245" w:lineRule="auto"/>
             </w:pPr>
             <w:r>
               <w:rPr>
                 <w:b/>
-                <w:sz w:val="17"/>
+                <w:sz w:val="16"/>
               </w:rPr>
               <w:t xml:space="preserve">Buy from or verify at: </w:t>
             </w:r>
             <w:r>
               <w:rPr>
-                <w:sz w:val="17"/>
+                <w:sz w:val="16"/>
               </w:rPr>
-              <w:t>Lazada A7670E / ESP32 SIM LTE listings</w:t>
+              <w:t>Shopee 18650 holder/BMS listings; Lazada lithium/LiFePO4 battery listings</w:t>
             </w:r>
           </w:p>
           <w:p>
             <w:pPr>
-              <w:spacing w:after="20" w:line="252" w:lineRule="auto"/>
+              <w:spacing w:after="20" w:line="245" w:lineRule="auto"/>
             </w:pPr>
             <w:r>
               <w:rPr>
                 <w:b/>
-                <w:sz w:val="17"/>
+                <w:sz w:val="16"/>
               </w:rPr>
               <w:t xml:space="preserve">Approval note: </w:t>
             </w:r>
             <w:r>
               <w:rPr>
-                <w:sz w:val="17"/>
+                <w:sz w:val="16"/>
               </w:rPr>
-              <w:t>Approve as communication module. Use Wi-Fi for bench and near-shore tests; buy LTE only when the site has no stable Wi-Fi.</w:t>
+              <w:t>Add to approval list. Battery capacity must be sized after ESP32, LTE, GPS, sensors, and night light current are measured.</w:t>
             </w:r>
           </w:p>
         </w:tc>
@@ -1650,7 +1758,7 @@
     </w:tbl>
     <w:p>
       <w:pPr>
-        <w:spacing w:after="40"/>
+        <w:spacing w:after="20"/>
       </w:pPr>
     </w:p>
     <w:tbl>
@@ -1675,25 +1783,25 @@
       <w:tr>
         <w:tc>
           <w:tcPr>
-            <w:tcW w:type="dxa" w:w="2880"/>
+            <w:tcW w:type="dxa" w:w="2736"/>
             <w:tcMar>
-              <w:top w:w="80" w:type="dxa"/>
-              <w:start w:w="80" w:type="dxa"/>
-              <w:bottom w:w="80" w:type="dxa"/>
-              <w:end w:w="80" w:type="dxa"/>
+              <w:top w:w="70" w:type="dxa"/>
+              <w:start w:w="70" w:type="dxa"/>
+              <w:bottom w:w="70" w:type="dxa"/>
+              <w:end w:w="70" w:type="dxa"/>
             </w:tcMar>
             <w:shd w:fill="F7F9FB"/>
             <w:vAlign w:val="center"/>
           </w:tcPr>
           <w:p>
             <w:pPr>
-              <w:spacing w:after="20" w:line="252" w:lineRule="auto"/>
+              <w:spacing w:after="20" w:line="245" w:lineRule="auto"/>
               <w:jc w:val="center"/>
             </w:pPr>
             <w:r>
               <w:drawing>
                 <wp:inline xmlns:a="http://schemas.openxmlformats.org/drawingml/2006/main" xmlns:pic="http://schemas.openxmlformats.org/drawingml/2006/picture">
-                  <wp:extent cx="1572768" cy="1092009"/>
+                  <wp:extent cx="1417320" cy="984078"/>
                   <wp:docPr id="7" name="Picture 7"/>
                   <wp:cNvGraphicFramePr>
                     <a:graphicFrameLocks noChangeAspect="1"/>
@@ -1702,7 +1810,7 @@
                     <a:graphicData uri="http://schemas.openxmlformats.org/drawingml/2006/picture">
                       <pic:pic>
                         <pic:nvPicPr>
-                          <pic:cNvPr id="0" name="mpu6050.png"/>
+                          <pic:cNvPr id="0" name="solar_panel.png"/>
                           <pic:cNvPicPr/>
                         </pic:nvPicPr>
                         <pic:blipFill>
@@ -1714,7 +1822,7 @@
                         <pic:spPr>
                           <a:xfrm>
                             <a:off x="0" y="0"/>
-                            <a:ext cx="1572768" cy="1092009"/>
+                            <a:ext cx="1417320" cy="984078"/>
                           </a:xfrm>
                           <a:prstGeom prst="rect"/>
                         </pic:spPr>
@@ -1728,115 +1836,129 @@
         </w:tc>
         <w:tc>
           <w:tcPr>
-            <w:tcW w:type="dxa" w:w="7343"/>
+            <w:tcW w:type="dxa" w:w="7488"/>
             <w:tcMar>
-              <w:top w:w="110" w:type="dxa"/>
-              <w:start w:w="110" w:type="dxa"/>
-              <w:bottom w:w="110" w:type="dxa"/>
-              <w:end w:w="110" w:type="dxa"/>
+              <w:top w:w="95" w:type="dxa"/>
+              <w:start w:w="95" w:type="dxa"/>
+              <w:bottom w:w="95" w:type="dxa"/>
+              <w:end w:w="95" w:type="dxa"/>
             </w:tcMar>
             <w:vAlign w:val="center"/>
           </w:tcPr>
           <w:p>
             <w:pPr>
-              <w:spacing w:after="20" w:line="252" w:lineRule="auto"/>
+              <w:spacing w:after="20" w:line="245" w:lineRule="auto"/>
             </w:pPr>
             <w:r>
               <w:rPr>
                 <w:b/>
-                <w:sz w:val="17"/>
+                <w:sz w:val="16"/>
               </w:rPr>
-              <w:t>Tilt and motion</w:t>
+              <w:t>Solar panel</w:t>
             </w:r>
           </w:p>
           <w:p>
             <w:pPr>
-              <w:spacing w:after="20" w:line="252" w:lineRule="auto"/>
+              <w:spacing w:after="20" w:line="245" w:lineRule="auto"/>
             </w:pPr>
             <w:r>
               <w:rPr>
                 <w:b/>
-                <w:sz w:val="17"/>
+                <w:sz w:val="16"/>
+              </w:rPr>
+              <w:t xml:space="preserve">Group: </w:t>
+            </w:r>
+            <w:r>
+              <w:rPr>
+                <w:sz w:val="16"/>
+              </w:rPr>
+              <w:t>Power system</w:t>
+            </w:r>
+          </w:p>
+          <w:p>
+            <w:pPr>
+              <w:spacing w:after="20" w:line="245" w:lineRule="auto"/>
+            </w:pPr>
+            <w:r>
+              <w:rPr>
+                <w:b/>
+                <w:sz w:val="16"/>
               </w:rPr>
               <w:t xml:space="preserve">Priority: </w:t>
             </w:r>
             <w:r>
               <w:rPr>
-                <w:sz w:val="17"/>
+                <w:sz w:val="16"/>
               </w:rPr>
-              <w:t>Optional event/security</w:t>
+              <w:t>Required power</w:t>
             </w:r>
           </w:p>
           <w:p>
             <w:pPr>
-              <w:spacing w:after="20" w:line="252" w:lineRule="auto"/>
+              <w:spacing w:after="20" w:line="245" w:lineRule="auto"/>
             </w:pPr>
             <w:r>
               <w:rPr>
                 <w:b/>
-                <w:sz w:val="17"/>
+                <w:sz w:val="16"/>
               </w:rPr>
-              <w:t xml:space="preserve">Recommended item: </w:t>
+              <w:t>Recommended item: Mini waterproof solar panel, about 3W-10W for the compact buoy; choose 5V, 6V, or 12V based on the final battery and charger design</w:t>
             </w:r>
             <w:r>
               <w:rPr>
-                <w:sz w:val="17"/>
+                <w:sz w:val="16"/>
               </w:rPr>
-              <w:t>MPU6050 / GY-521 accelerometer and gyroscope module</w:t>
             </w:r>
           </w:p>
           <w:p>
             <w:pPr>
-              <w:spacing w:after="20" w:line="252" w:lineRule="auto"/>
+              <w:spacing w:after="20" w:line="245" w:lineRule="auto"/>
             </w:pPr>
             <w:r>
               <w:rPr>
                 <w:b/>
-                <w:sz w:val="17"/>
+                <w:sz w:val="16"/>
               </w:rPr>
-              <w:t xml:space="preserve">Planning price: </w:t>
+              <w:t>Planning price: Mini solar panels are around PHP 188-249 for 3W-5W class; larger 12V kits cost more and may be too big for the compact buoy</w:t>
             </w:r>
             <w:r>
               <w:rPr>
-                <w:sz w:val="17"/>
+                <w:sz w:val="16"/>
               </w:rPr>
-              <w:t>PHP 92-223 typical</w:t>
             </w:r>
           </w:p>
           <w:p>
             <w:pPr>
-              <w:spacing w:after="20" w:line="252" w:lineRule="auto"/>
+              <w:spacing w:after="20" w:line="245" w:lineRule="auto"/>
             </w:pPr>
             <w:r>
               <w:rPr>
                 <w:b/>
-                <w:sz w:val="17"/>
+                <w:sz w:val="16"/>
               </w:rPr>
-              <w:t xml:space="preserve">Buy from or verify at: </w:t>
+              <w:t>Buy from or verify at: Shopee 5V/5W and 3W mini solar panel listings; Lazada 6V/5W mini solar panel listings</w:t>
             </w:r>
             <w:r>
               <w:rPr>
-                <w:sz w:val="17"/>
+                <w:sz w:val="16"/>
               </w:rPr>
-              <w:t>Lazada MPU6050 listings</w:t>
             </w:r>
           </w:p>
           <w:p>
             <w:pPr>
-              <w:spacing w:after="20" w:line="252" w:lineRule="auto"/>
+              <w:spacing w:after="20" w:line="245" w:lineRule="auto"/>
             </w:pPr>
             <w:r>
               <w:rPr>
                 <w:b/>
-                <w:sz w:val="17"/>
+                <w:sz w:val="16"/>
               </w:rPr>
-              <w:t xml:space="preserve">Approval note: </w:t>
+              <w:t>Approval note: Add to approval list, but keep it physically small. The compact buoy should use a mini panel first; final wattage depends on measured daily load, available top-deck area, sun exposure, and whether the night beacon has its own solar panel.</w:t>
             </w:r>
             <w:r>
               <w:rPr>
-                <w:sz w:val="17"/>
+                <w:sz w:val="16"/>
               </w:rPr>
-              <w:t>Optional but useful. Adds movement or tilt event trigger. It does not replace the water pressure sensor.</w:t>
             </w:r>
           </w:p>
         </w:tc>
@@ -1844,7 +1966,7 @@
     </w:tbl>
     <w:p>
       <w:pPr>
-        <w:spacing w:after="40"/>
+        <w:spacing w:after="20"/>
       </w:pPr>
     </w:p>
     <w:tbl>
@@ -1869,25 +1991,25 @@
       <w:tr>
         <w:tc>
           <w:tcPr>
-            <w:tcW w:type="dxa" w:w="2880"/>
+            <w:tcW w:type="dxa" w:w="2736"/>
             <w:tcMar>
-              <w:top w:w="80" w:type="dxa"/>
-              <w:start w:w="80" w:type="dxa"/>
-              <w:bottom w:w="80" w:type="dxa"/>
-              <w:end w:w="80" w:type="dxa"/>
+              <w:top w:w="70" w:type="dxa"/>
+              <w:start w:w="70" w:type="dxa"/>
+              <w:bottom w:w="70" w:type="dxa"/>
+              <w:end w:w="70" w:type="dxa"/>
             </w:tcMar>
             <w:shd w:fill="F7F9FB"/>
             <w:vAlign w:val="center"/>
           </w:tcPr>
           <w:p>
             <w:pPr>
-              <w:spacing w:after="20" w:line="252" w:lineRule="auto"/>
+              <w:spacing w:after="20" w:line="245" w:lineRule="auto"/>
               <w:jc w:val="center"/>
             </w:pPr>
             <w:r>
               <w:drawing>
                 <wp:inline xmlns:a="http://schemas.openxmlformats.org/drawingml/2006/main" xmlns:pic="http://schemas.openxmlformats.org/drawingml/2006/picture">
-                  <wp:extent cx="1572768" cy="1092009"/>
+                  <wp:extent cx="1417320" cy="984078"/>
                   <wp:docPr id="8" name="Picture 8"/>
                   <wp:cNvGraphicFramePr>
                     <a:graphicFrameLocks noChangeAspect="1"/>
@@ -1896,7 +2018,7 @@
                     <a:graphicData uri="http://schemas.openxmlformats.org/drawingml/2006/picture">
                       <pic:pic>
                         <pic:nvPicPr>
-                          <pic:cNvPr id="0" name="sw420.png"/>
+                          <pic:cNvPr id="0" name="solar_charger.png"/>
                           <pic:cNvPicPr/>
                         </pic:nvPicPr>
                         <pic:blipFill>
@@ -1908,7 +2030,7 @@
                         <pic:spPr>
                           <a:xfrm>
                             <a:off x="0" y="0"/>
-                            <a:ext cx="1572768" cy="1092009"/>
+                            <a:ext cx="1417320" cy="984078"/>
                           </a:xfrm>
                           <a:prstGeom prst="rect"/>
                         </pic:spPr>
@@ -1922,115 +2044,133 @@
         </w:tc>
         <w:tc>
           <w:tcPr>
-            <w:tcW w:type="dxa" w:w="7343"/>
+            <w:tcW w:type="dxa" w:w="7488"/>
             <w:tcMar>
-              <w:top w:w="110" w:type="dxa"/>
-              <w:start w:w="110" w:type="dxa"/>
-              <w:bottom w:w="110" w:type="dxa"/>
-              <w:end w:w="110" w:type="dxa"/>
+              <w:top w:w="95" w:type="dxa"/>
+              <w:start w:w="95" w:type="dxa"/>
+              <w:bottom w:w="95" w:type="dxa"/>
+              <w:end w:w="95" w:type="dxa"/>
             </w:tcMar>
             <w:vAlign w:val="center"/>
           </w:tcPr>
           <w:p>
             <w:pPr>
-              <w:spacing w:after="20" w:line="252" w:lineRule="auto"/>
+              <w:spacing w:after="20" w:line="245" w:lineRule="auto"/>
             </w:pPr>
             <w:r>
               <w:rPr>
                 <w:b/>
-                <w:sz w:val="17"/>
+                <w:sz w:val="16"/>
               </w:rPr>
-              <w:t>Vibration and tamper</w:t>
+              <w:t>Solar charger and battery protection</w:t>
             </w:r>
           </w:p>
           <w:p>
             <w:pPr>
-              <w:spacing w:after="20" w:line="252" w:lineRule="auto"/>
+              <w:spacing w:after="20" w:line="245" w:lineRule="auto"/>
             </w:pPr>
             <w:r>
               <w:rPr>
                 <w:b/>
-                <w:sz w:val="17"/>
+                <w:sz w:val="16"/>
+              </w:rPr>
+              <w:t xml:space="preserve">Group: </w:t>
+            </w:r>
+            <w:r>
+              <w:rPr>
+                <w:sz w:val="16"/>
+              </w:rPr>
+              <w:t>Power system</w:t>
+            </w:r>
+          </w:p>
+          <w:p>
+            <w:pPr>
+              <w:spacing w:after="20" w:line="245" w:lineRule="auto"/>
+            </w:pPr>
+            <w:r>
+              <w:rPr>
+                <w:b/>
+                <w:sz w:val="16"/>
               </w:rPr>
               <w:t xml:space="preserve">Priority: </w:t>
             </w:r>
             <w:r>
               <w:rPr>
-                <w:sz w:val="17"/>
+                <w:sz w:val="16"/>
               </w:rPr>
-              <w:t>Optional event/security</w:t>
+              <w:t>Required power interface</w:t>
             </w:r>
           </w:p>
           <w:p>
             <w:pPr>
-              <w:spacing w:after="20" w:line="252" w:lineRule="auto"/>
+              <w:spacing w:after="20" w:line="245" w:lineRule="auto"/>
             </w:pPr>
             <w:r>
               <w:rPr>
                 <w:b/>
-                <w:sz w:val="17"/>
+                <w:sz w:val="16"/>
               </w:rPr>
               <w:t xml:space="preserve">Recommended item: </w:t>
             </w:r>
             <w:r>
               <w:rPr>
-                <w:sz w:val="17"/>
+                <w:sz w:val="16"/>
               </w:rPr>
-              <w:t>SW-420 vibration sensor module</w:t>
+              <w:t>Solar charge controller matched to battery chemistry; include BMS for lithium/LiFePO4 packs</w:t>
             </w:r>
           </w:p>
           <w:p>
             <w:pPr>
-              <w:spacing w:after="20" w:line="252" w:lineRule="auto"/>
+              <w:spacing w:after="20" w:line="245" w:lineRule="auto"/>
             </w:pPr>
             <w:r>
               <w:rPr>
                 <w:b/>
-                <w:sz w:val="17"/>
+                <w:sz w:val="16"/>
               </w:rPr>
               <w:t xml:space="preserve">Planning price: </w:t>
             </w:r>
             <w:r>
               <w:rPr>
-                <w:sz w:val="17"/>
+                <w:sz w:val="16"/>
               </w:rPr>
-              <w:t>PHP 45-70 typical</w:t>
+              <w:t>Small PWM controllers around PHP 189; CN3065/TP4056 class modules lower cost for single-cell prototypes</w:t>
             </w:r>
           </w:p>
           <w:p>
             <w:pPr>
-              <w:spacing w:after="20" w:line="252" w:lineRule="auto"/>
+              <w:spacing w:after="20" w:line="245" w:lineRule="auto"/>
             </w:pPr>
             <w:r>
               <w:rPr>
                 <w:b/>
-                <w:sz w:val="17"/>
+                <w:sz w:val="16"/>
               </w:rPr>
               <w:t xml:space="preserve">Buy from or verify at: </w:t>
             </w:r>
             <w:r>
               <w:rPr>
-                <w:sz w:val="17"/>
+                <w:sz w:val="16"/>
               </w:rPr>
-              <w:t>e-Gizmo, MakerLab, Lazada sensor module tag results</w:t>
+              <w:t>Shopee solar charge controller listings; CN3065/TP4056 module references</w:t>
             </w:r>
           </w:p>
           <w:p>
             <w:pPr>
-              <w:spacing w:after="20" w:line="252" w:lineRule="auto"/>
+              <w:spacing w:after="20" w:line="245" w:lineRule="auto"/>
             </w:pPr>
             <w:r>
               <w:rPr>
                 <w:b/>
-                <w:sz w:val="17"/>
+                <w:sz w:val="16"/>
               </w:rPr>
               <w:t xml:space="preserve">Approval note: </w:t>
             </w:r>
             <w:r>
               <w:rPr>
-                <w:sz w:val="17"/>
+                <w:sz w:val="16"/>
               </w:rPr>
-              <w:t>Optional. Good for enclosure hit or tamper trigger; not reliable as wave measurement.</w:t>
+              <w:t>Required if solar charging is used. Do not connect solar panel directly to lithium battery without proper charger and protection.</w:t>
             </w:r>
           </w:p>
         </w:tc>
@@ -2038,7 +2178,7 @@
     </w:tbl>
     <w:p>
       <w:pPr>
-        <w:spacing w:after="40"/>
+        <w:spacing w:after="20"/>
       </w:pPr>
     </w:p>
     <w:tbl>
@@ -2063,25 +2203,25 @@
       <w:tr>
         <w:tc>
           <w:tcPr>
-            <w:tcW w:type="dxa" w:w="2880"/>
+            <w:tcW w:type="dxa" w:w="2736"/>
             <w:tcMar>
-              <w:top w:w="80" w:type="dxa"/>
-              <w:start w:w="80" w:type="dxa"/>
-              <w:bottom w:w="80" w:type="dxa"/>
-              <w:end w:w="80" w:type="dxa"/>
+              <w:top w:w="70" w:type="dxa"/>
+              <w:start w:w="70" w:type="dxa"/>
+              <w:bottom w:w="70" w:type="dxa"/>
+              <w:end w:w="70" w:type="dxa"/>
             </w:tcMar>
             <w:shd w:fill="F7F9FB"/>
             <w:vAlign w:val="center"/>
           </w:tcPr>
           <w:p>
             <w:pPr>
-              <w:spacing w:after="20" w:line="252" w:lineRule="auto"/>
+              <w:spacing w:after="20" w:line="245" w:lineRule="auto"/>
               <w:jc w:val="center"/>
             </w:pPr>
             <w:r>
               <w:drawing>
                 <wp:inline xmlns:a="http://schemas.openxmlformats.org/drawingml/2006/main" xmlns:pic="http://schemas.openxmlformats.org/drawingml/2006/picture">
-                  <wp:extent cx="1572768" cy="1092009"/>
+                  <wp:extent cx="1417320" cy="984078"/>
                   <wp:docPr id="9" name="Picture 9"/>
                   <wp:cNvGraphicFramePr>
                     <a:graphicFrameLocks noChangeAspect="1"/>
@@ -2090,7 +2230,7 @@
                     <a:graphicData uri="http://schemas.openxmlformats.org/drawingml/2006/picture">
                       <pic:pic>
                         <pic:nvPicPr>
-                          <pic:cNvPr id="0" name="reed.png"/>
+                          <pic:cNvPr id="0" name="marine_light.png"/>
                           <pic:cNvPicPr/>
                         </pic:nvPicPr>
                         <pic:blipFill>
@@ -2102,7 +2242,7 @@
                         <pic:spPr>
                           <a:xfrm>
                             <a:off x="0" y="0"/>
-                            <a:ext cx="1572768" cy="1092009"/>
+                            <a:ext cx="1417320" cy="984078"/>
                           </a:xfrm>
                           <a:prstGeom prst="rect"/>
                         </pic:spPr>
@@ -2116,115 +2256,133 @@
         </w:tc>
         <w:tc>
           <w:tcPr>
-            <w:tcW w:type="dxa" w:w="7343"/>
+            <w:tcW w:type="dxa" w:w="7488"/>
             <w:tcMar>
-              <w:top w:w="110" w:type="dxa"/>
-              <w:start w:w="110" w:type="dxa"/>
-              <w:bottom w:w="110" w:type="dxa"/>
-              <w:end w:w="110" w:type="dxa"/>
+              <w:top w:w="95" w:type="dxa"/>
+              <w:start w:w="95" w:type="dxa"/>
+              <w:bottom w:w="95" w:type="dxa"/>
+              <w:end w:w="95" w:type="dxa"/>
             </w:tcMar>
             <w:vAlign w:val="center"/>
           </w:tcPr>
           <w:p>
             <w:pPr>
-              <w:spacing w:after="20" w:line="252" w:lineRule="auto"/>
+              <w:spacing w:after="20" w:line="245" w:lineRule="auto"/>
             </w:pPr>
             <w:r>
               <w:rPr>
                 <w:b/>
-                <w:sz w:val="17"/>
+                <w:sz w:val="16"/>
               </w:rPr>
-              <w:t>Lid-open tamper</w:t>
+              <w:t>Marine night light or beacon</w:t>
             </w:r>
           </w:p>
           <w:p>
             <w:pPr>
-              <w:spacing w:after="20" w:line="252" w:lineRule="auto"/>
+              <w:spacing w:after="20" w:line="245" w:lineRule="auto"/>
             </w:pPr>
             <w:r>
               <w:rPr>
                 <w:b/>
-                <w:sz w:val="17"/>
+                <w:sz w:val="16"/>
+              </w:rPr>
+              <w:t xml:space="preserve">Group: </w:t>
+            </w:r>
+            <w:r>
+              <w:rPr>
+                <w:sz w:val="16"/>
+              </w:rPr>
+              <w:t>Safety</w:t>
+            </w:r>
+          </w:p>
+          <w:p>
+            <w:pPr>
+              <w:spacing w:after="20" w:line="245" w:lineRule="auto"/>
+            </w:pPr>
+            <w:r>
+              <w:rPr>
+                <w:b/>
+                <w:sz w:val="16"/>
               </w:rPr>
               <w:t xml:space="preserve">Priority: </w:t>
             </w:r>
             <w:r>
               <w:rPr>
-                <w:sz w:val="17"/>
+                <w:sz w:val="16"/>
               </w:rPr>
-              <w:t>Optional event/security</w:t>
+              <w:t>Required visibility/safety</w:t>
             </w:r>
           </w:p>
           <w:p>
             <w:pPr>
-              <w:spacing w:after="20" w:line="252" w:lineRule="auto"/>
+              <w:spacing w:after="20" w:line="245" w:lineRule="auto"/>
             </w:pPr>
             <w:r>
               <w:rPr>
                 <w:b/>
-                <w:sz w:val="17"/>
+                <w:sz w:val="16"/>
               </w:rPr>
               <w:t xml:space="preserve">Recommended item: </w:t>
             </w:r>
             <w:r>
               <w:rPr>
-                <w:sz w:val="17"/>
+                <w:sz w:val="16"/>
               </w:rPr>
-              <w:t>Reed switch or magnetic switch module</w:t>
+              <w:t>Waterproof solar marine beacon / buoy signal light, IP66-IP68 preferred, visible at night</w:t>
             </w:r>
           </w:p>
           <w:p>
             <w:pPr>
-              <w:spacing w:after="20" w:line="252" w:lineRule="auto"/>
+              <w:spacing w:after="20" w:line="245" w:lineRule="auto"/>
             </w:pPr>
             <w:r>
               <w:rPr>
                 <w:b/>
-                <w:sz w:val="17"/>
+                <w:sz w:val="16"/>
               </w:rPr>
               <w:t xml:space="preserve">Planning price: </w:t>
             </w:r>
             <w:r>
               <w:rPr>
-                <w:sz w:val="17"/>
+                <w:sz w:val="16"/>
               </w:rPr>
-              <w:t>PHP 70-309 depending style</w:t>
+              <w:t>Lazada/Shopee marine signal lights around PHP 269-781 for low-cost units; better marine lanterns cost more</w:t>
             </w:r>
           </w:p>
           <w:p>
             <w:pPr>
-              <w:spacing w:after="20" w:line="252" w:lineRule="auto"/>
+              <w:spacing w:after="20" w:line="245" w:lineRule="auto"/>
             </w:pPr>
             <w:r>
               <w:rPr>
                 <w:b/>
-                <w:sz w:val="17"/>
+                <w:sz w:val="16"/>
               </w:rPr>
               <w:t xml:space="preserve">Buy from or verify at: </w:t>
             </w:r>
             <w:r>
               <w:rPr>
-                <w:sz w:val="17"/>
+                <w:sz w:val="16"/>
               </w:rPr>
-              <w:t>Lazada magnetic switch; local hobby electronics reed switch modules</w:t>
+              <w:t>Shopee solar marine navigation light; Lazada boat signal / solar beacon listings</w:t>
             </w:r>
           </w:p>
           <w:p>
             <w:pPr>
-              <w:spacing w:after="20" w:line="252" w:lineRule="auto"/>
+              <w:spacing w:after="20" w:line="245" w:lineRule="auto"/>
             </w:pPr>
             <w:r>
               <w:rPr>
                 <w:b/>
-                <w:sz w:val="17"/>
+                <w:sz w:val="16"/>
               </w:rPr>
               <w:t xml:space="preserve">Approval note: </w:t>
             </w:r>
             <w:r>
               <w:rPr>
-                <w:sz w:val="17"/>
+                <w:sz w:val="16"/>
               </w:rPr>
-              <w:t>Optional. Good for detecting if the enclosure is opened during field display or validation.</w:t>
+              <w:t>Add for night visibility and safety. Prefer a self-contained solar beacon so it does not drain the main electronics battery.</w:t>
             </w:r>
           </w:p>
         </w:tc>
@@ -2232,7 +2390,7 @@
     </w:tbl>
     <w:p>
       <w:pPr>
-        <w:spacing w:after="40"/>
+        <w:spacing w:after="20"/>
       </w:pPr>
     </w:p>
     <w:tbl>
@@ -2257,25 +2415,25 @@
       <w:tr>
         <w:tc>
           <w:tcPr>
-            <w:tcW w:type="dxa" w:w="2880"/>
+            <w:tcW w:type="dxa" w:w="2736"/>
             <w:tcMar>
-              <w:top w:w="80" w:type="dxa"/>
-              <w:start w:w="80" w:type="dxa"/>
-              <w:bottom w:w="80" w:type="dxa"/>
-              <w:end w:w="80" w:type="dxa"/>
+              <w:top w:w="70" w:type="dxa"/>
+              <w:start w:w="70" w:type="dxa"/>
+              <w:bottom w:w="70" w:type="dxa"/>
+              <w:end w:w="70" w:type="dxa"/>
             </w:tcMar>
             <w:shd w:fill="F7F9FB"/>
             <w:vAlign w:val="center"/>
           </w:tcPr>
           <w:p>
             <w:pPr>
-              <w:spacing w:after="20" w:line="252" w:lineRule="auto"/>
+              <w:spacing w:after="20" w:line="245" w:lineRule="auto"/>
               <w:jc w:val="center"/>
             </w:pPr>
             <w:r>
               <w:drawing>
                 <wp:inline xmlns:a="http://schemas.openxmlformats.org/drawingml/2006/main" xmlns:pic="http://schemas.openxmlformats.org/drawingml/2006/picture">
-                  <wp:extent cx="1572768" cy="1092009"/>
+                  <wp:extent cx="1417320" cy="984078"/>
                   <wp:docPr id="10" name="Picture 10"/>
                   <wp:cNvGraphicFramePr>
                     <a:graphicFrameLocks noChangeAspect="1"/>
@@ -2284,7 +2442,7 @@
                     <a:graphicData uri="http://schemas.openxmlformats.org/drawingml/2006/picture">
                       <pic:pic>
                         <pic:nvPicPr>
-                          <pic:cNvPr id="0" name="ds18b20.png"/>
+                          <pic:cNvPr id="0" name="lte.png"/>
                           <pic:cNvPicPr/>
                         </pic:nvPicPr>
                         <pic:blipFill>
@@ -2296,7 +2454,7 @@
                         <pic:spPr>
                           <a:xfrm>
                             <a:off x="0" y="0"/>
-                            <a:ext cx="1572768" cy="1092009"/>
+                            <a:ext cx="1417320" cy="984078"/>
                           </a:xfrm>
                           <a:prstGeom prst="rect"/>
                         </pic:spPr>
@@ -2310,115 +2468,133 @@
         </w:tc>
         <w:tc>
           <w:tcPr>
-            <w:tcW w:type="dxa" w:w="7343"/>
+            <w:tcW w:type="dxa" w:w="7488"/>
             <w:tcMar>
-              <w:top w:w="110" w:type="dxa"/>
-              <w:start w:w="110" w:type="dxa"/>
-              <w:bottom w:w="110" w:type="dxa"/>
-              <w:end w:w="110" w:type="dxa"/>
+              <w:top w:w="95" w:type="dxa"/>
+              <w:start w:w="95" w:type="dxa"/>
+              <w:bottom w:w="95" w:type="dxa"/>
+              <w:end w:w="95" w:type="dxa"/>
             </w:tcMar>
             <w:vAlign w:val="center"/>
           </w:tcPr>
           <w:p>
             <w:pPr>
-              <w:spacing w:after="20" w:line="252" w:lineRule="auto"/>
+              <w:spacing w:after="20" w:line="245" w:lineRule="auto"/>
             </w:pPr>
             <w:r>
               <w:rPr>
                 <w:b/>
-                <w:sz w:val="17"/>
+                <w:sz w:val="16"/>
               </w:rPr>
-              <w:t>Water temperature</w:t>
+              <w:t>Internet module</w:t>
             </w:r>
           </w:p>
           <w:p>
             <w:pPr>
-              <w:spacing w:after="20" w:line="252" w:lineRule="auto"/>
+              <w:spacing w:after="20" w:line="245" w:lineRule="auto"/>
             </w:pPr>
             <w:r>
               <w:rPr>
                 <w:b/>
-                <w:sz w:val="17"/>
+                <w:sz w:val="16"/>
+              </w:rPr>
+              <w:t xml:space="preserve">Group: </w:t>
+            </w:r>
+            <w:r>
+              <w:rPr>
+                <w:sz w:val="16"/>
+              </w:rPr>
+              <w:t>Communication</w:t>
+            </w:r>
+          </w:p>
+          <w:p>
+            <w:pPr>
+              <w:spacing w:after="20" w:line="245" w:lineRule="auto"/>
+            </w:pPr>
+            <w:r>
+              <w:rPr>
+                <w:b/>
+                <w:sz w:val="16"/>
               </w:rPr>
               <w:t xml:space="preserve">Priority: </w:t>
             </w:r>
             <w:r>
               <w:rPr>
-                <w:sz w:val="17"/>
+                <w:sz w:val="16"/>
               </w:rPr>
-              <w:t>Optional context</w:t>
+              <w:t>Conditional communication</w:t>
             </w:r>
           </w:p>
           <w:p>
             <w:pPr>
-              <w:spacing w:after="20" w:line="252" w:lineRule="auto"/>
+              <w:spacing w:after="20" w:line="245" w:lineRule="auto"/>
             </w:pPr>
             <w:r>
               <w:rPr>
                 <w:b/>
-                <w:sz w:val="17"/>
+                <w:sz w:val="16"/>
               </w:rPr>
               <w:t xml:space="preserve">Recommended item: </w:t>
             </w:r>
             <w:r>
               <w:rPr>
-                <w:sz w:val="17"/>
+                <w:sz w:val="16"/>
               </w:rPr>
-              <w:t>Waterproof DS18B20 temperature probe</w:t>
+              <w:t>ESP32 Wi-Fi for lab; A7670E LTE Cat-1 or Waveshare ESP32-S3 A7670E for field</w:t>
             </w:r>
           </w:p>
           <w:p>
             <w:pPr>
-              <w:spacing w:after="20" w:line="252" w:lineRule="auto"/>
+              <w:spacing w:after="20" w:line="245" w:lineRule="auto"/>
             </w:pPr>
             <w:r>
               <w:rPr>
                 <w:b/>
-                <w:sz w:val="17"/>
+                <w:sz w:val="16"/>
               </w:rPr>
               <w:t xml:space="preserve">Planning price: </w:t>
             </w:r>
             <w:r>
               <w:rPr>
-                <w:sz w:val="17"/>
+                <w:sz w:val="16"/>
               </w:rPr>
-              <w:t>PHP 63-150 common; premium listings around PHP 217</w:t>
+              <w:t>A7670E core PHP 1,015-1,151; Waveshare ESP32-S3 A7670E PHP 2,614; T-SIM7600 class PHP 4,192</w:t>
             </w:r>
           </w:p>
           <w:p>
             <w:pPr>
-              <w:spacing w:after="20" w:line="252" w:lineRule="auto"/>
+              <w:spacing w:after="20" w:line="245" w:lineRule="auto"/>
             </w:pPr>
             <w:r>
               <w:rPr>
                 <w:b/>
-                <w:sz w:val="17"/>
+                <w:sz w:val="16"/>
               </w:rPr>
               <w:t xml:space="preserve">Buy from or verify at: </w:t>
             </w:r>
             <w:r>
               <w:rPr>
-                <w:sz w:val="17"/>
+                <w:sz w:val="16"/>
               </w:rPr>
-              <w:t>Lazada DS18B20 tag results; MakerLab and Risym listings</w:t>
+              <w:t>Lazada A7670E / ESP32 SIM LTE listings</w:t>
             </w:r>
           </w:p>
           <w:p>
             <w:pPr>
-              <w:spacing w:after="20" w:line="252" w:lineRule="auto"/>
+              <w:spacing w:after="20" w:line="245" w:lineRule="auto"/>
             </w:pPr>
             <w:r>
               <w:rPr>
                 <w:b/>
-                <w:sz w:val="17"/>
+                <w:sz w:val="16"/>
               </w:rPr>
               <w:t xml:space="preserve">Approval note: </w:t>
             </w:r>
             <w:r>
               <w:rPr>
-                <w:sz w:val="17"/>
+                <w:sz w:val="16"/>
               </w:rPr>
-              <w:t>Optional context only. Do not present temperature as the main wave measurement.</w:t>
+              <w:t>Keep as conditional. Use Wi-Fi for bench and near-shore tests; buy LTE only when the site has no stable Wi-Fi.</w:t>
             </w:r>
           </w:p>
         </w:tc>
@@ -2426,7 +2602,648 @@
     </w:tbl>
     <w:p>
       <w:pPr>
-        <w:spacing w:after="40"/>
+        <w:spacing w:after="20"/>
+      </w:pPr>
+    </w:p>
+    <w:tbl>
+      <w:tblPr>
+        <w:tblW w:type="auto" w:w="0"/>
+        <w:jc w:val="center"/>
+        <w:tblLayout w:type="fixed"/>
+        <w:tblLook w:firstColumn="1" w:firstRow="1" w:lastColumn="0" w:lastRow="0" w:noHBand="0" w:noVBand="1" w:val="04A0"/>
+        <w:tblBorders>
+          <w:top w:val="single" w:sz="6" w:space="0" w:color="D9D9D9"/>
+          <w:left w:val="single" w:sz="6" w:space="0" w:color="D9D9D9"/>
+          <w:bottom w:val="single" w:sz="6" w:space="0" w:color="D9D9D9"/>
+          <w:right w:val="single" w:sz="6" w:space="0" w:color="D9D9D9"/>
+          <w:insideH w:val="single" w:sz="6" w:space="0" w:color="D9D9D9"/>
+          <w:insideV w:val="single" w:sz="6" w:space="0" w:color="D9D9D9"/>
+        </w:tblBorders>
+      </w:tblPr>
+      <w:tblGrid>
+        <w:gridCol w:w="5162"/>
+        <w:gridCol w:w="5162"/>
+      </w:tblGrid>
+      <w:tr>
+        <w:tc>
+          <w:tcPr>
+            <w:tcW w:type="dxa" w:w="2736"/>
+            <w:tcMar>
+              <w:top w:w="70" w:type="dxa"/>
+              <w:start w:w="70" w:type="dxa"/>
+              <w:bottom w:w="70" w:type="dxa"/>
+              <w:end w:w="70" w:type="dxa"/>
+            </w:tcMar>
+            <w:shd w:fill="F7F9FB"/>
+            <w:vAlign w:val="center"/>
+          </w:tcPr>
+          <w:p>
+            <w:pPr>
+              <w:spacing w:after="20" w:line="245" w:lineRule="auto"/>
+              <w:jc w:val="center"/>
+            </w:pPr>
+            <w:r>
+              <w:drawing>
+                <wp:inline xmlns:a="http://schemas.openxmlformats.org/drawingml/2006/main" xmlns:pic="http://schemas.openxmlformats.org/drawingml/2006/picture">
+                  <wp:extent cx="1417320" cy="984078"/>
+                  <wp:docPr id="11" name="Picture 11"/>
+                  <wp:cNvGraphicFramePr>
+                    <a:graphicFrameLocks noChangeAspect="1"/>
+                  </wp:cNvGraphicFramePr>
+                  <a:graphic>
+                    <a:graphicData uri="http://schemas.openxmlformats.org/drawingml/2006/picture">
+                      <pic:pic>
+                        <pic:nvPicPr>
+                          <pic:cNvPr id="0" name="mpu6050.png"/>
+                          <pic:cNvPicPr/>
+                        </pic:nvPicPr>
+                        <pic:blipFill>
+                          <a:blip r:embed="rId19"/>
+                          <a:stretch>
+                            <a:fillRect/>
+                          </a:stretch>
+                        </pic:blipFill>
+                        <pic:spPr>
+                          <a:xfrm>
+                            <a:off x="0" y="0"/>
+                            <a:ext cx="1417320" cy="984078"/>
+                          </a:xfrm>
+                          <a:prstGeom prst="rect"/>
+                        </pic:spPr>
+                      </pic:pic>
+                    </a:graphicData>
+                  </a:graphic>
+                </wp:inline>
+              </w:drawing>
+            </w:r>
+          </w:p>
+        </w:tc>
+        <w:tc>
+          <w:tcPr>
+            <w:tcW w:type="dxa" w:w="7488"/>
+            <w:tcMar>
+              <w:top w:w="95" w:type="dxa"/>
+              <w:start w:w="95" w:type="dxa"/>
+              <w:bottom w:w="95" w:type="dxa"/>
+              <w:end w:w="95" w:type="dxa"/>
+            </w:tcMar>
+            <w:vAlign w:val="center"/>
+          </w:tcPr>
+          <w:p>
+            <w:pPr>
+              <w:spacing w:after="20" w:line="245" w:lineRule="auto"/>
+            </w:pPr>
+            <w:r>
+              <w:rPr>
+                <w:b/>
+                <w:sz w:val="16"/>
+              </w:rPr>
+              <w:t>Tilt and motion</w:t>
+            </w:r>
+          </w:p>
+          <w:p>
+            <w:pPr>
+              <w:spacing w:after="20" w:line="245" w:lineRule="auto"/>
+            </w:pPr>
+            <w:r>
+              <w:rPr>
+                <w:b/>
+                <w:sz w:val="16"/>
+              </w:rPr>
+              <w:t xml:space="preserve">Group: </w:t>
+            </w:r>
+            <w:r>
+              <w:rPr>
+                <w:sz w:val="16"/>
+              </w:rPr>
+              <w:t>Optional</w:t>
+            </w:r>
+          </w:p>
+          <w:p>
+            <w:pPr>
+              <w:spacing w:after="20" w:line="245" w:lineRule="auto"/>
+            </w:pPr>
+            <w:r>
+              <w:rPr>
+                <w:b/>
+                <w:sz w:val="16"/>
+              </w:rPr>
+              <w:t xml:space="preserve">Priority: </w:t>
+            </w:r>
+            <w:r>
+              <w:rPr>
+                <w:sz w:val="16"/>
+              </w:rPr>
+              <w:t>Optional event/security</w:t>
+            </w:r>
+          </w:p>
+          <w:p>
+            <w:pPr>
+              <w:spacing w:after="20" w:line="245" w:lineRule="auto"/>
+            </w:pPr>
+            <w:r>
+              <w:rPr>
+                <w:b/>
+                <w:sz w:val="16"/>
+              </w:rPr>
+              <w:t xml:space="preserve">Recommended item: </w:t>
+            </w:r>
+            <w:r>
+              <w:rPr>
+                <w:sz w:val="16"/>
+              </w:rPr>
+              <w:t>MPU6050 / GY-521 accelerometer and gyroscope module</w:t>
+            </w:r>
+          </w:p>
+          <w:p>
+            <w:pPr>
+              <w:spacing w:after="20" w:line="245" w:lineRule="auto"/>
+            </w:pPr>
+            <w:r>
+              <w:rPr>
+                <w:b/>
+                <w:sz w:val="16"/>
+              </w:rPr>
+              <w:t xml:space="preserve">Planning price: </w:t>
+            </w:r>
+            <w:r>
+              <w:rPr>
+                <w:sz w:val="16"/>
+              </w:rPr>
+              <w:t>PHP 92-223 typical</w:t>
+            </w:r>
+          </w:p>
+          <w:p>
+            <w:pPr>
+              <w:spacing w:after="20" w:line="245" w:lineRule="auto"/>
+            </w:pPr>
+            <w:r>
+              <w:rPr>
+                <w:b/>
+                <w:sz w:val="16"/>
+              </w:rPr>
+              <w:t xml:space="preserve">Buy from or verify at: </w:t>
+            </w:r>
+            <w:r>
+              <w:rPr>
+                <w:sz w:val="16"/>
+              </w:rPr>
+              <w:t>Lazada MPU6050 listings</w:t>
+            </w:r>
+          </w:p>
+          <w:p>
+            <w:pPr>
+              <w:spacing w:after="20" w:line="245" w:lineRule="auto"/>
+            </w:pPr>
+            <w:r>
+              <w:rPr>
+                <w:b/>
+                <w:sz w:val="16"/>
+              </w:rPr>
+              <w:t xml:space="preserve">Approval note: </w:t>
+            </w:r>
+            <w:r>
+              <w:rPr>
+                <w:sz w:val="16"/>
+              </w:rPr>
+              <w:t>Optional. Adds movement or tilt event trigger. It does not replace the water pressure sensor.</w:t>
+            </w:r>
+          </w:p>
+        </w:tc>
+      </w:tr>
+    </w:tbl>
+    <w:p>
+      <w:pPr>
+        <w:spacing w:after="20"/>
+      </w:pPr>
+    </w:p>
+    <w:tbl>
+      <w:tblPr>
+        <w:tblW w:type="auto" w:w="0"/>
+        <w:jc w:val="center"/>
+        <w:tblLayout w:type="fixed"/>
+        <w:tblLook w:firstColumn="1" w:firstRow="1" w:lastColumn="0" w:lastRow="0" w:noHBand="0" w:noVBand="1" w:val="04A0"/>
+        <w:tblBorders>
+          <w:top w:val="single" w:sz="6" w:space="0" w:color="D9D9D9"/>
+          <w:left w:val="single" w:sz="6" w:space="0" w:color="D9D9D9"/>
+          <w:bottom w:val="single" w:sz="6" w:space="0" w:color="D9D9D9"/>
+          <w:right w:val="single" w:sz="6" w:space="0" w:color="D9D9D9"/>
+          <w:insideH w:val="single" w:sz="6" w:space="0" w:color="D9D9D9"/>
+          <w:insideV w:val="single" w:sz="6" w:space="0" w:color="D9D9D9"/>
+        </w:tblBorders>
+      </w:tblPr>
+      <w:tblGrid>
+        <w:gridCol w:w="5162"/>
+        <w:gridCol w:w="5162"/>
+      </w:tblGrid>
+      <w:tr>
+        <w:tc>
+          <w:tcPr>
+            <w:tcW w:type="dxa" w:w="2736"/>
+            <w:tcMar>
+              <w:top w:w="70" w:type="dxa"/>
+              <w:start w:w="70" w:type="dxa"/>
+              <w:bottom w:w="70" w:type="dxa"/>
+              <w:end w:w="70" w:type="dxa"/>
+            </w:tcMar>
+            <w:shd w:fill="F7F9FB"/>
+            <w:vAlign w:val="center"/>
+          </w:tcPr>
+          <w:p>
+            <w:pPr>
+              <w:spacing w:after="20" w:line="245" w:lineRule="auto"/>
+              <w:jc w:val="center"/>
+            </w:pPr>
+            <w:r>
+              <w:drawing>
+                <wp:inline xmlns:a="http://schemas.openxmlformats.org/drawingml/2006/main" xmlns:pic="http://schemas.openxmlformats.org/drawingml/2006/picture">
+                  <wp:extent cx="1417320" cy="984078"/>
+                  <wp:docPr id="12" name="Picture 12"/>
+                  <wp:cNvGraphicFramePr>
+                    <a:graphicFrameLocks noChangeAspect="1"/>
+                  </wp:cNvGraphicFramePr>
+                  <a:graphic>
+                    <a:graphicData uri="http://schemas.openxmlformats.org/drawingml/2006/picture">
+                      <pic:pic>
+                        <pic:nvPicPr>
+                          <pic:cNvPr id="0" name="sw420.png"/>
+                          <pic:cNvPicPr/>
+                        </pic:nvPicPr>
+                        <pic:blipFill>
+                          <a:blip r:embed="rId20"/>
+                          <a:stretch>
+                            <a:fillRect/>
+                          </a:stretch>
+                        </pic:blipFill>
+                        <pic:spPr>
+                          <a:xfrm>
+                            <a:off x="0" y="0"/>
+                            <a:ext cx="1417320" cy="984078"/>
+                          </a:xfrm>
+                          <a:prstGeom prst="rect"/>
+                        </pic:spPr>
+                      </pic:pic>
+                    </a:graphicData>
+                  </a:graphic>
+                </wp:inline>
+              </w:drawing>
+            </w:r>
+          </w:p>
+        </w:tc>
+        <w:tc>
+          <w:tcPr>
+            <w:tcW w:type="dxa" w:w="7488"/>
+            <w:tcMar>
+              <w:top w:w="95" w:type="dxa"/>
+              <w:start w:w="95" w:type="dxa"/>
+              <w:bottom w:w="95" w:type="dxa"/>
+              <w:end w:w="95" w:type="dxa"/>
+            </w:tcMar>
+            <w:vAlign w:val="center"/>
+          </w:tcPr>
+          <w:p>
+            <w:pPr>
+              <w:spacing w:after="20" w:line="245" w:lineRule="auto"/>
+            </w:pPr>
+            <w:r>
+              <w:rPr>
+                <w:b/>
+                <w:sz w:val="16"/>
+              </w:rPr>
+              <w:t>Vibration and tamper</w:t>
+            </w:r>
+          </w:p>
+          <w:p>
+            <w:pPr>
+              <w:spacing w:after="20" w:line="245" w:lineRule="auto"/>
+            </w:pPr>
+            <w:r>
+              <w:rPr>
+                <w:b/>
+                <w:sz w:val="16"/>
+              </w:rPr>
+              <w:t xml:space="preserve">Group: </w:t>
+            </w:r>
+            <w:r>
+              <w:rPr>
+                <w:sz w:val="16"/>
+              </w:rPr>
+              <w:t>Optional</w:t>
+            </w:r>
+          </w:p>
+          <w:p>
+            <w:pPr>
+              <w:spacing w:after="20" w:line="245" w:lineRule="auto"/>
+            </w:pPr>
+            <w:r>
+              <w:rPr>
+                <w:b/>
+                <w:sz w:val="16"/>
+              </w:rPr>
+              <w:t xml:space="preserve">Priority: </w:t>
+            </w:r>
+            <w:r>
+              <w:rPr>
+                <w:sz w:val="16"/>
+              </w:rPr>
+              <w:t>Optional event/security</w:t>
+            </w:r>
+          </w:p>
+          <w:p>
+            <w:pPr>
+              <w:spacing w:after="20" w:line="245" w:lineRule="auto"/>
+            </w:pPr>
+            <w:r>
+              <w:rPr>
+                <w:b/>
+                <w:sz w:val="16"/>
+              </w:rPr>
+              <w:t xml:space="preserve">Recommended item: </w:t>
+            </w:r>
+            <w:r>
+              <w:rPr>
+                <w:sz w:val="16"/>
+              </w:rPr>
+              <w:t>SW-420 vibration sensor module</w:t>
+            </w:r>
+          </w:p>
+          <w:p>
+            <w:pPr>
+              <w:spacing w:after="20" w:line="245" w:lineRule="auto"/>
+            </w:pPr>
+            <w:r>
+              <w:rPr>
+                <w:b/>
+                <w:sz w:val="16"/>
+              </w:rPr>
+              <w:t xml:space="preserve">Planning price: </w:t>
+            </w:r>
+            <w:r>
+              <w:rPr>
+                <w:sz w:val="16"/>
+              </w:rPr>
+              <w:t>PHP 45-70 typical</w:t>
+            </w:r>
+          </w:p>
+          <w:p>
+            <w:pPr>
+              <w:spacing w:after="20" w:line="245" w:lineRule="auto"/>
+            </w:pPr>
+            <w:r>
+              <w:rPr>
+                <w:b/>
+                <w:sz w:val="16"/>
+              </w:rPr>
+              <w:t xml:space="preserve">Buy from or verify at: </w:t>
+            </w:r>
+            <w:r>
+              <w:rPr>
+                <w:sz w:val="16"/>
+              </w:rPr>
+              <w:t>e-Gizmo, MakerLab, Lazada sensor module tag results</w:t>
+            </w:r>
+          </w:p>
+          <w:p>
+            <w:pPr>
+              <w:spacing w:after="20" w:line="245" w:lineRule="auto"/>
+            </w:pPr>
+            <w:r>
+              <w:rPr>
+                <w:b/>
+                <w:sz w:val="16"/>
+              </w:rPr>
+              <w:t xml:space="preserve">Approval note: </w:t>
+            </w:r>
+            <w:r>
+              <w:rPr>
+                <w:sz w:val="16"/>
+              </w:rPr>
+              <w:t>Optional. Good for enclosure hit or tamper trigger; not reliable as wave measurement.</w:t>
+            </w:r>
+          </w:p>
+        </w:tc>
+      </w:tr>
+    </w:tbl>
+    <w:p>
+      <w:pPr>
+        <w:spacing w:after="20"/>
+      </w:pPr>
+    </w:p>
+    <w:tbl>
+      <w:tblPr>
+        <w:tblW w:type="auto" w:w="0"/>
+        <w:jc w:val="center"/>
+        <w:tblLayout w:type="fixed"/>
+        <w:tblLook w:firstColumn="1" w:firstRow="1" w:lastColumn="0" w:lastRow="0" w:noHBand="0" w:noVBand="1" w:val="04A0"/>
+        <w:tblBorders>
+          <w:top w:val="single" w:sz="6" w:space="0" w:color="D9D9D9"/>
+          <w:left w:val="single" w:sz="6" w:space="0" w:color="D9D9D9"/>
+          <w:bottom w:val="single" w:sz="6" w:space="0" w:color="D9D9D9"/>
+          <w:right w:val="single" w:sz="6" w:space="0" w:color="D9D9D9"/>
+          <w:insideH w:val="single" w:sz="6" w:space="0" w:color="D9D9D9"/>
+          <w:insideV w:val="single" w:sz="6" w:space="0" w:color="D9D9D9"/>
+        </w:tblBorders>
+      </w:tblPr>
+      <w:tblGrid>
+        <w:gridCol w:w="5162"/>
+        <w:gridCol w:w="5162"/>
+      </w:tblGrid>
+      <w:tr>
+        <w:tc>
+          <w:tcPr>
+            <w:tcW w:type="dxa" w:w="2736"/>
+            <w:tcMar>
+              <w:top w:w="70" w:type="dxa"/>
+              <w:start w:w="70" w:type="dxa"/>
+              <w:bottom w:w="70" w:type="dxa"/>
+              <w:end w:w="70" w:type="dxa"/>
+            </w:tcMar>
+            <w:shd w:fill="F7F9FB"/>
+            <w:vAlign w:val="center"/>
+          </w:tcPr>
+          <w:p>
+            <w:pPr>
+              <w:spacing w:after="20" w:line="245" w:lineRule="auto"/>
+              <w:jc w:val="center"/>
+            </w:pPr>
+            <w:r>
+              <w:drawing>
+                <wp:inline xmlns:a="http://schemas.openxmlformats.org/drawingml/2006/main" xmlns:pic="http://schemas.openxmlformats.org/drawingml/2006/picture">
+                  <wp:extent cx="1417320" cy="984078"/>
+                  <wp:docPr id="13" name="Picture 13"/>
+                  <wp:cNvGraphicFramePr>
+                    <a:graphicFrameLocks noChangeAspect="1"/>
+                  </wp:cNvGraphicFramePr>
+                  <a:graphic>
+                    <a:graphicData uri="http://schemas.openxmlformats.org/drawingml/2006/picture">
+                      <pic:pic>
+                        <pic:nvPicPr>
+                          <pic:cNvPr id="0" name="reed.png"/>
+                          <pic:cNvPicPr/>
+                        </pic:nvPicPr>
+                        <pic:blipFill>
+                          <a:blip r:embed="rId21"/>
+                          <a:stretch>
+                            <a:fillRect/>
+                          </a:stretch>
+                        </pic:blipFill>
+                        <pic:spPr>
+                          <a:xfrm>
+                            <a:off x="0" y="0"/>
+                            <a:ext cx="1417320" cy="984078"/>
+                          </a:xfrm>
+                          <a:prstGeom prst="rect"/>
+                        </pic:spPr>
+                      </pic:pic>
+                    </a:graphicData>
+                  </a:graphic>
+                </wp:inline>
+              </w:drawing>
+            </w:r>
+          </w:p>
+        </w:tc>
+        <w:tc>
+          <w:tcPr>
+            <w:tcW w:type="dxa" w:w="7488"/>
+            <w:tcMar>
+              <w:top w:w="95" w:type="dxa"/>
+              <w:start w:w="95" w:type="dxa"/>
+              <w:bottom w:w="95" w:type="dxa"/>
+              <w:end w:w="95" w:type="dxa"/>
+            </w:tcMar>
+            <w:vAlign w:val="center"/>
+          </w:tcPr>
+          <w:p>
+            <w:pPr>
+              <w:spacing w:after="20" w:line="245" w:lineRule="auto"/>
+            </w:pPr>
+            <w:r>
+              <w:rPr>
+                <w:b/>
+                <w:sz w:val="16"/>
+              </w:rPr>
+              <w:t>Lid-open tamper</w:t>
+            </w:r>
+          </w:p>
+          <w:p>
+            <w:pPr>
+              <w:spacing w:after="20" w:line="245" w:lineRule="auto"/>
+            </w:pPr>
+            <w:r>
+              <w:rPr>
+                <w:b/>
+                <w:sz w:val="16"/>
+              </w:rPr>
+              <w:t xml:space="preserve">Group: </w:t>
+            </w:r>
+            <w:r>
+              <w:rPr>
+                <w:sz w:val="16"/>
+              </w:rPr>
+              <w:t>Optional</w:t>
+            </w:r>
+          </w:p>
+          <w:p>
+            <w:pPr>
+              <w:spacing w:after="20" w:line="245" w:lineRule="auto"/>
+            </w:pPr>
+            <w:r>
+              <w:rPr>
+                <w:b/>
+                <w:sz w:val="16"/>
+              </w:rPr>
+              <w:t xml:space="preserve">Priority: </w:t>
+            </w:r>
+            <w:r>
+              <w:rPr>
+                <w:sz w:val="16"/>
+              </w:rPr>
+              <w:t>Optional event/security</w:t>
+            </w:r>
+          </w:p>
+          <w:p>
+            <w:pPr>
+              <w:spacing w:after="20" w:line="245" w:lineRule="auto"/>
+            </w:pPr>
+            <w:r>
+              <w:rPr>
+                <w:b/>
+                <w:sz w:val="16"/>
+              </w:rPr>
+              <w:t xml:space="preserve">Recommended item: </w:t>
+            </w:r>
+            <w:r>
+              <w:rPr>
+                <w:sz w:val="16"/>
+              </w:rPr>
+              <w:t>Reed switch or magnetic switch module</w:t>
+            </w:r>
+          </w:p>
+          <w:p>
+            <w:pPr>
+              <w:spacing w:after="20" w:line="245" w:lineRule="auto"/>
+            </w:pPr>
+            <w:r>
+              <w:rPr>
+                <w:b/>
+                <w:sz w:val="16"/>
+              </w:rPr>
+              <w:t xml:space="preserve">Planning price: </w:t>
+            </w:r>
+            <w:r>
+              <w:rPr>
+                <w:sz w:val="16"/>
+              </w:rPr>
+              <w:t>PHP 70-309 depending style</w:t>
+            </w:r>
+          </w:p>
+          <w:p>
+            <w:pPr>
+              <w:spacing w:after="20" w:line="245" w:lineRule="auto"/>
+            </w:pPr>
+            <w:r>
+              <w:rPr>
+                <w:b/>
+                <w:sz w:val="16"/>
+              </w:rPr>
+              <w:t xml:space="preserve">Buy from or verify at: </w:t>
+            </w:r>
+            <w:r>
+              <w:rPr>
+                <w:sz w:val="16"/>
+              </w:rPr>
+              <w:t>Lazada magnetic switch; local hobby electronics reed switch modules</w:t>
+            </w:r>
+          </w:p>
+          <w:p>
+            <w:pPr>
+              <w:spacing w:after="20" w:line="245" w:lineRule="auto"/>
+            </w:pPr>
+            <w:r>
+              <w:rPr>
+                <w:b/>
+                <w:sz w:val="16"/>
+              </w:rPr>
+              <w:t xml:space="preserve">Approval note: </w:t>
+            </w:r>
+            <w:r>
+              <w:rPr>
+                <w:sz w:val="16"/>
+              </w:rPr>
+              <w:t>Optional. Good for detecting if the enclosure is opened during field display or validation.</w:t>
+            </w:r>
+          </w:p>
+        </w:tc>
+      </w:tr>
+    </w:tbl>
+    <w:p>
+      <w:pPr>
+        <w:spacing w:after="20"/>
+      </w:pPr>
+    </w:p>
+    <w:p>
+      <w:pPr>
+        <w:spacing w:after="20"/>
       </w:pPr>
     </w:p>
     <w:p>
@@ -2467,22 +3284,22 @@
             <w:tcW w:type="dxa" w:w="1800"/>
             <w:shd w:fill="1F4E5F"/>
             <w:tcMar>
-              <w:top w:w="80" w:type="dxa"/>
-              <w:start w:w="80" w:type="dxa"/>
-              <w:bottom w:w="80" w:type="dxa"/>
-              <w:end w:w="80" w:type="dxa"/>
+              <w:top w:w="70" w:type="dxa"/>
+              <w:start w:w="70" w:type="dxa"/>
+              <w:bottom w:w="70" w:type="dxa"/>
+              <w:end w:w="70" w:type="dxa"/>
             </w:tcMar>
             <w:vAlign w:val="center"/>
           </w:tcPr>
           <w:p>
             <w:pPr>
-              <w:spacing w:after="20" w:line="252" w:lineRule="auto"/>
+              <w:spacing w:after="20" w:line="245" w:lineRule="auto"/>
             </w:pPr>
             <w:r>
               <w:rPr>
                 <w:b/>
                 <w:color w:val="FFFFFF"/>
-                <w:sz w:val="16"/>
+                <w:sz w:val="15"/>
               </w:rPr>
               <w:t>Channel</w:t>
             </w:r>
@@ -2493,22 +3310,22 @@
             <w:tcW w:type="dxa" w:w="2880"/>
             <w:shd w:fill="1F4E5F"/>
             <w:tcMar>
-              <w:top w:w="80" w:type="dxa"/>
-              <w:start w:w="80" w:type="dxa"/>
-              <w:bottom w:w="80" w:type="dxa"/>
-              <w:end w:w="80" w:type="dxa"/>
+              <w:top w:w="70" w:type="dxa"/>
+              <w:start w:w="70" w:type="dxa"/>
+              <w:bottom w:w="70" w:type="dxa"/>
+              <w:end w:w="70" w:type="dxa"/>
             </w:tcMar>
             <w:vAlign w:val="center"/>
           </w:tcPr>
           <w:p>
             <w:pPr>
-              <w:spacing w:after="20" w:line="252" w:lineRule="auto"/>
+              <w:spacing w:after="20" w:line="245" w:lineRule="auto"/>
             </w:pPr>
             <w:r>
               <w:rPr>
                 <w:b/>
                 <w:color w:val="FFFFFF"/>
-                <w:sz w:val="16"/>
+                <w:sz w:val="15"/>
               </w:rPr>
               <w:t>Lower cost option</w:t>
             </w:r>
@@ -2519,22 +3336,22 @@
             <w:tcW w:type="dxa" w:w="3168"/>
             <w:shd w:fill="1F4E5F"/>
             <w:tcMar>
-              <w:top w:w="80" w:type="dxa"/>
-              <w:start w:w="80" w:type="dxa"/>
-              <w:bottom w:w="80" w:type="dxa"/>
-              <w:end w:w="80" w:type="dxa"/>
+              <w:top w:w="70" w:type="dxa"/>
+              <w:start w:w="70" w:type="dxa"/>
+              <w:bottom w:w="70" w:type="dxa"/>
+              <w:end w:w="70" w:type="dxa"/>
             </w:tcMar>
             <w:vAlign w:val="center"/>
           </w:tcPr>
           <w:p>
             <w:pPr>
-              <w:spacing w:after="20" w:line="252" w:lineRule="auto"/>
+              <w:spacing w:after="20" w:line="245" w:lineRule="auto"/>
             </w:pPr>
             <w:r>
               <w:rPr>
                 <w:b/>
                 <w:color w:val="FFFFFF"/>
-                <w:sz w:val="16"/>
+                <w:sz w:val="15"/>
               </w:rPr>
               <w:t>Better or safer option</w:t>
             </w:r>
@@ -2545,22 +3362,22 @@
             <w:tcW w:type="dxa" w:w="3311"/>
             <w:shd w:fill="1F4E5F"/>
             <w:tcMar>
-              <w:top w:w="80" w:type="dxa"/>
-              <w:start w:w="80" w:type="dxa"/>
-              <w:bottom w:w="80" w:type="dxa"/>
-              <w:end w:w="80" w:type="dxa"/>
+              <w:top w:w="70" w:type="dxa"/>
+              <w:start w:w="70" w:type="dxa"/>
+              <w:bottom w:w="70" w:type="dxa"/>
+              <w:end w:w="70" w:type="dxa"/>
             </w:tcMar>
             <w:vAlign w:val="center"/>
           </w:tcPr>
           <w:p>
             <w:pPr>
-              <w:spacing w:after="20" w:line="252" w:lineRule="auto"/>
+              <w:spacing w:after="20" w:line="245" w:lineRule="auto"/>
             </w:pPr>
             <w:r>
               <w:rPr>
                 <w:b/>
                 <w:color w:val="FFFFFF"/>
-                <w:sz w:val="16"/>
+                <w:sz w:val="15"/>
               </w:rPr>
               <w:t>Do not approve as replacement</w:t>
             </w:r>
@@ -2572,21 +3389,21 @@
           <w:tcPr>
             <w:tcW w:type="dxa" w:w="1800"/>
             <w:tcMar>
-              <w:top w:w="75" w:type="dxa"/>
-              <w:start w:w="75" w:type="dxa"/>
-              <w:bottom w:w="75" w:type="dxa"/>
-              <w:end w:w="75" w:type="dxa"/>
+              <w:top w:w="65" w:type="dxa"/>
+              <w:start w:w="65" w:type="dxa"/>
+              <w:bottom w:w="65" w:type="dxa"/>
+              <w:end w:w="65" w:type="dxa"/>
             </w:tcMar>
             <w:vAlign w:val="center"/>
             <w:shd w:fill="F5F8FA"/>
           </w:tcPr>
           <w:p>
             <w:pPr>
-              <w:spacing w:after="20" w:line="252" w:lineRule="auto"/>
+              <w:spacing w:after="20" w:line="245" w:lineRule="auto"/>
             </w:pPr>
             <w:r>
               <w:rPr>
-                <w:sz w:val="15"/>
+                <w:sz w:val="14"/>
               </w:rPr>
               <w:t>Water pressure</w:t>
             </w:r>
@@ -2596,21 +3413,21 @@
           <w:tcPr>
             <w:tcW w:type="dxa" w:w="2880"/>
             <w:tcMar>
-              <w:top w:w="75" w:type="dxa"/>
-              <w:start w:w="75" w:type="dxa"/>
-              <w:bottom w:w="75" w:type="dxa"/>
-              <w:end w:w="75" w:type="dxa"/>
+              <w:top w:w="65" w:type="dxa"/>
+              <w:start w:w="65" w:type="dxa"/>
+              <w:bottom w:w="65" w:type="dxa"/>
+              <w:end w:w="65" w:type="dxa"/>
             </w:tcMar>
             <w:vAlign w:val="center"/>
             <w:shd w:fill="F5F8FA"/>
           </w:tcPr>
           <w:p>
             <w:pPr>
-              <w:spacing w:after="20" w:line="252" w:lineRule="auto"/>
+              <w:spacing w:after="20" w:line="245" w:lineRule="auto"/>
             </w:pPr>
             <w:r>
               <w:rPr>
-                <w:sz w:val="15"/>
+                <w:sz w:val="14"/>
               </w:rPr>
               <w:t>Generic low-range 4-20 mA hydrostatic transmitter</w:t>
             </w:r>
@@ -2620,21 +3437,21 @@
           <w:tcPr>
             <w:tcW w:type="dxa" w:w="3168"/>
             <w:tcMar>
-              <w:top w:w="75" w:type="dxa"/>
-              <w:start w:w="75" w:type="dxa"/>
-              <w:bottom w:w="75" w:type="dxa"/>
-              <w:end w:w="75" w:type="dxa"/>
+              <w:top w:w="65" w:type="dxa"/>
+              <w:start w:w="65" w:type="dxa"/>
+              <w:bottom w:w="65" w:type="dxa"/>
+              <w:end w:w="65" w:type="dxa"/>
             </w:tcMar>
             <w:vAlign w:val="center"/>
             <w:shd w:fill="F5F8FA"/>
           </w:tcPr>
           <w:p>
             <w:pPr>
-              <w:spacing w:after="20" w:line="252" w:lineRule="auto"/>
+              <w:spacing w:after="20" w:line="245" w:lineRule="auto"/>
             </w:pPr>
             <w:r>
               <w:rPr>
-                <w:sz w:val="15"/>
+                <w:sz w:val="14"/>
               </w:rPr>
               <w:t>Holykell HPT604 Type A or equivalent quoted industrial unit; RS485 Modbus if cable noise becomes a problem</w:t>
             </w:r>
@@ -2644,21 +3461,21 @@
           <w:tcPr>
             <w:tcW w:type="dxa" w:w="3311"/>
             <w:tcMar>
-              <w:top w:w="75" w:type="dxa"/>
-              <w:start w:w="75" w:type="dxa"/>
-              <w:bottom w:w="75" w:type="dxa"/>
-              <w:end w:w="75" w:type="dxa"/>
+              <w:top w:w="65" w:type="dxa"/>
+              <w:start w:w="65" w:type="dxa"/>
+              <w:bottom w:w="65" w:type="dxa"/>
+              <w:end w:w="65" w:type="dxa"/>
             </w:tcMar>
             <w:vAlign w:val="center"/>
             <w:shd w:fill="F5F8FA"/>
           </w:tcPr>
           <w:p>
             <w:pPr>
-              <w:spacing w:after="20" w:line="252" w:lineRule="auto"/>
+              <w:spacing w:after="20" w:line="245" w:lineRule="auto"/>
             </w:pPr>
             <w:r>
               <w:rPr>
-                <w:sz w:val="15"/>
+                <w:sz w:val="14"/>
               </w:rPr>
               <w:t>Float switch, rain sensor, HC-SR04 ultrasonic sensor, automotive oil or fuel pressure sensor</w:t>
             </w:r>
@@ -2670,20 +3487,20 @@
           <w:tcPr>
             <w:tcW w:type="dxa" w:w="1800"/>
             <w:tcMar>
-              <w:top w:w="75" w:type="dxa"/>
-              <w:start w:w="75" w:type="dxa"/>
-              <w:bottom w:w="75" w:type="dxa"/>
-              <w:end w:w="75" w:type="dxa"/>
+              <w:top w:w="65" w:type="dxa"/>
+              <w:start w:w="65" w:type="dxa"/>
+              <w:bottom w:w="65" w:type="dxa"/>
+              <w:end w:w="65" w:type="dxa"/>
             </w:tcMar>
             <w:vAlign w:val="center"/>
           </w:tcPr>
           <w:p>
             <w:pPr>
-              <w:spacing w:after="20" w:line="252" w:lineRule="auto"/>
+              <w:spacing w:after="20" w:line="245" w:lineRule="auto"/>
             </w:pPr>
             <w:r>
               <w:rPr>
-                <w:sz w:val="15"/>
+                <w:sz w:val="14"/>
               </w:rPr>
               <w:t>Wind</w:t>
             </w:r>
@@ -2693,20 +3510,20 @@
           <w:tcPr>
             <w:tcW w:type="dxa" w:w="2880"/>
             <w:tcMar>
-              <w:top w:w="75" w:type="dxa"/>
-              <w:start w:w="75" w:type="dxa"/>
-              <w:bottom w:w="75" w:type="dxa"/>
-              <w:end w:w="75" w:type="dxa"/>
+              <w:top w:w="65" w:type="dxa"/>
+              <w:start w:w="65" w:type="dxa"/>
+              <w:bottom w:w="65" w:type="dxa"/>
+              <w:end w:w="65" w:type="dxa"/>
             </w:tcMar>
             <w:vAlign w:val="center"/>
           </w:tcPr>
           <w:p>
             <w:pPr>
-              <w:spacing w:after="20" w:line="252" w:lineRule="auto"/>
+              <w:spacing w:after="20" w:line="245" w:lineRule="auto"/>
             </w:pPr>
             <w:r>
               <w:rPr>
-                <w:sz w:val="15"/>
+                <w:sz w:val="14"/>
               </w:rPr>
               <w:t>Low-cost combined cup sensor and vane</w:t>
             </w:r>
@@ -2716,20 +3533,20 @@
           <w:tcPr>
             <w:tcW w:type="dxa" w:w="3168"/>
             <w:tcMar>
-              <w:top w:w="75" w:type="dxa"/>
-              <w:start w:w="75" w:type="dxa"/>
-              <w:bottom w:w="75" w:type="dxa"/>
-              <w:end w:w="75" w:type="dxa"/>
+              <w:top w:w="65" w:type="dxa"/>
+              <w:start w:w="65" w:type="dxa"/>
+              <w:bottom w:w="65" w:type="dxa"/>
+              <w:end w:w="65" w:type="dxa"/>
             </w:tcMar>
             <w:vAlign w:val="center"/>
           </w:tcPr>
           <w:p>
             <w:pPr>
-              <w:spacing w:after="20" w:line="252" w:lineRule="auto"/>
+              <w:spacing w:after="20" w:line="245" w:lineRule="auto"/>
             </w:pPr>
             <w:r>
               <w:rPr>
-                <w:sz w:val="15"/>
+                <w:sz w:val="14"/>
               </w:rPr>
               <w:t>Industrial RS485 combined sensor with IP65 or IP66 housing</w:t>
             </w:r>
@@ -2739,20 +3556,20 @@
           <w:tcPr>
             <w:tcW w:type="dxa" w:w="3311"/>
             <w:tcMar>
-              <w:top w:w="75" w:type="dxa"/>
-              <w:start w:w="75" w:type="dxa"/>
-              <w:bottom w:w="75" w:type="dxa"/>
-              <w:end w:w="75" w:type="dxa"/>
+              <w:top w:w="65" w:type="dxa"/>
+              <w:start w:w="65" w:type="dxa"/>
+              <w:bottom w:w="65" w:type="dxa"/>
+              <w:end w:w="65" w:type="dxa"/>
             </w:tcMar>
             <w:vAlign w:val="center"/>
           </w:tcPr>
           <w:p>
             <w:pPr>
-              <w:spacing w:after="20" w:line="252" w:lineRule="auto"/>
+              <w:spacing w:after="20" w:line="245" w:lineRule="auto"/>
             </w:pPr>
             <w:r>
               <w:rPr>
-                <w:sz w:val="15"/>
+                <w:sz w:val="14"/>
               </w:rPr>
               <w:t>Handheld anemometer or toy wind vane as final installed sensor</w:t>
             </w:r>
@@ -2764,23 +3581,23 @@
           <w:tcPr>
             <w:tcW w:type="dxa" w:w="1800"/>
             <w:tcMar>
-              <w:top w:w="75" w:type="dxa"/>
-              <w:start w:w="75" w:type="dxa"/>
-              <w:bottom w:w="75" w:type="dxa"/>
-              <w:end w:w="75" w:type="dxa"/>
+              <w:top w:w="65" w:type="dxa"/>
+              <w:start w:w="65" w:type="dxa"/>
+              <w:bottom w:w="65" w:type="dxa"/>
+              <w:end w:w="65" w:type="dxa"/>
             </w:tcMar>
             <w:vAlign w:val="center"/>
             <w:shd w:fill="F5F8FA"/>
           </w:tcPr>
           <w:p>
             <w:pPr>
-              <w:spacing w:after="20" w:line="252" w:lineRule="auto"/>
+              <w:spacing w:after="20" w:line="245" w:lineRule="auto"/>
             </w:pPr>
             <w:r>
               <w:rPr>
-                <w:sz w:val="15"/>
+                <w:sz w:val="14"/>
               </w:rPr>
-              <w:t>GPS</w:t>
+              <w:t>Power</w:t>
             </w:r>
           </w:p>
         </w:tc>
@@ -2788,23 +3605,23 @@
           <w:tcPr>
             <w:tcW w:type="dxa" w:w="2880"/>
             <w:tcMar>
-              <w:top w:w="75" w:type="dxa"/>
-              <w:start w:w="75" w:type="dxa"/>
-              <w:bottom w:w="75" w:type="dxa"/>
-              <w:end w:w="75" w:type="dxa"/>
+              <w:top w:w="65" w:type="dxa"/>
+              <w:start w:w="65" w:type="dxa"/>
+              <w:bottom w:w="65" w:type="dxa"/>
+              <w:end w:w="65" w:type="dxa"/>
             </w:tcMar>
             <w:vAlign w:val="center"/>
             <w:shd w:fill="F5F8FA"/>
           </w:tcPr>
           <w:p>
             <w:pPr>
-              <w:spacing w:after="20" w:line="252" w:lineRule="auto"/>
+              <w:spacing w:after="20" w:line="245" w:lineRule="auto"/>
             </w:pPr>
             <w:r>
               <w:rPr>
-                <w:sz w:val="15"/>
+                <w:sz w:val="14"/>
               </w:rPr>
-              <w:t>NEO-6M</w:t>
+              <w:t>Protected 18650 pack for bench validation</w:t>
             </w:r>
           </w:p>
         </w:tc>
@@ -2812,23 +3629,23 @@
           <w:tcPr>
             <w:tcW w:type="dxa" w:w="3168"/>
             <w:tcMar>
-              <w:top w:w="75" w:type="dxa"/>
-              <w:start w:w="75" w:type="dxa"/>
-              <w:bottom w:w="75" w:type="dxa"/>
-              <w:end w:w="75" w:type="dxa"/>
+              <w:top w:w="65" w:type="dxa"/>
+              <w:start w:w="65" w:type="dxa"/>
+              <w:bottom w:w="65" w:type="dxa"/>
+              <w:end w:w="65" w:type="dxa"/>
             </w:tcMar>
             <w:vAlign w:val="center"/>
             <w:shd w:fill="F5F8FA"/>
           </w:tcPr>
           <w:p>
             <w:pPr>
-              <w:spacing w:after="20" w:line="252" w:lineRule="auto"/>
+              <w:spacing w:after="20" w:line="245" w:lineRule="auto"/>
             </w:pPr>
             <w:r>
               <w:rPr>
-                <w:sz w:val="15"/>
+                <w:sz w:val="14"/>
               </w:rPr>
-              <w:t>NEO-M8N or GNSS board with better antenna; LTE module GNSS as backup</w:t>
+              <w:t>12 V LiFePO4 pack with BMS and measured capacity</w:t>
             </w:r>
           </w:p>
         </w:tc>
@@ -2836,23 +3653,23 @@
           <w:tcPr>
             <w:tcW w:type="dxa" w:w="3311"/>
             <w:tcMar>
-              <w:top w:w="75" w:type="dxa"/>
-              <w:start w:w="75" w:type="dxa"/>
-              <w:bottom w:w="75" w:type="dxa"/>
-              <w:end w:w="75" w:type="dxa"/>
+              <w:top w:w="65" w:type="dxa"/>
+              <w:start w:w="65" w:type="dxa"/>
+              <w:bottom w:w="65" w:type="dxa"/>
+              <w:end w:w="65" w:type="dxa"/>
             </w:tcMar>
             <w:vAlign w:val="center"/>
             <w:shd w:fill="F5F8FA"/>
           </w:tcPr>
           <w:p>
             <w:pPr>
-              <w:spacing w:after="20" w:line="252" w:lineRule="auto"/>
+              <w:spacing w:after="20" w:line="245" w:lineRule="auto"/>
             </w:pPr>
             <w:r>
               <w:rPr>
-                <w:sz w:val="15"/>
+                <w:sz w:val="14"/>
               </w:rPr>
-              <w:t>Phone GPS as final buoy position record</w:t>
+              <w:t>Loose cells with no BMS, no fuse, or no waterproof enclosure</w:t>
             </w:r>
           </w:p>
         </w:tc>
@@ -2862,22 +3679,22 @@
           <w:tcPr>
             <w:tcW w:type="dxa" w:w="1800"/>
             <w:tcMar>
-              <w:top w:w="75" w:type="dxa"/>
-              <w:start w:w="75" w:type="dxa"/>
-              <w:bottom w:w="75" w:type="dxa"/>
-              <w:end w:w="75" w:type="dxa"/>
+              <w:top w:w="65" w:type="dxa"/>
+              <w:start w:w="65" w:type="dxa"/>
+              <w:bottom w:w="65" w:type="dxa"/>
+              <w:end w:w="65" w:type="dxa"/>
             </w:tcMar>
             <w:vAlign w:val="center"/>
           </w:tcPr>
           <w:p>
             <w:pPr>
-              <w:spacing w:after="20" w:line="252" w:lineRule="auto"/>
+              <w:spacing w:after="20" w:line="245" w:lineRule="auto"/>
             </w:pPr>
             <w:r>
               <w:rPr>
-                <w:sz w:val="15"/>
+                <w:sz w:val="14"/>
               </w:rPr>
-              <w:t>Power monitor</w:t>
+              <w:t>Solar charging</w:t>
             </w:r>
           </w:p>
         </w:tc>
@@ -2885,22 +3702,22 @@
           <w:tcPr>
             <w:tcW w:type="dxa" w:w="2880"/>
             <w:tcMar>
-              <w:top w:w="75" w:type="dxa"/>
-              <w:start w:w="75" w:type="dxa"/>
-              <w:bottom w:w="75" w:type="dxa"/>
-              <w:end w:w="75" w:type="dxa"/>
+              <w:top w:w="65" w:type="dxa"/>
+              <w:start w:w="65" w:type="dxa"/>
+              <w:bottom w:w="65" w:type="dxa"/>
+              <w:end w:w="65" w:type="dxa"/>
             </w:tcMar>
             <w:vAlign w:val="center"/>
           </w:tcPr>
           <w:p>
             <w:pPr>
-              <w:spacing w:after="20" w:line="252" w:lineRule="auto"/>
+              <w:spacing w:after="20" w:line="245" w:lineRule="auto"/>
             </w:pPr>
             <w:r>
               <w:rPr>
-                <w:sz w:val="15"/>
+                <w:sz w:val="14"/>
               </w:rPr>
-              <w:t>INA219</w:t>
+              <w:t>Small PWM controller for 12 V battery tests</w:t>
             </w:r>
           </w:p>
         </w:tc>
@@ -2908,22 +3725,22 @@
           <w:tcPr>
             <w:tcW w:type="dxa" w:w="3168"/>
             <w:tcMar>
-              <w:top w:w="75" w:type="dxa"/>
-              <w:start w:w="75" w:type="dxa"/>
-              <w:bottom w:w="75" w:type="dxa"/>
-              <w:end w:w="75" w:type="dxa"/>
+              <w:top w:w="65" w:type="dxa"/>
+              <w:start w:w="65" w:type="dxa"/>
+              <w:bottom w:w="65" w:type="dxa"/>
+              <w:end w:w="65" w:type="dxa"/>
             </w:tcMar>
             <w:vAlign w:val="center"/>
           </w:tcPr>
           <w:p>
             <w:pPr>
-              <w:spacing w:after="20" w:line="252" w:lineRule="auto"/>
+              <w:spacing w:after="20" w:line="245" w:lineRule="auto"/>
             </w:pPr>
             <w:r>
               <w:rPr>
-                <w:sz w:val="15"/>
+                <w:sz w:val="14"/>
               </w:rPr>
-              <w:t>INA260 or external calibrated meter during validation</w:t>
+              <w:t>Battery chemistry matched solar charger or MPPT controller</w:t>
             </w:r>
           </w:p>
         </w:tc>
@@ -2931,22 +3748,22 @@
           <w:tcPr>
             <w:tcW w:type="dxa" w:w="3311"/>
             <w:tcMar>
-              <w:top w:w="75" w:type="dxa"/>
-              <w:start w:w="75" w:type="dxa"/>
-              <w:bottom w:w="75" w:type="dxa"/>
-              <w:end w:w="75" w:type="dxa"/>
+              <w:top w:w="65" w:type="dxa"/>
+              <w:start w:w="65" w:type="dxa"/>
+              <w:bottom w:w="65" w:type="dxa"/>
+              <w:end w:w="65" w:type="dxa"/>
             </w:tcMar>
             <w:vAlign w:val="center"/>
           </w:tcPr>
           <w:p>
             <w:pPr>
-              <w:spacing w:after="20" w:line="252" w:lineRule="auto"/>
+              <w:spacing w:after="20" w:line="245" w:lineRule="auto"/>
             </w:pPr>
             <w:r>
               <w:rPr>
-                <w:sz w:val="15"/>
+                <w:sz w:val="14"/>
               </w:rPr>
-              <w:t>Voltage divider only if current or charge trend is required</w:t>
+              <w:t>Direct solar panel to lithium battery connection</w:t>
             </w:r>
           </w:p>
         </w:tc>
@@ -2956,21 +3773,118 @@
           <w:tcPr>
             <w:tcW w:type="dxa" w:w="1800"/>
             <w:tcMar>
-              <w:top w:w="75" w:type="dxa"/>
-              <w:start w:w="75" w:type="dxa"/>
-              <w:bottom w:w="75" w:type="dxa"/>
-              <w:end w:w="75" w:type="dxa"/>
+              <w:top w:w="65" w:type="dxa"/>
+              <w:start w:w="65" w:type="dxa"/>
+              <w:bottom w:w="65" w:type="dxa"/>
+              <w:end w:w="65" w:type="dxa"/>
             </w:tcMar>
             <w:vAlign w:val="center"/>
             <w:shd w:fill="F5F8FA"/>
           </w:tcPr>
           <w:p>
             <w:pPr>
-              <w:spacing w:after="20" w:line="252" w:lineRule="auto"/>
+              <w:spacing w:after="20" w:line="245" w:lineRule="auto"/>
             </w:pPr>
             <w:r>
               <w:rPr>
-                <w:sz w:val="15"/>
+                <w:sz w:val="14"/>
+              </w:rPr>
+              <w:t>Night visibility</w:t>
+            </w:r>
+          </w:p>
+        </w:tc>
+        <w:tc>
+          <w:tcPr>
+            <w:tcW w:type="dxa" w:w="2880"/>
+            <w:tcMar>
+              <w:top w:w="65" w:type="dxa"/>
+              <w:start w:w="65" w:type="dxa"/>
+              <w:bottom w:w="65" w:type="dxa"/>
+              <w:end w:w="65" w:type="dxa"/>
+            </w:tcMar>
+            <w:vAlign w:val="center"/>
+            <w:shd w:fill="F5F8FA"/>
+          </w:tcPr>
+          <w:p>
+            <w:pPr>
+              <w:spacing w:after="20" w:line="245" w:lineRule="auto"/>
+            </w:pPr>
+            <w:r>
+              <w:rPr>
+                <w:sz w:val="14"/>
+              </w:rPr>
+              <w:t>Low-cost solar net marker light</w:t>
+            </w:r>
+          </w:p>
+        </w:tc>
+        <w:tc>
+          <w:tcPr>
+            <w:tcW w:type="dxa" w:w="3168"/>
+            <w:tcMar>
+              <w:top w:w="65" w:type="dxa"/>
+              <w:start w:w="65" w:type="dxa"/>
+              <w:bottom w:w="65" w:type="dxa"/>
+              <w:end w:w="65" w:type="dxa"/>
+            </w:tcMar>
+            <w:vAlign w:val="center"/>
+            <w:shd w:fill="F5F8FA"/>
+          </w:tcPr>
+          <w:p>
+            <w:pPr>
+              <w:spacing w:after="20" w:line="245" w:lineRule="auto"/>
+            </w:pPr>
+            <w:r>
+              <w:rPr>
+                <w:sz w:val="14"/>
+              </w:rPr>
+              <w:t>IP66-IP68 marine beacon or self-contained solar buoy light</w:t>
+            </w:r>
+          </w:p>
+        </w:tc>
+        <w:tc>
+          <w:tcPr>
+            <w:tcW w:type="dxa" w:w="3311"/>
+            <w:tcMar>
+              <w:top w:w="65" w:type="dxa"/>
+              <w:start w:w="65" w:type="dxa"/>
+              <w:bottom w:w="65" w:type="dxa"/>
+              <w:end w:w="65" w:type="dxa"/>
+            </w:tcMar>
+            <w:vAlign w:val="center"/>
+            <w:shd w:fill="F5F8FA"/>
+          </w:tcPr>
+          <w:p>
+            <w:pPr>
+              <w:spacing w:after="20" w:line="245" w:lineRule="auto"/>
+            </w:pPr>
+            <w:r>
+              <w:rPr>
+                <w:sz w:val="14"/>
+              </w:rPr>
+              <w:t>Indoor LED strip, flashlight, or non-waterproof decorative light</w:t>
+            </w:r>
+          </w:p>
+        </w:tc>
+      </w:tr>
+      <w:tr>
+        <w:tc>
+          <w:tcPr>
+            <w:tcW w:type="dxa" w:w="1800"/>
+            <w:tcMar>
+              <w:top w:w="65" w:type="dxa"/>
+              <w:start w:w="65" w:type="dxa"/>
+              <w:bottom w:w="65" w:type="dxa"/>
+              <w:end w:w="65" w:type="dxa"/>
+            </w:tcMar>
+            <w:vAlign w:val="center"/>
+          </w:tcPr>
+          <w:p>
+            <w:pPr>
+              <w:spacing w:after="20" w:line="245" w:lineRule="auto"/>
+            </w:pPr>
+            <w:r>
+              <w:rPr>
+                <w:sz w:val="14"/>
               </w:rPr>
               <w:t>Internet</w:t>
             </w:r>
@@ -2980,21 +3894,20 @@
           <w:tcPr>
             <w:tcW w:type="dxa" w:w="2880"/>
             <w:tcMar>
-              <w:top w:w="75" w:type="dxa"/>
-              <w:start w:w="75" w:type="dxa"/>
-              <w:bottom w:w="75" w:type="dxa"/>
-              <w:end w:w="75" w:type="dxa"/>
+              <w:top w:w="65" w:type="dxa"/>
+              <w:start w:w="65" w:type="dxa"/>
+              <w:bottom w:w="65" w:type="dxa"/>
+              <w:end w:w="65" w:type="dxa"/>
             </w:tcMar>
             <w:vAlign w:val="center"/>
-            <w:shd w:fill="F5F8FA"/>
           </w:tcPr>
           <w:p>
             <w:pPr>
-              <w:spacing w:after="20" w:line="252" w:lineRule="auto"/>
+              <w:spacing w:after="20" w:line="245" w:lineRule="auto"/>
             </w:pPr>
             <w:r>
               <w:rPr>
-                <w:sz w:val="15"/>
+                <w:sz w:val="14"/>
               </w:rPr>
               <w:t>ESP32 Wi-Fi for lab</w:t>
             </w:r>
@@ -3004,21 +3917,20 @@
           <w:tcPr>
             <w:tcW w:type="dxa" w:w="3168"/>
             <w:tcMar>
-              <w:top w:w="75" w:type="dxa"/>
-              <w:start w:w="75" w:type="dxa"/>
-              <w:bottom w:w="75" w:type="dxa"/>
-              <w:end w:w="75" w:type="dxa"/>
+              <w:top w:w="65" w:type="dxa"/>
+              <w:start w:w="65" w:type="dxa"/>
+              <w:bottom w:w="65" w:type="dxa"/>
+              <w:end w:w="65" w:type="dxa"/>
             </w:tcMar>
             <w:vAlign w:val="center"/>
-            <w:shd w:fill="F5F8FA"/>
           </w:tcPr>
           <w:p>
             <w:pPr>
-              <w:spacing w:after="20" w:line="252" w:lineRule="auto"/>
+              <w:spacing w:after="20" w:line="245" w:lineRule="auto"/>
             </w:pPr>
             <w:r>
               <w:rPr>
-                <w:sz w:val="15"/>
+                <w:sz w:val="14"/>
               </w:rPr>
               <w:t>A7670E LTE Cat-1 or SIM7600 class board for field</w:t>
             </w:r>
@@ -3028,21 +3940,20 @@
           <w:tcPr>
             <w:tcW w:type="dxa" w:w="3311"/>
             <w:tcMar>
-              <w:top w:w="75" w:type="dxa"/>
-              <w:start w:w="75" w:type="dxa"/>
-              <w:bottom w:w="75" w:type="dxa"/>
-              <w:end w:w="75" w:type="dxa"/>
+              <w:top w:w="65" w:type="dxa"/>
+              <w:start w:w="65" w:type="dxa"/>
+              <w:bottom w:w="65" w:type="dxa"/>
+              <w:end w:w="65" w:type="dxa"/>
             </w:tcMar>
             <w:vAlign w:val="center"/>
-            <w:shd w:fill="F5F8FA"/>
           </w:tcPr>
           <w:p>
             <w:pPr>
-              <w:spacing w:after="20" w:line="252" w:lineRule="auto"/>
+              <w:spacing w:after="20" w:line="245" w:lineRule="auto"/>
             </w:pPr>
             <w:r>
               <w:rPr>
-                <w:sz w:val="15"/>
+                <w:sz w:val="14"/>
               </w:rPr>
               <w:t>Always-on every-second upload</w:t>
             </w:r>
@@ -3054,20 +3965,21 @@
           <w:tcPr>
             <w:tcW w:type="dxa" w:w="1800"/>
             <w:tcMar>
-              <w:top w:w="75" w:type="dxa"/>
-              <w:start w:w="75" w:type="dxa"/>
-              <w:bottom w:w="75" w:type="dxa"/>
-              <w:end w:w="75" w:type="dxa"/>
+              <w:top w:w="65" w:type="dxa"/>
+              <w:start w:w="65" w:type="dxa"/>
+              <w:bottom w:w="65" w:type="dxa"/>
+              <w:end w:w="65" w:type="dxa"/>
             </w:tcMar>
             <w:vAlign w:val="center"/>
+            <w:shd w:fill="F5F8FA"/>
           </w:tcPr>
           <w:p>
             <w:pPr>
-              <w:spacing w:after="20" w:line="252" w:lineRule="auto"/>
+              <w:spacing w:after="20" w:line="245" w:lineRule="auto"/>
             </w:pPr>
             <w:r>
               <w:rPr>
-                <w:sz w:val="15"/>
+                <w:sz w:val="14"/>
               </w:rPr>
               <w:t>Motion and tamper</w:t>
             </w:r>
@@ -3077,20 +3989,21 @@
           <w:tcPr>
             <w:tcW w:type="dxa" w:w="2880"/>
             <w:tcMar>
-              <w:top w:w="75" w:type="dxa"/>
-              <w:start w:w="75" w:type="dxa"/>
-              <w:bottom w:w="75" w:type="dxa"/>
-              <w:end w:w="75" w:type="dxa"/>
+              <w:top w:w="65" w:type="dxa"/>
+              <w:start w:w="65" w:type="dxa"/>
+              <w:bottom w:w="65" w:type="dxa"/>
+              <w:end w:w="65" w:type="dxa"/>
             </w:tcMar>
             <w:vAlign w:val="center"/>
+            <w:shd w:fill="F5F8FA"/>
           </w:tcPr>
           <w:p>
             <w:pPr>
-              <w:spacing w:after="20" w:line="252" w:lineRule="auto"/>
+              <w:spacing w:after="20" w:line="245" w:lineRule="auto"/>
             </w:pPr>
             <w:r>
               <w:rPr>
-                <w:sz w:val="15"/>
+                <w:sz w:val="14"/>
               </w:rPr>
               <w:t>SW-420 or reed switch</w:t>
             </w:r>
@@ -3100,20 +4013,21 @@
           <w:tcPr>
             <w:tcW w:type="dxa" w:w="3168"/>
             <w:tcMar>
-              <w:top w:w="75" w:type="dxa"/>
-              <w:start w:w="75" w:type="dxa"/>
-              <w:bottom w:w="75" w:type="dxa"/>
-              <w:end w:w="75" w:type="dxa"/>
+              <w:top w:w="65" w:type="dxa"/>
+              <w:start w:w="65" w:type="dxa"/>
+              <w:bottom w:w="65" w:type="dxa"/>
+              <w:end w:w="65" w:type="dxa"/>
             </w:tcMar>
             <w:vAlign w:val="center"/>
+            <w:shd w:fill="F5F8FA"/>
           </w:tcPr>
           <w:p>
             <w:pPr>
-              <w:spacing w:after="20" w:line="252" w:lineRule="auto"/>
+              <w:spacing w:after="20" w:line="245" w:lineRule="auto"/>
             </w:pPr>
             <w:r>
               <w:rPr>
-                <w:sz w:val="15"/>
+                <w:sz w:val="14"/>
               </w:rPr>
               <w:t>MPU6050 plus enclosure reed switch</w:t>
             </w:r>
@@ -3123,120 +4037,23 @@
           <w:tcPr>
             <w:tcW w:type="dxa" w:w="3311"/>
             <w:tcMar>
-              <w:top w:w="75" w:type="dxa"/>
-              <w:start w:w="75" w:type="dxa"/>
-              <w:bottom w:w="75" w:type="dxa"/>
-              <w:end w:w="75" w:type="dxa"/>
-            </w:tcMar>
-            <w:vAlign w:val="center"/>
-          </w:tcPr>
-          <w:p>
-            <w:pPr>
-              <w:spacing w:after="20" w:line="252" w:lineRule="auto"/>
-            </w:pPr>
-            <w:r>
-              <w:rPr>
-                <w:sz w:val="15"/>
-              </w:rPr>
-              <w:t>Motion sensor as replacement for pressure sensor</w:t>
-            </w:r>
-          </w:p>
-        </w:tc>
-      </w:tr>
-      <w:tr>
-        <w:tc>
-          <w:tcPr>
-            <w:tcW w:type="dxa" w:w="1800"/>
-            <w:tcMar>
-              <w:top w:w="75" w:type="dxa"/>
-              <w:start w:w="75" w:type="dxa"/>
-              <w:bottom w:w="75" w:type="dxa"/>
-              <w:end w:w="75" w:type="dxa"/>
+              <w:top w:w="65" w:type="dxa"/>
+              <w:start w:w="65" w:type="dxa"/>
+              <w:bottom w:w="65" w:type="dxa"/>
+              <w:end w:w="65" w:type="dxa"/>
             </w:tcMar>
             <w:vAlign w:val="center"/>
             <w:shd w:fill="F5F8FA"/>
           </w:tcPr>
           <w:p>
             <w:pPr>
-              <w:spacing w:after="20" w:line="252" w:lineRule="auto"/>
+              <w:spacing w:after="20" w:line="245" w:lineRule="auto"/>
             </w:pPr>
             <w:r>
               <w:rPr>
-                <w:sz w:val="15"/>
+                <w:sz w:val="14"/>
               </w:rPr>
-              <w:t>Temperature</w:t>
-            </w:r>
-          </w:p>
-        </w:tc>
-        <w:tc>
-          <w:tcPr>
-            <w:tcW w:type="dxa" w:w="2880"/>
-            <w:tcMar>
-              <w:top w:w="75" w:type="dxa"/>
-              <w:start w:w="75" w:type="dxa"/>
-              <w:bottom w:w="75" w:type="dxa"/>
-              <w:end w:w="75" w:type="dxa"/>
-            </w:tcMar>
-            <w:vAlign w:val="center"/>
-            <w:shd w:fill="F5F8FA"/>
-          </w:tcPr>
-          <w:p>
-            <w:pPr>
-              <w:spacing w:after="20" w:line="252" w:lineRule="auto"/>
-            </w:pPr>
-            <w:r>
-              <w:rPr>
-                <w:sz w:val="15"/>
-              </w:rPr>
-              <w:t>DS18B20</w:t>
-            </w:r>
-          </w:p>
-        </w:tc>
-        <w:tc>
-          <w:tcPr>
-            <w:tcW w:type="dxa" w:w="3168"/>
-            <w:tcMar>
-              <w:top w:w="75" w:type="dxa"/>
-              <w:start w:w="75" w:type="dxa"/>
-              <w:bottom w:w="75" w:type="dxa"/>
-              <w:end w:w="75" w:type="dxa"/>
-            </w:tcMar>
-            <w:vAlign w:val="center"/>
-            <w:shd w:fill="F5F8FA"/>
-          </w:tcPr>
-          <w:p>
-            <w:pPr>
-              <w:spacing w:after="20" w:line="252" w:lineRule="auto"/>
-            </w:pPr>
-            <w:r>
-              <w:rPr>
-                <w:sz w:val="15"/>
-              </w:rPr>
-              <w:t>Marine-grade temperature probe</w:t>
-            </w:r>
-          </w:p>
-        </w:tc>
-        <w:tc>
-          <w:tcPr>
-            <w:tcW w:type="dxa" w:w="3311"/>
-            <w:tcMar>
-              <w:top w:w="75" w:type="dxa"/>
-              <w:start w:w="75" w:type="dxa"/>
-              <w:bottom w:w="75" w:type="dxa"/>
-              <w:end w:w="75" w:type="dxa"/>
-            </w:tcMar>
-            <w:vAlign w:val="center"/>
-            <w:shd w:fill="F5F8FA"/>
-          </w:tcPr>
-          <w:p>
-            <w:pPr>
-              <w:spacing w:after="20" w:line="252" w:lineRule="auto"/>
-            </w:pPr>
-            <w:r>
-              <w:rPr>
-                <w:sz w:val="15"/>
-              </w:rPr>
-              <w:t>Treating temperature as primary wave data</w:t>
+              <w:t>Motion sensor as replacement for pressure sensor</w:t>
             </w:r>
           </w:p>
         </w:tc>
@@ -3255,7 +4072,7 @@
         <w:pStyle w:val="ListNumber"/>
       </w:pPr>
       <w:r>
-        <w:t>Buy and test ESP32, GPS, INA219, ADS1115, SW-420 or reed switch, and DS18B20 first because they are low cost and easy to validate.</w:t>
+        <w:t>Use the existing ESP32 kit, breadboard, jumper wires, buttons, LEDs, and buck converters for bench validation only.</w:t>
       </w:r>
     </w:p>
     <w:p>
@@ -3263,7 +4080,7 @@
         <w:pStyle w:val="ListNumber"/>
       </w:pPr>
       <w:r>
-        <w:t>Confirm the pressure sensor range, output, material, cable, waterproofing, and calibration evidence before payment.</w:t>
+        <w:t>Buy or confirm the water pressure sensor and pressure interface first because this is the core measurement path.</w:t>
       </w:r>
     </w:p>
     <w:p>
@@ -3271,7 +4088,7 @@
         <w:pStyle w:val="ListNumber"/>
       </w:pPr>
       <w:r>
-        <w:t>Confirm whether the wind listing includes both speed and direction before payment.</w:t>
+        <w:t>Add GPS, INA219, and wind speed/direction after the pressure path is defined.</w:t>
       </w:r>
     </w:p>
     <w:p>
@@ -3279,7 +4096,7 @@
         <w:pStyle w:val="ListNumber"/>
       </w:pPr>
       <w:r>
-        <w:t>Use Wi-Fi for bench and laboratory validation. Buy LTE only when the validation site needs internet away from Wi-Fi.</w:t>
+        <w:t>Measure ESP32, GPS, LTE/Wi-Fi, wind sensor, pressure interface, and beacon current before final battery sizing.</w:t>
       </w:r>
     </w:p>
     <w:p>
@@ -3287,7 +4104,23 @@
         <w:pStyle w:val="ListNumber"/>
       </w:pPr>
       <w:r>
-        <w:t>Keep LoRa as fallback only. The revised design should remain event-driven and cloud-based when internet is available.</w:t>
+        <w:t>Choose the battery pack with BMS, matching solar charge controller, and solar panel after the load estimate is measured.</w:t>
+      </w:r>
+    </w:p>
+    <w:p>
+      <w:pPr>
+        <w:pStyle w:val="ListNumber"/>
+      </w:pPr>
+      <w:r>
+        <w:t>Use a self-contained solar marine beacon if possible so night visibility does not drain the main electronics battery.</w:t>
+      </w:r>
+    </w:p>
+    <w:p>
+      <w:pPr>
+        <w:pStyle w:val="ListNumber"/>
+      </w:pPr>
+      <w:r>
+        <w:t>Buy LTE only if the validation site has no reliable Wi-Fi. Keep LoRa as fallback only.</w:t>
       </w:r>
     </w:p>
     <w:p>
@@ -3310,13 +4143,13 @@
       <w:r>
         <w:rPr>
           <w:b/>
-          <w:sz w:val="15"/>
+          <w:sz w:val="14"/>
         </w:rPr>
         <w:t xml:space="preserve">Pressure transmitter QDY30A listing: </w:t>
       </w:r>
       <w:r>
         <w:rPr>
-          <w:sz w:val="15"/>
+          <w:sz w:val="14"/>
         </w:rPr>
         <w:t>https://www.lazada.com.ph/videodetail/?video_id=8000144764410</w:t>
       </w:r>
@@ -3328,13 +4161,13 @@
       <w:r>
         <w:rPr>
           <w:b/>
-          <w:sz w:val="15"/>
+          <w:sz w:val="14"/>
         </w:rPr>
         <w:t xml:space="preserve">Pressure transmitter 1 m 3 m 5 m listing: </w:t>
       </w:r>
       <w:r>
         <w:rPr>
-          <w:sz w:val="15"/>
+          <w:sz w:val="14"/>
         </w:rPr>
         <w:t>https://www.lazada.com.ph/videodetail/?video_id=8000146168991</w:t>
       </w:r>
@@ -3346,13 +4179,13 @@
       <w:r>
         <w:rPr>
           <w:b/>
-          <w:sz w:val="15"/>
+          <w:sz w:val="14"/>
         </w:rPr>
         <w:t xml:space="preserve">Water level sensor tag result: </w:t>
       </w:r>
       <w:r>
         <w:rPr>
-          <w:sz w:val="15"/>
+          <w:sz w:val="14"/>
         </w:rPr>
         <w:t>https://www.lazada.com.ph/tag/tank-level-monitoring-system/</w:t>
       </w:r>
@@ -3364,13 +4197,13 @@
       <w:r>
         <w:rPr>
           <w:b/>
-          <w:sz w:val="15"/>
+          <w:sz w:val="14"/>
         </w:rPr>
         <w:t xml:space="preserve">ADS1115 listing: </w:t>
       </w:r>
       <w:r>
         <w:rPr>
-          <w:sz w:val="15"/>
+          <w:sz w:val="14"/>
         </w:rPr>
         <w:t>https://www.lazada.com.ph/videodetail/?video_id=8000078224372</w:t>
       </w:r>
@@ -3382,31 +4215,13 @@
       <w:r>
         <w:rPr>
           <w:b/>
-          <w:sz w:val="15"/>
-        </w:rPr>
-        <w:t xml:space="preserve">ADS1115 tag result: </w:t>
-      </w:r>
-      <w:r>
-        <w:rPr>
-          <w:sz w:val="15"/>
-        </w:rPr>
-        <w:t>https://www.lazada.com.ph/tag/ld-icoa-12a/</w:t>
-      </w:r>
-    </w:p>
-    <w:p>
-      <w:pPr>
-        <w:pStyle w:val="ListBullet"/>
-      </w:pPr>
-      <w:r>
-        <w:rPr>
-          <w:b/>
-          <w:sz w:val="15"/>
+          <w:sz w:val="14"/>
         </w:rPr>
         <w:t xml:space="preserve">Shopee anemometer search: </w:t>
       </w:r>
       <w:r>
         <w:rPr>
-          <w:sz w:val="15"/>
+          <w:sz w:val="14"/>
         </w:rPr>
         <w:t>https://shopee.ph/list/anemometer</w:t>
       </w:r>
@@ -3418,13 +4233,13 @@
       <w:r>
         <w:rPr>
           <w:b/>
-          <w:sz w:val="15"/>
+          <w:sz w:val="14"/>
         </w:rPr>
         <w:t xml:space="preserve">MakerLab Shopee anemometer listing: </w:t>
       </w:r>
       <w:r>
         <w:rPr>
-          <w:sz w:val="15"/>
+          <w:sz w:val="14"/>
         </w:rPr>
         <w:t>https://shopee.ph/Anemometer-Wind-Speed-Sensor-0-to-5V-Analog-RS485-i.18252381.40953188107</w:t>
       </w:r>
@@ -3436,31 +4251,13 @@
       <w:r>
         <w:rPr>
           <w:b/>
-          <w:sz w:val="15"/>
-        </w:rPr>
-        <w:t xml:space="preserve">Lazada industrial anemometer listing: </w:t>
-      </w:r>
-      <w:r>
-        <w:rPr>
-          <w:sz w:val="15"/>
-        </w:rPr>
-        <w:t>https://www.lazada.com.ph/videodetail/?video_id=8000146662526</w:t>
-      </w:r>
-    </w:p>
-    <w:p>
-      <w:pPr>
-        <w:pStyle w:val="ListBullet"/>
-      </w:pPr>
-      <w:r>
-        <w:rPr>
-          <w:b/>
-          <w:sz w:val="15"/>
+          <w:sz w:val="14"/>
         </w:rPr>
         <w:t xml:space="preserve">NEO-6M GPS listing: </w:t>
       </w:r>
       <w:r>
         <w:rPr>
-          <w:sz w:val="15"/>
+          <w:sz w:val="14"/>
         </w:rPr>
         <w:t>https://www.lazada.com.ph/videodetail/?video_id=8000133608045</w:t>
       </w:r>
@@ -3472,49 +4269,13 @@
       <w:r>
         <w:rPr>
           <w:b/>
-          <w:sz w:val="15"/>
-        </w:rPr>
-        <w:t xml:space="preserve">NEO-6M GPS listing 2: </w:t>
-      </w:r>
-      <w:r>
-        <w:rPr>
-          <w:sz w:val="15"/>
-        </w:rPr>
-        <w:t>https://www.lazada.com.ph/videodetail/?video_id=8000137992035</w:t>
-      </w:r>
-    </w:p>
-    <w:p>
-      <w:pPr>
-        <w:pStyle w:val="ListBullet"/>
-      </w:pPr>
-      <w:r>
-        <w:rPr>
-          <w:b/>
-          <w:sz w:val="15"/>
-        </w:rPr>
-        <w:t xml:space="preserve">GPS tag result: </w:t>
-      </w:r>
-      <w:r>
-        <w:rPr>
-          <w:sz w:val="15"/>
-        </w:rPr>
-        <w:t>https://www.lazada.com.ph/tag/drone-gps-module-for-precision/</w:t>
-      </w:r>
-    </w:p>
-    <w:p>
-      <w:pPr>
-        <w:pStyle w:val="ListBullet"/>
-      </w:pPr>
-      <w:r>
-        <w:rPr>
-          <w:b/>
-          <w:sz w:val="15"/>
+          <w:sz w:val="14"/>
         </w:rPr>
         <w:t xml:space="preserve">Shopee INA219 listing: </w:t>
       </w:r>
       <w:r>
         <w:rPr>
-          <w:sz w:val="15"/>
+          <w:sz w:val="14"/>
         </w:rPr>
         <w:t>https://shopee.ph/INA219-GY-219-I2C-Bi-directional-DC-Current-Power-Supply-Sensor-Breakout-Module-for-Arduino-DIY-i.1063532622.25639962980</w:t>
       </w:r>
@@ -3526,13 +4287,13 @@
       <w:r>
         <w:rPr>
           <w:b/>
-          <w:sz w:val="15"/>
+          <w:sz w:val="14"/>
         </w:rPr>
         <w:t xml:space="preserve">imBento INA219 listing: </w:t>
       </w:r>
       <w:r>
         <w:rPr>
-          <w:sz w:val="15"/>
+          <w:sz w:val="14"/>
         </w:rPr>
         <w:t>https://imbento.com/shop/product/439</w:t>
       </w:r>
@@ -3544,13 +4305,121 @@
       <w:r>
         <w:rPr>
           <w:b/>
-          <w:sz w:val="15"/>
+          <w:sz w:val="14"/>
+        </w:rPr>
+        <w:t xml:space="preserve">18650 battery holder search: </w:t>
+      </w:r>
+      <w:r>
+        <w:rPr>
+          <w:sz w:val="14"/>
+        </w:rPr>
+        <w:t>https://shopee.ph/list/18650%20battery%20holder</w:t>
+      </w:r>
+    </w:p>
+    <w:p>
+      <w:pPr>
+        <w:pStyle w:val="ListBullet"/>
+      </w:pPr>
+      <w:r>
+        <w:rPr>
+          <w:b/>
+          <w:sz w:val="14"/>
+        </w:rPr>
+        <w:t xml:space="preserve">BeMuchSafer battery/BMS store: </w:t>
+      </w:r>
+      <w:r>
+        <w:rPr>
+          <w:sz w:val="14"/>
+        </w:rPr>
+        <w:t>https://shopee.ph/bemuchsafer.ph</w:t>
+      </w:r>
+    </w:p>
+    <w:p>
+      <w:pPr>
+        <w:pStyle w:val="ListBullet"/>
+      </w:pPr>
+      <w:r>
+        <w:rPr>
+          <w:b/>
+          <w:sz w:val="14"/>
+        </w:rPr>
+        <w:t xml:space="preserve">Shopee 12 V solar panel search: </w:t>
+      </w:r>
+      <w:r>
+        <w:rPr>
+          <w:sz w:val="14"/>
+        </w:rPr>
+        <w:t>https://shopee.ph/list/12v%20solar%20panel</w:t>
+      </w:r>
+    </w:p>
+    <w:p>
+      <w:pPr>
+        <w:pStyle w:val="ListBullet"/>
+      </w:pPr>
+      <w:r>
+        <w:rPr>
+          <w:b/>
+          <w:sz w:val="14"/>
+        </w:rPr>
+        <w:t xml:space="preserve">Lazada 10 W 12 V solar panel tag: </w:t>
+      </w:r>
+      <w:r>
+        <w:rPr>
+          <w:sz w:val="14"/>
+        </w:rPr>
+        <w:t>https://www.lazada.com.ph/tag/solar-panel-10w-12v/</w:t>
+      </w:r>
+    </w:p>
+    <w:p>
+      <w:pPr>
+        <w:pStyle w:val="ListBullet"/>
+      </w:pPr>
+      <w:r>
+        <w:rPr>
+          <w:b/>
+          <w:sz w:val="14"/>
+        </w:rPr>
+        <w:t xml:space="preserve">Solar marine navigation light listing: </w:t>
+      </w:r>
+      <w:r>
+        <w:rPr>
+          <w:sz w:val="14"/>
+        </w:rPr>
+        <w:t>https://shopee.ph/love%2A-Solar-Powered-Marine-Navigation-Light-Waterproof-IP68-for-Fishing-Net-Buoys-i.135511368.51962091672</w:t>
+      </w:r>
+    </w:p>
+    <w:p>
+      <w:pPr>
+        <w:pStyle w:val="ListBullet"/>
+      </w:pPr>
+      <w:r>
+        <w:rPr>
+          <w:b/>
+          <w:sz w:val="14"/>
+        </w:rPr>
+        <w:t xml:space="preserve">Lazada boat signal light tag: </w:t>
+      </w:r>
+      <w:r>
+        <w:rPr>
+          <w:sz w:val="14"/>
+        </w:rPr>
+        <w:t>https://www.lazada.com.ph/tag/boatsignal-light-led/</w:t>
+      </w:r>
+    </w:p>
+    <w:p>
+      <w:pPr>
+        <w:pStyle w:val="ListBullet"/>
+      </w:pPr>
+      <w:r>
+        <w:rPr>
+          <w:b/>
+          <w:sz w:val="14"/>
         </w:rPr>
         <w:t xml:space="preserve">A7670E listings: </w:t>
       </w:r>
       <w:r>
         <w:rPr>
-          <w:sz w:val="15"/>
+          <w:sz w:val="14"/>
         </w:rPr>
         <w:t>https://www.lazada.com.ph/tag/a7670e/</w:t>
       </w:r>
@@ -3562,13 +4431,13 @@
       <w:r>
         <w:rPr>
           <w:b/>
-          <w:sz w:val="15"/>
+          <w:sz w:val="14"/>
         </w:rPr>
         <w:t xml:space="preserve">ESP32 LTE listings: </w:t>
       </w:r>
       <w:r>
         <w:rPr>
-          <w:sz w:val="15"/>
+          <w:sz w:val="14"/>
         </w:rPr>
         <w:t>https://www.lazada.com.ph/tag/esp32-sim/</w:t>
       </w:r>
@@ -3580,13 +4449,13 @@
       <w:r>
         <w:rPr>
           <w:b/>
-          <w:sz w:val="15"/>
+          <w:sz w:val="14"/>
         </w:rPr>
         <w:t xml:space="preserve">MPU6050 listing: </w:t>
       </w:r>
       <w:r>
         <w:rPr>
-          <w:sz w:val="15"/>
+          <w:sz w:val="14"/>
         </w:rPr>
         <w:t>https://www.lazada.com.ph/videodetail/?video_id=8000145952787</w:t>
       </w:r>
@@ -3598,13 +4467,13 @@
       <w:r>
         <w:rPr>
           <w:b/>
-          <w:sz w:val="15"/>
+          <w:sz w:val="14"/>
         </w:rPr>
         <w:t xml:space="preserve">SW-420 e-Gizmo: </w:t>
       </w:r>
       <w:r>
         <w:rPr>
-          <w:sz w:val="15"/>
+          <w:sz w:val="14"/>
         </w:rPr>
         <w:t>https://e-gizmo.net/gizmoshop/index.php?product_id=1611&amp;route=product%2Fproduct</w:t>
       </w:r>
@@ -3616,13 +4485,13 @@
       <w:r>
         <w:rPr>
           <w:b/>
-          <w:sz w:val="15"/>
+          <w:sz w:val="14"/>
         </w:rPr>
         <w:t xml:space="preserve">SW-420 MakerLab: </w:t>
       </w:r>
       <w:r>
         <w:rPr>
-          <w:sz w:val="15"/>
+          <w:sz w:val="14"/>
         </w:rPr>
         <w:t>https://makerlab.ph/products/vibration-sensor-sw-420</w:t>
       </w:r>
@@ -3634,13 +4503,13 @@
       <w:r>
         <w:rPr>
           <w:b/>
-          <w:sz w:val="15"/>
+          <w:sz w:val="14"/>
         </w:rPr>
         <w:t xml:space="preserve">Magnetic switch listing: </w:t>
       </w:r>
       <w:r>
         <w:rPr>
-          <w:sz w:val="15"/>
+          <w:sz w:val="14"/>
         </w:rPr>
         <w:t>https://www.lazada.com.ph/videodetail/?video_id=8000131458280</w:t>
       </w:r>
@@ -3651,16 +4520,9 @@
       </w:pPr>
       <w:r>
         <w:rPr>
-          <w:b/>
-          <w:sz w:val="15"/>
+          <w:sz w:val="14"/>
         </w:rPr>
-        <w:t xml:space="preserve">DS18B20 tag result: </w:t>
-      </w:r>
-      <w:r>
-        <w:rPr>
-          <w:sz w:val="15"/>
-        </w:rPr>
-        <w:t>https://www.lazada.com.ph/tag/digital-thermometer-sensors-ds18b20/</w:t>
+        <w:t>5V/5W small solar panel listing: https://shopee.ph/GOLDEN-5V-5W-Small-Solar-Panel-With-USB-DIY-Monocrystalline-Silicon-Solar-Cell-Waterproof-Portable-Camping-Power-Panel-For-Mobile-Phone-PH-i.206104448.47456957544</w:t>
       </w:r>
     </w:p>
     <w:p>
@@ -3669,20 +4531,24 @@
       </w:pPr>
       <w:r>
         <w:rPr>
-          <w:b/>
-          <w:sz w:val="15"/>
+          <w:sz w:val="14"/>
         </w:rPr>
-        <w:t xml:space="preserve">Water temperature sensor tag result: </w:t>
+        <w:t>Small solar panel search: https://shopee.ph/list/small%20solar%20panel</w:t>
       </w:r>
+    </w:p>
+    <w:p>
+      <w:pPr>
+        <w:pStyle w:val="ListBullet"/>
+      </w:pPr>
       <w:r>
         <w:rPr>
-          <w:sz w:val="15"/>
+          <w:sz w:val="14"/>
         </w:rPr>
-        <w:t>https://www.lazada.com.ph/tag/water-temperature-sensor-arduino/</w:t>
+        <w:t>6V/5W solar panel tag: https://www.lazada.com.ph/tag/6v-5w-solar-panel/</w:t>
       </w:r>
     </w:p>
     <w:sectPr>
-      <w:footerReference w:type="default" r:id="rId19"/>
+      <w:footerReference w:type="default" r:id="rId23"/>
       <w:pgSz w:w="11909" w:h="16834"/>
       <w:pgMar w:top="792" w:right="792" w:bottom="792" w:left="792" w:header="720" w:footer="720" w:gutter="0"/>
       <w:cols w:space="720"/>
@@ -3704,7 +4570,7 @@
         <w:color w:val="5A5A5A"/>
         <w:sz w:val="16"/>
       </w:rPr>
-      <w:t>Project FALCON sensor approval handout | proposal validation</w:t>
+      <w:t>Project FALCON equipment approval handout | proposal validation</w:t>
     </w:r>
   </w:p>
 </w:ftr>
@@ -4141,7 +5007,7 @@
       <w:b/>
       <w:bCs/>
       <w:color w:val="000000"/>
-      <w:sz w:val="30"/>
+      <w:sz w:val="28"/>
       <w:szCs w:val="28"/>
     </w:rPr>
   </w:style>
@@ -4165,7 +5031,7 @@
       <w:b/>
       <w:bCs/>
       <w:color w:val="000000"/>
-      <w:sz w:val="24"/>
+      <w:sz w:val="26"/>
       <w:szCs w:val="26"/>
     </w:rPr>
   </w:style>
@@ -4431,7 +5297,7 @@
       <w:color w:val="000000"/>
       <w:spacing w:val="5"/>
       <w:kern w:val="28"/>
-      <w:sz w:val="44"/>
+      <w:sz w:val="42"/>
       <w:szCs w:val="52"/>
     </w:rPr>
   </w:style>

</xml_diff>

<commit_message>
Update handout solar equipment wording
</commit_message>
<xml_diff>
--- a/THESIS DOCUMENTATION/FALCON Sensor Approval List for Panel.docx
+++ b/THESIS DOCUMENTATION/FALCON Sensor Approval List for Panel.docx
@@ -1902,7 +1902,7 @@
                 <w:b/>
                 <w:sz w:val="16"/>
               </w:rPr>
-              <w:t>Recommended item: Mini waterproof solar panel, about 3W-10W for the compact buoy; choose 5V, 6V, or 12V based on the final battery and charger design</w:t>
+              <w:t>Recommended item: DIY mini solar panel or small solar cell module, about 3W-10W for the compact buoy; choose 5V, 6V, or 12V based on the final battery and charger design</w:t>
             </w:r>
             <w:r>
               <w:rPr>
@@ -1919,7 +1919,7 @@
                 <w:b/>
                 <w:sz w:val="16"/>
               </w:rPr>
-              <w:t>Planning price: Mini solar panels are around PHP 188-249 for 3W-5W class; larger 12V kits cost more and may be too big for the compact buoy</w:t>
+              <w:t>Planning price: DIY mini solar panels / small solar cell modules are commonly available online around PHP 188-249 for 3W-5W class; larger 12V kits cost more and may be too big for the compact buoy</w:t>
             </w:r>
             <w:r>
               <w:rPr>
@@ -1936,7 +1936,7 @@
                 <w:b/>
                 <w:sz w:val="16"/>
               </w:rPr>
-              <w:t>Buy from or verify at: Shopee 5V/5W and 3W mini solar panel listings; Lazada 6V/5W mini solar panel listings</w:t>
+              <w:t>Buy from or verify at: Shopee/Lazada DIY mini solar panel, 5V/5W, 6V/5W, and small solar cell module listings</w:t>
             </w:r>
             <w:r>
               <w:rPr>
@@ -1953,7 +1953,7 @@
                 <w:b/>
                 <w:sz w:val="16"/>
               </w:rPr>
-              <w:t>Approval note: Add to approval list, but keep it physically small. The compact buoy should use a mini panel first; final wattage depends on measured daily load, available top-deck area, sun exposure, and whether the night beacon has its own solar panel.</w:t>
+              <w:t>Approval note: Add to approval list, but keep it physically small. DIY mini solar panels are acceptable for proposal validation if they are sealed or protected. Final wattage depends on measured daily load, available top-deck area, sun exposure, and whether the night beacon has its own solar panel.</w:t>
             </w:r>
             <w:r>
               <w:rPr>
@@ -3717,7 +3717,7 @@
               <w:rPr>
                 <w:sz w:val="14"/>
               </w:rPr>
-              <w:t>Small PWM controller for 12 V battery tests</w:t>
+              <w:t>Small solar charger module matched to the DIY panel and battery</w:t>
             </w:r>
           </w:p>
         </w:tc>
@@ -3813,7 +3813,7 @@
               <w:rPr>
                 <w:sz w:val="14"/>
               </w:rPr>
-              <w:t>Low-cost solar net marker light</w:t>
+              <w:t>DIY mini solar panel / small solar cell module</w:t>
             </w:r>
           </w:p>
         </w:tc>
@@ -4547,6 +4547,28 @@
         <w:t>6V/5W solar panel tag: https://www.lazada.com.ph/tag/6v-5w-solar-panel/</w:t>
       </w:r>
     </w:p>
+    <w:p>
+      <w:pPr>
+        <w:pStyle w:val="ListBullet"/>
+      </w:pPr>
+      <w:r>
+        <w:rPr>
+          <w:sz w:val="14"/>
+        </w:rPr>
+        <w:t>DIY solar panel search: https://shopee.ph/list/diy%20solar%20panel</w:t>
+      </w:r>
+    </w:p>
+    <w:p>
+      <w:pPr>
+        <w:pStyle w:val="ListBullet"/>
+      </w:pPr>
+      <w:r>
+        <w:rPr>
+          <w:sz w:val="14"/>
+        </w:rPr>
+        <w:t>Small solar cell module search: https://shopee.ph/list/small%20solar%20cell</w:t>
+      </w:r>
+    </w:p>
     <w:sectPr>
       <w:footerReference w:type="default" r:id="rId23"/>
       <w:pgSz w:w="11909" w:h="16834"/>

</xml_diff>

<commit_message>
Update solar panel approval options
</commit_message>
<xml_diff>
--- a/THESIS DOCUMENTATION/FALCON Sensor Approval List for Panel.docx
+++ b/THESIS DOCUMENTATION/FALCON Sensor Approval List for Panel.docx
@@ -79,6 +79,7 @@
       <w:tr>
         <w:trPr>
           <w:tblHeader w:val="true"/>
+          <w:cantSplit/>
         </w:trPr>
         <w:tc>
           <w:tcPr>
@@ -186,6 +187,9 @@
         </w:tc>
       </w:tr>
       <w:tr>
+        <w:trPr>
+          <w:cantSplit/>
+        </w:trPr>
         <w:tc>
           <w:tcPr>
             <w:tcW w:type="dxa" w:w="1944"/>
@@ -284,6 +288,9 @@
         </w:tc>
       </w:tr>
       <w:tr>
+        <w:trPr>
+          <w:cantSplit/>
+        </w:trPr>
         <w:tc>
           <w:tcPr>
             <w:tcW w:type="dxa" w:w="1944"/>
@@ -378,6 +385,9 @@
         </w:tc>
       </w:tr>
       <w:tr>
+        <w:trPr>
+          <w:cantSplit/>
+        </w:trPr>
         <w:tc>
           <w:tcPr>
             <w:tcW w:type="dxa" w:w="1944"/>
@@ -509,6 +519,9 @@
         <w:gridCol w:w="5162"/>
       </w:tblGrid>
       <w:tr>
+        <w:trPr>
+          <w:cantSplit/>
+        </w:trPr>
         <w:tc>
           <w:tcPr>
             <w:tcW w:type="dxa" w:w="2736"/>
@@ -721,6 +734,9 @@
         <w:gridCol w:w="5162"/>
       </w:tblGrid>
       <w:tr>
+        <w:trPr>
+          <w:cantSplit/>
+        </w:trPr>
         <w:tc>
           <w:tcPr>
             <w:tcW w:type="dxa" w:w="2736"/>
@@ -933,6 +949,9 @@
         <w:gridCol w:w="5162"/>
       </w:tblGrid>
       <w:tr>
+        <w:trPr>
+          <w:cantSplit/>
+        </w:trPr>
         <w:tc>
           <w:tcPr>
             <w:tcW w:type="dxa" w:w="2736"/>
@@ -1145,6 +1164,9 @@
         <w:gridCol w:w="5162"/>
       </w:tblGrid>
       <w:tr>
+        <w:trPr>
+          <w:cantSplit/>
+        </w:trPr>
         <w:tc>
           <w:tcPr>
             <w:tcW w:type="dxa" w:w="2736"/>
@@ -1357,6 +1379,9 @@
         <w:gridCol w:w="5162"/>
       </w:tblGrid>
       <w:tr>
+        <w:trPr>
+          <w:cantSplit/>
+        </w:trPr>
         <w:tc>
           <w:tcPr>
             <w:tcW w:type="dxa" w:w="2736"/>
@@ -1569,6 +1594,9 @@
         <w:gridCol w:w="5162"/>
       </w:tblGrid>
       <w:tr>
+        <w:trPr>
+          <w:cantSplit/>
+        </w:trPr>
         <w:tc>
           <w:tcPr>
             <w:tcW w:type="dxa" w:w="2736"/>
@@ -1781,6 +1809,9 @@
         <w:gridCol w:w="5162"/>
       </w:tblGrid>
       <w:tr>
+        <w:trPr>
+          <w:cantSplit/>
+        </w:trPr>
         <w:tc>
           <w:tcPr>
             <w:tcW w:type="dxa" w:w="2736"/>
@@ -1802,7 +1833,7 @@
               <w:drawing>
                 <wp:inline xmlns:a="http://schemas.openxmlformats.org/drawingml/2006/main" xmlns:pic="http://schemas.openxmlformats.org/drawingml/2006/picture">
                   <wp:extent cx="1417320" cy="984078"/>
-                  <wp:docPr id="7" name="Picture 7"/>
+                  <wp:docPr id="14" name="Picture 14"/>
                   <wp:cNvGraphicFramePr>
                     <a:graphicFrameLocks noChangeAspect="1"/>
                   </wp:cNvGraphicFramePr>
@@ -1810,11 +1841,11 @@
                     <a:graphicData uri="http://schemas.openxmlformats.org/drawingml/2006/picture">
                       <pic:pic>
                         <pic:nvPicPr>
-                          <pic:cNvPr id="0" name="solar_panel.png"/>
+                          <pic:cNvPr id="0" name="solar_panel_mini_diy.png"/>
                           <pic:cNvPicPr/>
                         </pic:nvPicPr>
                         <pic:blipFill>
-                          <a:blip r:embed="rId15"/>
+                          <a:blip r:embed="rId24"/>
                           <a:stretch>
                             <a:fillRect/>
                           </a:stretch>
@@ -1835,130 +1866,89 @@
           </w:p>
         </w:tc>
         <w:tc>
-          <w:tcPr>
-            <w:tcW w:type="dxa" w:w="7488"/>
-            <w:tcMar>
-              <w:top w:w="95" w:type="dxa"/>
-              <w:start w:w="95" w:type="dxa"/>
-              <w:bottom w:w="95" w:type="dxa"/>
-              <w:end w:w="95" w:type="dxa"/>
-            </w:tcMar>
-            <w:vAlign w:val="center"/>
-          </w:tcPr>
           <w:p>
-            <w:pPr>
-              <w:spacing w:after="20" w:line="245" w:lineRule="auto"/>
-            </w:pPr>
             <w:r>
               <w:rPr>
                 <w:b/>
-                <w:sz w:val="16"/>
               </w:rPr>
               <w:t>Solar panel</w:t>
             </w:r>
           </w:p>
           <w:p>
-            <w:pPr>
-              <w:spacing w:after="20" w:line="245" w:lineRule="auto"/>
-            </w:pPr>
             <w:r>
               <w:rPr>
                 <w:b/>
-                <w:sz w:val="16"/>
               </w:rPr>
               <w:t xml:space="preserve">Group: </w:t>
             </w:r>
             <w:r>
-              <w:rPr>
-                <w:sz w:val="16"/>
-              </w:rPr>
               <w:t>Power system</w:t>
             </w:r>
           </w:p>
           <w:p>
-            <w:pPr>
-              <w:spacing w:after="20" w:line="245" w:lineRule="auto"/>
-            </w:pPr>
             <w:r>
               <w:rPr>
                 <w:b/>
-                <w:sz w:val="16"/>
               </w:rPr>
               <w:t xml:space="preserve">Priority: </w:t>
             </w:r>
             <w:r>
-              <w:rPr>
-                <w:sz w:val="16"/>
-              </w:rPr>
               <w:t>Required power</w:t>
             </w:r>
           </w:p>
           <w:p>
-            <w:pPr>
-              <w:spacing w:after="20" w:line="245" w:lineRule="auto"/>
-            </w:pPr>
             <w:r>
               <w:rPr>
                 <w:b/>
-                <w:sz w:val="16"/>
               </w:rPr>
-              <w:t>Recommended item: DIY mini solar panel or small solar cell module, about 3W-10W for the compact buoy; choose 5V, 6V, or 12V based on the final battery and charger design</w:t>
+              <w:t xml:space="preserve">Recommended item: </w:t>
             </w:r>
             <w:r>
-              <w:rPr>
-                <w:sz w:val="16"/>
-              </w:rPr>
+              <w:t>Compact DIY solar panel set. Best approval option is one 3 W-5 W mini panel if the buoy top deck can fit it. If using the 5.5 V / 0.99 W round mini panel from the design reference, use 2-4 pieces as the minimum practical set; 1 piece is for display/trickle charging only, not the full buoy load.</w:t>
             </w:r>
           </w:p>
           <w:p>
-            <w:pPr>
-              <w:spacing w:after="20" w:line="245" w:lineRule="auto"/>
-            </w:pPr>
             <w:r>
               <w:rPr>
                 <w:b/>
-                <w:sz w:val="16"/>
               </w:rPr>
-              <w:t>Planning price: DIY mini solar panels / small solar cell modules are commonly available online around PHP 188-249 for 3W-5W class; larger 12V kits cost more and may be too big for the compact buoy</w:t>
+              <w:t xml:space="preserve">Panel quantity guide: </w:t>
             </w:r>
             <w:r>
-              <w:rPr>
-                <w:sz w:val="16"/>
-              </w:rPr>
+              <w:t>1 x 0.99 W = shape/design reference only; 2 x 0.99 W = very low-power backup and slow charging; 3-4 x 0.99 W = better compact array if the buoy has space; 1 x 3 W-5 W = recommended simple approval choice; 1 x 10 W = only if the buoy grows bigger.</w:t>
             </w:r>
           </w:p>
           <w:p>
-            <w:pPr>
-              <w:spacing w:after="20" w:line="245" w:lineRule="auto"/>
-            </w:pPr>
             <w:r>
               <w:rPr>
                 <w:b/>
-                <w:sz w:val="16"/>
               </w:rPr>
-              <w:t>Buy from or verify at: Shopee/Lazada DIY mini solar panel, 5V/5W, 6V/5W, and small solar cell module listings</w:t>
+              <w:t xml:space="preserve">Planning price: </w:t>
             </w:r>
             <w:r>
-              <w:rPr>
-                <w:sz w:val="16"/>
-              </w:rPr>
+              <w:t>0.99 W round mini panel around PHP 117 each, so 2-4 pieces cost about PHP 235-470; 12 V / 1.5 W mini panel around PHP 72; 6 V / 3.3 W mini panel around PHP 230; 5 V-6 V / 5 W mini panels commonly around PHP 186-339 depending size and seller; larger 10 W-12 V kits cost more and may be too big for the compact buoy.</w:t>
             </w:r>
           </w:p>
           <w:p>
-            <w:pPr>
-              <w:spacing w:after="20" w:line="245" w:lineRule="auto"/>
-            </w:pPr>
             <w:r>
               <w:rPr>
                 <w:b/>
-                <w:sz w:val="16"/>
               </w:rPr>
-              <w:t>Approval note: Add to approval list, but keep it physically small. DIY mini solar panels are acceptable for proposal validation if they are sealed or protected. Final wattage depends on measured daily load, available top-deck area, sun exposure, and whether the night beacon has its own solar panel.</w:t>
+              <w:t xml:space="preserve">Buy from or verify at: </w:t>
             </w:r>
             <w:r>
+              <w:t>Google Shopping / AliExpress 5.5 V 0.99 W round mini panel; Shopee/Lazada 5 V/5 W, 6 V/5 W, 6 V/3 W, and small solar cell module listings.</w:t>
+            </w:r>
+          </w:p>
+          <w:p>
+            <w:r>
               <w:rPr>
-                <w:sz w:val="16"/>
+                <w:b/>
               </w:rPr>
+              <w:t xml:space="preserve">Approval note: </w:t>
+            </w:r>
+            <w:r>
+              <w:t>Add to approval list, but do not rely on a single 0.99 W panel for the full buoy. Final wattage depends on measured ESP32, GPS, wind sensor, pressure interface, internet module, and night beacon load. Keep the panel sealed/protected and match it with a proper charger and BMS.</w:t>
             </w:r>
           </w:p>
         </w:tc>
@@ -1989,6 +1979,9 @@
         <w:gridCol w:w="5162"/>
       </w:tblGrid>
       <w:tr>
+        <w:trPr>
+          <w:cantSplit/>
+        </w:trPr>
         <w:tc>
           <w:tcPr>
             <w:tcW w:type="dxa" w:w="2736"/>
@@ -2201,6 +2194,9 @@
         <w:gridCol w:w="5162"/>
       </w:tblGrid>
       <w:tr>
+        <w:trPr>
+          <w:cantSplit/>
+        </w:trPr>
         <w:tc>
           <w:tcPr>
             <w:tcW w:type="dxa" w:w="2736"/>
@@ -2413,6 +2409,9 @@
         <w:gridCol w:w="5162"/>
       </w:tblGrid>
       <w:tr>
+        <w:trPr>
+          <w:cantSplit/>
+        </w:trPr>
         <w:tc>
           <w:tcPr>
             <w:tcW w:type="dxa" w:w="2736"/>
@@ -2625,6 +2624,9 @@
         <w:gridCol w:w="5162"/>
       </w:tblGrid>
       <w:tr>
+        <w:trPr>
+          <w:cantSplit/>
+        </w:trPr>
         <w:tc>
           <w:tcPr>
             <w:tcW w:type="dxa" w:w="2736"/>
@@ -2837,6 +2839,9 @@
         <w:gridCol w:w="5162"/>
       </w:tblGrid>
       <w:tr>
+        <w:trPr>
+          <w:cantSplit/>
+        </w:trPr>
         <w:tc>
           <w:tcPr>
             <w:tcW w:type="dxa" w:w="2736"/>
@@ -3049,6 +3054,9 @@
         <w:gridCol w:w="5162"/>
       </w:tblGrid>
       <w:tr>
+        <w:trPr>
+          <w:cantSplit/>
+        </w:trPr>
         <w:tc>
           <w:tcPr>
             <w:tcW w:type="dxa" w:w="2736"/>
@@ -3278,6 +3286,7 @@
       <w:tr>
         <w:trPr>
           <w:tblHeader w:val="true"/>
+          <w:cantSplit/>
         </w:trPr>
         <w:tc>
           <w:tcPr>
@@ -3385,6 +3394,9 @@
         </w:tc>
       </w:tr>
       <w:tr>
+        <w:trPr>
+          <w:cantSplit/>
+        </w:trPr>
         <w:tc>
           <w:tcPr>
             <w:tcW w:type="dxa" w:w="1800"/>
@@ -3483,6 +3495,9 @@
         </w:tc>
       </w:tr>
       <w:tr>
+        <w:trPr>
+          <w:cantSplit/>
+        </w:trPr>
         <w:tc>
           <w:tcPr>
             <w:tcW w:type="dxa" w:w="1800"/>
@@ -3577,6 +3592,9 @@
         </w:tc>
       </w:tr>
       <w:tr>
+        <w:trPr>
+          <w:cantSplit/>
+        </w:trPr>
         <w:tc>
           <w:tcPr>
             <w:tcW w:type="dxa" w:w="1800"/>
@@ -3675,6 +3693,9 @@
         </w:tc>
       </w:tr>
       <w:tr>
+        <w:trPr>
+          <w:cantSplit/>
+        </w:trPr>
         <w:tc>
           <w:tcPr>
             <w:tcW w:type="dxa" w:w="1800"/>
@@ -3769,6 +3790,9 @@
         </w:tc>
       </w:tr>
       <w:tr>
+        <w:trPr>
+          <w:cantSplit/>
+        </w:trPr>
         <w:tc>
           <w:tcPr>
             <w:tcW w:type="dxa" w:w="1800"/>
@@ -3867,6 +3891,9 @@
         </w:tc>
       </w:tr>
       <w:tr>
+        <w:trPr>
+          <w:cantSplit/>
+        </w:trPr>
         <w:tc>
           <w:tcPr>
             <w:tcW w:type="dxa" w:w="1800"/>
@@ -3961,6 +3988,9 @@
         </w:tc>
       </w:tr>
       <w:tr>
+        <w:trPr>
+          <w:cantSplit/>
+        </w:trPr>
         <w:tc>
           <w:tcPr>
             <w:tcW w:type="dxa" w:w="1800"/>

</xml_diff>

<commit_message>
Update buoy battery and solar sizing docs
</commit_message>
<xml_diff>
--- a/THESIS DOCUMENTATION/FALCON Sensor Approval List for Panel.docx
+++ b/THESIS DOCUMENTATION/FALCON Sensor Approval List for Panel.docx
@@ -2313,17 +2313,7 @@
             <w:vAlign w:val="center"/>
           </w:tcPr>
           <w:p>
-            <w:pPr>
-              <w:pStyle w:val="Normal"/>
-              <w:spacing w:before="0" w:after="0"/>
-              <w:jc w:val="left"/>
-              <w:rPr/>
-            </w:pPr>
-            <w:r>
-              <w:rPr>
-                <w:b w:val="false"/>
-                <w:sz w:val="13"/>
-              </w:rPr>
+            <w:r>
               <w:t>Rechargeable battery pack with BMS</w:t>
             </w:r>
           </w:p>
@@ -2341,17 +2331,7 @@
             <w:vAlign w:val="center"/>
           </w:tcPr>
           <w:p>
-            <w:pPr>
-              <w:pStyle w:val="Normal"/>
-              <w:spacing w:before="0" w:after="0"/>
-              <w:jc w:val="center"/>
-              <w:rPr/>
-            </w:pPr>
-            <w:r>
-              <w:rPr>
-                <w:b w:val="false"/>
-                <w:sz w:val="13"/>
-              </w:rPr>
+            <w:r>
               <w:t>1 pack</w:t>
             </w:r>
           </w:p>
@@ -2369,17 +2349,7 @@
             <w:vAlign w:val="center"/>
           </w:tcPr>
           <w:p>
-            <w:pPr>
-              <w:pStyle w:val="Normal"/>
-              <w:spacing w:before="0" w:after="0"/>
-              <w:jc w:val="center"/>
-              <w:rPr/>
-            </w:pPr>
-            <w:r>
-              <w:rPr>
-                <w:b w:val="false"/>
-                <w:sz w:val="13"/>
-              </w:rPr>
+            <w:r>
               <w:t>Required</w:t>
             </w:r>
           </w:p>
@@ -2397,18 +2367,8 @@
             <w:vAlign w:val="center"/>
           </w:tcPr>
           <w:p>
-            <w:pPr>
-              <w:pStyle w:val="Normal"/>
-              <w:spacing w:before="0" w:after="0"/>
-              <w:jc w:val="left"/>
-              <w:rPr/>
-            </w:pPr>
-            <w:r>
-              <w:rPr>
-                <w:b w:val="false"/>
-                <w:sz w:val="13"/>
-              </w:rPr>
-              <w:t>Small 12 V LiFePO4 pack or protected 18650 pack; final capacity after measured load.</w:t>
+            <w:r>
+              <w:t>Protected Li-ion/LiPo or 18650 pack with BMS; target 37-74 Wh class after measured load.</w:t>
             </w:r>
           </w:p>
         </w:tc>
@@ -2430,17 +2390,7 @@
             <w:vAlign w:val="center"/>
           </w:tcPr>
           <w:p>
-            <w:pPr>
-              <w:pStyle w:val="Normal"/>
-              <w:spacing w:before="0" w:after="0"/>
-              <w:jc w:val="left"/>
-              <w:rPr/>
-            </w:pPr>
-            <w:r>
-              <w:rPr>
-                <w:b w:val="false"/>
-                <w:sz w:val="13"/>
-              </w:rPr>
+            <w:r>
               <w:t>Compact solar panel set</w:t>
             </w:r>
           </w:p>
@@ -2458,18 +2408,8 @@
             <w:vAlign w:val="center"/>
           </w:tcPr>
           <w:p>
-            <w:pPr>
-              <w:pStyle w:val="Normal"/>
-              <w:spacing w:before="0" w:after="0"/>
-              <w:jc w:val="center"/>
-              <w:rPr/>
-            </w:pPr>
-            <w:r>
-              <w:rPr>
-                <w:b w:val="false"/>
-                <w:sz w:val="13"/>
-              </w:rPr>
-              <w:t>1 pc 3W-5W or 2-4 pcs 0.99W</w:t>
+            <w:r>
+              <w:t>6 pcs x 3 W panels</w:t>
             </w:r>
           </w:p>
         </w:tc>
@@ -2486,17 +2426,7 @@
             <w:vAlign w:val="center"/>
           </w:tcPr>
           <w:p>
-            <w:pPr>
-              <w:pStyle w:val="Normal"/>
-              <w:spacing w:before="0" w:after="0"/>
-              <w:jc w:val="center"/>
-              <w:rPr/>
-            </w:pPr>
-            <w:r>
-              <w:rPr>
-                <w:b w:val="false"/>
-                <w:sz w:val="13"/>
-              </w:rPr>
+            <w:r>
               <w:t>Required</w:t>
             </w:r>
           </w:p>
@@ -2514,18 +2444,8 @@
             <w:vAlign w:val="center"/>
           </w:tcPr>
           <w:p>
-            <w:pPr>
-              <w:pStyle w:val="Normal"/>
-              <w:spacing w:before="0" w:after="0"/>
-              <w:jc w:val="left"/>
-              <w:rPr/>
-            </w:pPr>
-            <w:r>
-              <w:rPr>
-                <w:b w:val="false"/>
-                <w:sz w:val="13"/>
-              </w:rPr>
-              <w:t>3W-5W preferred if deck can fit it; 0.99W panels need 2-4 pcs and are trickle/design only.</w:t>
+            <w:r>
+              <w:t>Six small 3 W panels for 18 W total nameplate capacity; arrange around buoy body/top faces.</w:t>
             </w:r>
           </w:p>
         </w:tc>
@@ -8980,28 +8900,7 @@
             <w:vAlign w:val="center"/>
           </w:tcPr>
           <w:p>
-            <w:pPr>
-              <w:pStyle w:val="Normal"/>
-              <w:widowControl/>
-              <w:suppressAutoHyphens w:val="true"/>
-              <w:spacing w:lineRule="auto" w:line="240" w:before="0" w:after="0"/>
-              <w:jc w:val="left"/>
-              <w:rPr>
-                <w:rFonts w:eastAsia="ＭＳ 明朝" w:cs=""/>
-                <w:kern w:val="0"/>
-                <w:szCs w:val="22"/>
-                <w:lang w:val="en-US" w:eastAsia="en-US" w:bidi="ar-SA"/>
-              </w:rPr>
-            </w:pPr>
-            <w:r>
-              <w:rPr>
-                <w:rFonts w:eastAsia="ＭＳ 明朝" w:cs=""/>
-                <w:b w:val="false"/>
-                <w:kern w:val="0"/>
-                <w:sz w:val="14"/>
-                <w:szCs w:val="22"/>
-                <w:lang w:val="en-US" w:eastAsia="en-US" w:bidi="ar-SA"/>
-              </w:rPr>
+            <w:r>
               <w:t>Rechargeable battery pack with BMS</w:t>
             </w:r>
           </w:p>
@@ -9019,28 +8918,7 @@
             <w:vAlign w:val="center"/>
           </w:tcPr>
           <w:p>
-            <w:pPr>
-              <w:pStyle w:val="Normal"/>
-              <w:widowControl/>
-              <w:suppressAutoHyphens w:val="true"/>
-              <w:spacing w:lineRule="auto" w:line="240" w:before="0" w:after="0"/>
-              <w:jc w:val="center"/>
-              <w:rPr>
-                <w:rFonts w:eastAsia="ＭＳ 明朝" w:cs=""/>
-                <w:kern w:val="0"/>
-                <w:szCs w:val="22"/>
-                <w:lang w:val="en-US" w:eastAsia="en-US" w:bidi="ar-SA"/>
-              </w:rPr>
-            </w:pPr>
-            <w:r>
-              <w:rPr>
-                <w:rFonts w:eastAsia="ＭＳ 明朝" w:cs=""/>
-                <w:b w:val="false"/>
-                <w:kern w:val="0"/>
-                <w:sz w:val="14"/>
-                <w:szCs w:val="22"/>
-                <w:lang w:val="en-US" w:eastAsia="en-US" w:bidi="ar-SA"/>
-              </w:rPr>
+            <w:r>
               <w:t>1 pack</w:t>
             </w:r>
           </w:p>
@@ -9058,28 +8936,7 @@
             <w:vAlign w:val="center"/>
           </w:tcPr>
           <w:p>
-            <w:pPr>
-              <w:pStyle w:val="Normal"/>
-              <w:widowControl/>
-              <w:suppressAutoHyphens w:val="true"/>
-              <w:spacing w:lineRule="auto" w:line="240" w:before="0" w:after="0"/>
-              <w:jc w:val="center"/>
-              <w:rPr>
-                <w:rFonts w:eastAsia="ＭＳ 明朝" w:cs=""/>
-                <w:kern w:val="0"/>
-                <w:szCs w:val="22"/>
-                <w:lang w:val="en-US" w:eastAsia="en-US" w:bidi="ar-SA"/>
-              </w:rPr>
-            </w:pPr>
-            <w:r>
-              <w:rPr>
-                <w:rFonts w:eastAsia="ＭＳ 明朝" w:cs=""/>
-                <w:b w:val="false"/>
-                <w:kern w:val="0"/>
-                <w:sz w:val="14"/>
-                <w:szCs w:val="22"/>
-                <w:lang w:val="en-US" w:eastAsia="en-US" w:bidi="ar-SA"/>
-              </w:rPr>
+            <w:r>
               <w:t>PHP 1,500-PHP 3,500</w:t>
             </w:r>
           </w:p>
@@ -9097,28 +8954,7 @@
             <w:vAlign w:val="center"/>
           </w:tcPr>
           <w:p>
-            <w:pPr>
-              <w:pStyle w:val="Normal"/>
-              <w:widowControl/>
-              <w:suppressAutoHyphens w:val="true"/>
-              <w:spacing w:lineRule="auto" w:line="240" w:before="0" w:after="0"/>
-              <w:jc w:val="center"/>
-              <w:rPr>
-                <w:rFonts w:eastAsia="ＭＳ 明朝" w:cs=""/>
-                <w:kern w:val="0"/>
-                <w:szCs w:val="22"/>
-                <w:lang w:val="en-US" w:eastAsia="en-US" w:bidi="ar-SA"/>
-              </w:rPr>
-            </w:pPr>
-            <w:r>
-              <w:rPr>
-                <w:rFonts w:eastAsia="ＭＳ 明朝" w:cs=""/>
-                <w:b w:val="false"/>
-                <w:kern w:val="0"/>
-                <w:sz w:val="14"/>
-                <w:szCs w:val="22"/>
-                <w:lang w:val="en-US" w:eastAsia="en-US" w:bidi="ar-SA"/>
-              </w:rPr>
+            <w:r>
               <w:t>PHP 1,500-PHP 3,500</w:t>
             </w:r>
           </w:p>
@@ -9136,29 +8972,8 @@
             <w:vAlign w:val="center"/>
           </w:tcPr>
           <w:p>
-            <w:pPr>
-              <w:pStyle w:val="Normal"/>
-              <w:widowControl/>
-              <w:suppressAutoHyphens w:val="true"/>
-              <w:spacing w:lineRule="auto" w:line="240" w:before="0" w:after="0"/>
-              <w:jc w:val="left"/>
-              <w:rPr>
-                <w:rFonts w:eastAsia="ＭＳ 明朝" w:cs=""/>
-                <w:kern w:val="0"/>
-                <w:szCs w:val="22"/>
-                <w:lang w:val="en-US" w:eastAsia="en-US" w:bidi="ar-SA"/>
-              </w:rPr>
-            </w:pPr>
-            <w:r>
-              <w:rPr>
-                <w:rFonts w:eastAsia="ＭＳ 明朝" w:cs=""/>
-                <w:b w:val="false"/>
-                <w:kern w:val="0"/>
-                <w:sz w:val="14"/>
-                <w:szCs w:val="22"/>
-                <w:lang w:val="en-US" w:eastAsia="en-US" w:bidi="ar-SA"/>
-              </w:rPr>
-              <w:t>Small 12 V LiFePO4 pack or protected 18650 pack; final capacity after measured load.</w:t>
+            <w:r>
+              <w:t>Protected Li-ion/LiPo or 18650 pack with BMS; target 37-74 Wh class after measured load.</w:t>
             </w:r>
           </w:p>
         </w:tc>
@@ -9180,28 +8995,7 @@
             <w:vAlign w:val="center"/>
           </w:tcPr>
           <w:p>
-            <w:pPr>
-              <w:pStyle w:val="Normal"/>
-              <w:widowControl/>
-              <w:suppressAutoHyphens w:val="true"/>
-              <w:spacing w:lineRule="auto" w:line="240" w:before="0" w:after="0"/>
-              <w:jc w:val="left"/>
-              <w:rPr>
-                <w:rFonts w:eastAsia="ＭＳ 明朝" w:cs=""/>
-                <w:kern w:val="0"/>
-                <w:szCs w:val="22"/>
-                <w:lang w:val="en-US" w:eastAsia="en-US" w:bidi="ar-SA"/>
-              </w:rPr>
-            </w:pPr>
-            <w:r>
-              <w:rPr>
-                <w:rFonts w:eastAsia="ＭＳ 明朝" w:cs=""/>
-                <w:b w:val="false"/>
-                <w:kern w:val="0"/>
-                <w:sz w:val="14"/>
-                <w:szCs w:val="22"/>
-                <w:lang w:val="en-US" w:eastAsia="en-US" w:bidi="ar-SA"/>
-              </w:rPr>
+            <w:r>
               <w:t>Compact solar panel set</w:t>
             </w:r>
           </w:p>
@@ -9219,40 +9013,8 @@
             <w:vAlign w:val="center"/>
           </w:tcPr>
           <w:p>
-            <w:pPr>
-              <w:pStyle w:val="Normal"/>
-              <w:widowControl/>
-              <w:suppressAutoHyphens w:val="true"/>
-              <w:spacing w:lineRule="auto" w:line="240" w:before="0" w:after="0"/>
-              <w:jc w:val="center"/>
-              <w:rPr>
-                <w:rFonts w:eastAsia="ＭＳ 明朝" w:cs=""/>
-                <w:kern w:val="0"/>
-                <w:szCs w:val="22"/>
-                <w:lang w:val="en-US" w:eastAsia="en-US" w:bidi="ar-SA"/>
-              </w:rPr>
-            </w:pPr>
-            <w:r>
-              <w:rPr>
-                <w:rFonts w:eastAsia="ＭＳ 明朝" w:cs=""/>
-                <w:b w:val="false"/>
-                <w:kern w:val="0"/>
-                <w:sz w:val="14"/>
-                <w:szCs w:val="22"/>
-                <w:lang w:val="en-US" w:eastAsia="en-US" w:bidi="ar-SA"/>
-              </w:rPr>
-              <w:t>10</w:t>
-            </w:r>
-            <w:r>
-              <w:rPr>
-                <w:rFonts w:eastAsia="ＭＳ 明朝" w:cs=""/>
-                <w:b w:val="false"/>
-                <w:kern w:val="0"/>
-                <w:sz w:val="14"/>
-                <w:szCs w:val="22"/>
-                <w:lang w:val="en-US" w:eastAsia="en-US" w:bidi="ar-SA"/>
-              </w:rPr>
-              <w:t xml:space="preserve"> pc 3W-5W</w:t>
+            <w:r>
+              <w:t>6 pcs x 3 W panels</w:t>
             </w:r>
           </w:p>
         </w:tc>
@@ -9269,29 +9031,8 @@
             <w:vAlign w:val="center"/>
           </w:tcPr>
           <w:p>
-            <w:pPr>
-              <w:pStyle w:val="Normal"/>
-              <w:widowControl/>
-              <w:suppressAutoHyphens w:val="true"/>
-              <w:spacing w:lineRule="auto" w:line="240" w:before="0" w:after="0"/>
-              <w:jc w:val="center"/>
-              <w:rPr>
-                <w:rFonts w:eastAsia="ＭＳ 明朝" w:cs=""/>
-                <w:kern w:val="0"/>
-                <w:szCs w:val="22"/>
-                <w:lang w:val="en-US" w:eastAsia="en-US" w:bidi="ar-SA"/>
-              </w:rPr>
-            </w:pPr>
-            <w:r>
-              <w:rPr>
-                <w:rFonts w:eastAsia="ＭＳ 明朝" w:cs=""/>
-                <w:b w:val="false"/>
-                <w:kern w:val="0"/>
-                <w:sz w:val="14"/>
-                <w:szCs w:val="22"/>
-                <w:lang w:val="en-US" w:eastAsia="en-US" w:bidi="ar-SA"/>
-              </w:rPr>
-              <w:t>PHP 235-PHP 500</w:t>
+            <w:r>
+              <w:t>PHP 235-PHP 500 each</w:t>
             </w:r>
           </w:p>
         </w:tc>
@@ -9308,29 +9049,8 @@
             <w:vAlign w:val="center"/>
           </w:tcPr>
           <w:p>
-            <w:pPr>
-              <w:pStyle w:val="Normal"/>
-              <w:widowControl/>
-              <w:suppressAutoHyphens w:val="true"/>
-              <w:spacing w:lineRule="auto" w:line="240" w:before="0" w:after="0"/>
-              <w:jc w:val="center"/>
-              <w:rPr>
-                <w:rFonts w:eastAsia="ＭＳ 明朝" w:cs=""/>
-                <w:kern w:val="0"/>
-                <w:szCs w:val="22"/>
-                <w:lang w:val="en-US" w:eastAsia="en-US" w:bidi="ar-SA"/>
-              </w:rPr>
-            </w:pPr>
-            <w:r>
-              <w:rPr>
-                <w:rFonts w:eastAsia="ＭＳ 明朝" w:cs=""/>
-                <w:b w:val="false"/>
-                <w:kern w:val="0"/>
-                <w:sz w:val="14"/>
-                <w:szCs w:val="22"/>
-                <w:lang w:val="en-US" w:eastAsia="en-US" w:bidi="ar-SA"/>
-              </w:rPr>
-              <w:t>PHP 235-PHP 500</w:t>
+            <w:r>
+              <w:t>PHP 1,410-PHP 3,000</w:t>
             </w:r>
           </w:p>
         </w:tc>
@@ -9347,40 +9067,8 @@
             <w:vAlign w:val="center"/>
           </w:tcPr>
           <w:p>
-            <w:pPr>
-              <w:pStyle w:val="Normal"/>
-              <w:widowControl/>
-              <w:suppressAutoHyphens w:val="true"/>
-              <w:spacing w:lineRule="auto" w:line="240" w:before="0" w:after="0"/>
-              <w:jc w:val="left"/>
-              <w:rPr>
-                <w:rFonts w:eastAsia="ＭＳ 明朝" w:cs=""/>
-                <w:kern w:val="0"/>
-                <w:szCs w:val="22"/>
-                <w:lang w:val="en-US" w:eastAsia="en-US" w:bidi="ar-SA"/>
-              </w:rPr>
-            </w:pPr>
-            <w:r>
-              <w:rPr>
-                <w:rFonts w:eastAsia="ＭＳ 明朝" w:cs=""/>
-                <w:b w:val="false"/>
-                <w:kern w:val="0"/>
-                <w:sz w:val="14"/>
-                <w:szCs w:val="22"/>
-                <w:lang w:val="en-US" w:eastAsia="en-US" w:bidi="ar-SA"/>
-              </w:rPr>
-              <w:t xml:space="preserve">10 </w:t>
-            </w:r>
-            <w:r>
-              <w:rPr>
-                <w:rFonts w:eastAsia="ＭＳ 明朝" w:cs=""/>
-                <w:b w:val="false"/>
-                <w:kern w:val="0"/>
-                <w:sz w:val="14"/>
-                <w:szCs w:val="22"/>
-                <w:lang w:val="en-US" w:eastAsia="en-US" w:bidi="ar-SA"/>
-              </w:rPr>
-              <w:t xml:space="preserve">3W-5W preferred if deck can fit it; </w:t>
+            <w:r>
+              <w:t>Six small 3 W panels for 18 W total nameplate capacity; arrange around buoy body/top faces.</w:t>
             </w:r>
           </w:p>
         </w:tc>
@@ -15887,245 +15575,20 @@
             <w:vAlign w:val="center"/>
           </w:tcPr>
           <w:p>
-            <w:pPr>
-              <w:pStyle w:val="Normal"/>
-              <w:widowControl/>
-              <w:suppressAutoHyphens w:val="true"/>
-              <w:spacing w:lineRule="auto" w:line="240" w:before="0" w:after="0"/>
-              <w:jc w:val="left"/>
-              <w:rPr>
-                <w:rFonts w:eastAsia="ＭＳ 明朝" w:cs=""/>
-                <w:kern w:val="0"/>
-                <w:szCs w:val="22"/>
-                <w:lang w:val="en-US" w:eastAsia="en-US" w:bidi="ar-SA"/>
-              </w:rPr>
-            </w:pPr>
-            <w:r>
-              <w:rPr>
-                <w:rFonts w:eastAsia="ＭＳ 明朝" w:cs=""/>
-                <w:b/>
-                <w:kern w:val="0"/>
-                <w:sz w:val="20"/>
-                <w:szCs w:val="22"/>
-                <w:lang w:val="en-US" w:eastAsia="en-US" w:bidi="ar-SA"/>
-              </w:rPr>
+            <w:r>
               <w:t>Rechargeable battery pack</w:t>
-            </w:r>
-          </w:p>
-          <w:p>
-            <w:pPr>
-              <w:pStyle w:val="Normal"/>
-              <w:widowControl/>
-              <w:suppressAutoHyphens w:val="true"/>
-              <w:spacing w:lineRule="auto" w:line="240" w:before="0" w:after="0"/>
-              <w:jc w:val="left"/>
-              <w:rPr>
-                <w:rFonts w:eastAsia="ＭＳ 明朝" w:cs=""/>
-                <w:kern w:val="0"/>
-                <w:szCs w:val="22"/>
-                <w:lang w:val="en-US" w:eastAsia="en-US" w:bidi="ar-SA"/>
-              </w:rPr>
-            </w:pPr>
-            <w:r>
-              <w:rPr>
-                <w:rFonts w:eastAsia="ＭＳ 明朝" w:cs=""/>
-                <w:b/>
-                <w:kern w:val="0"/>
-                <w:sz w:val="16"/>
-                <w:szCs w:val="22"/>
-                <w:lang w:val="en-US" w:eastAsia="en-US" w:bidi="ar-SA"/>
-              </w:rPr>
-              <w:t xml:space="preserve">Group: </w:t>
-            </w:r>
-            <w:r>
-              <w:rPr>
-                <w:rFonts w:eastAsia="ＭＳ 明朝" w:cs=""/>
-                <w:kern w:val="0"/>
-                <w:sz w:val="16"/>
-                <w:szCs w:val="22"/>
-                <w:lang w:val="en-US" w:eastAsia="en-US" w:bidi="ar-SA"/>
-              </w:rPr>
-              <w:t>Power system</w:t>
-            </w:r>
-          </w:p>
-          <w:p>
-            <w:pPr>
-              <w:pStyle w:val="Normal"/>
-              <w:widowControl/>
-              <w:suppressAutoHyphens w:val="true"/>
-              <w:spacing w:lineRule="auto" w:line="240" w:before="0" w:after="0"/>
-              <w:jc w:val="left"/>
-              <w:rPr>
-                <w:rFonts w:eastAsia="ＭＳ 明朝" w:cs=""/>
-                <w:kern w:val="0"/>
-                <w:szCs w:val="22"/>
-                <w:lang w:val="en-US" w:eastAsia="en-US" w:bidi="ar-SA"/>
-              </w:rPr>
-            </w:pPr>
-            <w:r>
-              <w:rPr>
-                <w:rFonts w:eastAsia="ＭＳ 明朝" w:cs=""/>
-                <w:b/>
-                <w:kern w:val="0"/>
-                <w:sz w:val="16"/>
-                <w:szCs w:val="22"/>
-                <w:lang w:val="en-US" w:eastAsia="en-US" w:bidi="ar-SA"/>
-              </w:rPr>
-              <w:t xml:space="preserve">Priority: </w:t>
-            </w:r>
-            <w:r>
-              <w:rPr>
-                <w:rFonts w:eastAsia="ＭＳ 明朝" w:cs=""/>
-                <w:kern w:val="0"/>
-                <w:sz w:val="16"/>
-                <w:szCs w:val="22"/>
-                <w:lang w:val="en-US" w:eastAsia="en-US" w:bidi="ar-SA"/>
-              </w:rPr>
-              <w:t>Required</w:t>
-            </w:r>
-          </w:p>
-          <w:p>
-            <w:pPr>
-              <w:pStyle w:val="Normal"/>
-              <w:widowControl/>
-              <w:suppressAutoHyphens w:val="true"/>
-              <w:spacing w:lineRule="auto" w:line="240" w:before="0" w:after="0"/>
-              <w:jc w:val="left"/>
-              <w:rPr>
-                <w:rFonts w:eastAsia="ＭＳ 明朝" w:cs=""/>
-                <w:kern w:val="0"/>
-                <w:szCs w:val="22"/>
-                <w:lang w:val="en-US" w:eastAsia="en-US" w:bidi="ar-SA"/>
-              </w:rPr>
-            </w:pPr>
-            <w:r>
-              <w:rPr>
-                <w:rFonts w:eastAsia="ＭＳ 明朝" w:cs=""/>
-                <w:b/>
-                <w:kern w:val="0"/>
-                <w:sz w:val="16"/>
-                <w:szCs w:val="22"/>
-                <w:lang w:val="en-US" w:eastAsia="en-US" w:bidi="ar-SA"/>
-              </w:rPr>
-              <w:t xml:space="preserve">Recommended item: </w:t>
-            </w:r>
-            <w:r>
-              <w:rPr>
-                <w:rFonts w:eastAsia="ＭＳ 明朝" w:cs=""/>
-                <w:kern w:val="0"/>
-                <w:sz w:val="16"/>
-                <w:szCs w:val="22"/>
-                <w:lang w:val="en-US" w:eastAsia="en-US" w:bidi="ar-SA"/>
-              </w:rPr>
-              <w:t>Small 12 V LiFePO4 pack with BMS or protected 18650 pack.</w:t>
-            </w:r>
-          </w:p>
-          <w:p>
-            <w:pPr>
-              <w:pStyle w:val="Normal"/>
-              <w:widowControl/>
-              <w:suppressAutoHyphens w:val="true"/>
-              <w:spacing w:lineRule="auto" w:line="240" w:before="0" w:after="0"/>
-              <w:jc w:val="left"/>
-              <w:rPr>
-                <w:rFonts w:eastAsia="ＭＳ 明朝" w:cs=""/>
-                <w:kern w:val="0"/>
-                <w:szCs w:val="22"/>
-                <w:lang w:val="en-US" w:eastAsia="en-US" w:bidi="ar-SA"/>
-              </w:rPr>
-            </w:pPr>
-            <w:r>
-              <w:rPr>
-                <w:rFonts w:eastAsia="ＭＳ 明朝" w:cs=""/>
-                <w:b/>
-                <w:kern w:val="0"/>
-                <w:sz w:val="16"/>
-                <w:szCs w:val="22"/>
-                <w:lang w:val="en-US" w:eastAsia="en-US" w:bidi="ar-SA"/>
-              </w:rPr>
-              <w:t xml:space="preserve">Planning price: </w:t>
-            </w:r>
-            <w:r>
-              <w:rPr>
-                <w:rFonts w:eastAsia="ＭＳ 明朝" w:cs=""/>
-                <w:kern w:val="0"/>
-                <w:sz w:val="16"/>
-                <w:szCs w:val="22"/>
-                <w:lang w:val="en-US" w:eastAsia="en-US" w:bidi="ar-SA"/>
-              </w:rPr>
-              <w:t>PHP 1,500-3,500+ planning range.</w:t>
-            </w:r>
-          </w:p>
-          <w:p>
-            <w:pPr>
-              <w:pStyle w:val="Normal"/>
-              <w:widowControl/>
-              <w:suppressAutoHyphens w:val="true"/>
-              <w:spacing w:lineRule="auto" w:line="240" w:before="0" w:after="0"/>
-              <w:jc w:val="left"/>
-              <w:rPr>
-                <w:rFonts w:eastAsia="ＭＳ 明朝" w:cs=""/>
-                <w:kern w:val="0"/>
-                <w:szCs w:val="22"/>
-                <w:lang w:val="en-US" w:eastAsia="en-US" w:bidi="ar-SA"/>
-              </w:rPr>
-            </w:pPr>
-            <w:r>
-              <w:rPr>
-                <w:rFonts w:eastAsia="ＭＳ 明朝" w:cs=""/>
-                <w:b/>
-                <w:kern w:val="0"/>
-                <w:sz w:val="16"/>
-                <w:szCs w:val="22"/>
-                <w:lang w:val="en-US" w:eastAsia="en-US" w:bidi="ar-SA"/>
-              </w:rPr>
-              <w:t xml:space="preserve">Buy from or verify at: </w:t>
-            </w:r>
-            <w:r>
-              <w:rPr>
-                <w:rFonts w:eastAsia="ＭＳ 明朝" w:cs=""/>
-                <w:kern w:val="0"/>
-                <w:sz w:val="16"/>
-                <w:szCs w:val="22"/>
-                <w:lang w:val="en-US" w:eastAsia="en-US" w:bidi="ar-SA"/>
-              </w:rPr>
-              <w:t>Shopee/Lazada battery and BMS listings.</w:t>
-            </w:r>
-          </w:p>
-          <w:p>
-            <w:pPr>
-              <w:pStyle w:val="Normal"/>
-              <w:widowControl/>
-              <w:suppressAutoHyphens w:val="true"/>
-              <w:spacing w:lineRule="auto" w:line="240" w:before="0" w:after="0"/>
-              <w:jc w:val="left"/>
-              <w:rPr>
-                <w:rFonts w:eastAsia="ＭＳ 明朝" w:cs=""/>
-                <w:kern w:val="0"/>
-                <w:szCs w:val="22"/>
-                <w:lang w:val="en-US" w:eastAsia="en-US" w:bidi="ar-SA"/>
-              </w:rPr>
-            </w:pPr>
-            <w:r>
-              <w:rPr>
-                <w:rFonts w:eastAsia="ＭＳ 明朝" w:cs=""/>
-                <w:b/>
-                <w:kern w:val="0"/>
-                <w:sz w:val="16"/>
-                <w:szCs w:val="22"/>
-                <w:lang w:val="en-US" w:eastAsia="en-US" w:bidi="ar-SA"/>
-              </w:rPr>
-              <w:t xml:space="preserve">Approval note: </w:t>
-            </w:r>
-            <w:r>
-              <w:rPr>
-                <w:rFonts w:eastAsia="ＭＳ 明朝" w:cs=""/>
-                <w:kern w:val="0"/>
-                <w:sz w:val="16"/>
-                <w:szCs w:val="22"/>
-                <w:lang w:val="en-US" w:eastAsia="en-US" w:bidi="ar-SA"/>
-              </w:rPr>
-              <w:t>Final capacity depends on measured load.</w:t>
+              <w:br/>
+              <w:t>Group: Power system</w:t>
+              <w:br/>
+              <w:t>Priority: Required</w:t>
+              <w:br/>
+              <w:t>Recommended item: Protected Li-ion/LiPo or 18650 battery pack with BMS, target 37-74 Wh class after measured load.</w:t>
+              <w:br/>
+              <w:t>Planning price: PHP 1,500-3,500 planning range.</w:t>
+              <w:br/>
+              <w:t>Buy from or verify at: Shopee/Lazada battery and BMS listings.</w:t>
+              <w:br/>
+              <w:t>Approval note: Final voltage follows charger/regulator and module requirements; capacity is validated by measured load.</w:t>
             </w:r>
           </w:p>
         </w:tc>
@@ -16244,245 +15707,20 @@
             <w:vAlign w:val="center"/>
           </w:tcPr>
           <w:p>
-            <w:pPr>
-              <w:pStyle w:val="Normal"/>
-              <w:widowControl/>
-              <w:suppressAutoHyphens w:val="true"/>
-              <w:spacing w:lineRule="auto" w:line="240" w:before="0" w:after="0"/>
-              <w:jc w:val="left"/>
-              <w:rPr>
-                <w:rFonts w:eastAsia="ＭＳ 明朝" w:cs=""/>
-                <w:kern w:val="0"/>
-                <w:szCs w:val="22"/>
-                <w:lang w:val="en-US" w:eastAsia="en-US" w:bidi="ar-SA"/>
-              </w:rPr>
-            </w:pPr>
-            <w:r>
-              <w:rPr>
-                <w:rFonts w:eastAsia="ＭＳ 明朝" w:cs=""/>
-                <w:b/>
-                <w:kern w:val="0"/>
-                <w:sz w:val="20"/>
-                <w:szCs w:val="22"/>
-                <w:lang w:val="en-US" w:eastAsia="en-US" w:bidi="ar-SA"/>
-              </w:rPr>
-              <w:t>Compact solar panel</w:t>
-            </w:r>
-          </w:p>
-          <w:p>
-            <w:pPr>
-              <w:pStyle w:val="Normal"/>
-              <w:widowControl/>
-              <w:suppressAutoHyphens w:val="true"/>
-              <w:spacing w:lineRule="auto" w:line="240" w:before="0" w:after="0"/>
-              <w:jc w:val="left"/>
-              <w:rPr>
-                <w:rFonts w:eastAsia="ＭＳ 明朝" w:cs=""/>
-                <w:kern w:val="0"/>
-                <w:szCs w:val="22"/>
-                <w:lang w:val="en-US" w:eastAsia="en-US" w:bidi="ar-SA"/>
-              </w:rPr>
-            </w:pPr>
-            <w:r>
-              <w:rPr>
-                <w:rFonts w:eastAsia="ＭＳ 明朝" w:cs=""/>
-                <w:b/>
-                <w:kern w:val="0"/>
-                <w:sz w:val="16"/>
-                <w:szCs w:val="22"/>
-                <w:lang w:val="en-US" w:eastAsia="en-US" w:bidi="ar-SA"/>
-              </w:rPr>
-              <w:t xml:space="preserve">Group: </w:t>
-            </w:r>
-            <w:r>
-              <w:rPr>
-                <w:rFonts w:eastAsia="ＭＳ 明朝" w:cs=""/>
-                <w:kern w:val="0"/>
-                <w:sz w:val="16"/>
-                <w:szCs w:val="22"/>
-                <w:lang w:val="en-US" w:eastAsia="en-US" w:bidi="ar-SA"/>
-              </w:rPr>
-              <w:t>Power system</w:t>
-            </w:r>
-          </w:p>
-          <w:p>
-            <w:pPr>
-              <w:pStyle w:val="Normal"/>
-              <w:widowControl/>
-              <w:suppressAutoHyphens w:val="true"/>
-              <w:spacing w:lineRule="auto" w:line="240" w:before="0" w:after="0"/>
-              <w:jc w:val="left"/>
-              <w:rPr>
-                <w:rFonts w:eastAsia="ＭＳ 明朝" w:cs=""/>
-                <w:kern w:val="0"/>
-                <w:szCs w:val="22"/>
-                <w:lang w:val="en-US" w:eastAsia="en-US" w:bidi="ar-SA"/>
-              </w:rPr>
-            </w:pPr>
-            <w:r>
-              <w:rPr>
-                <w:rFonts w:eastAsia="ＭＳ 明朝" w:cs=""/>
-                <w:b/>
-                <w:kern w:val="0"/>
-                <w:sz w:val="16"/>
-                <w:szCs w:val="22"/>
-                <w:lang w:val="en-US" w:eastAsia="en-US" w:bidi="ar-SA"/>
-              </w:rPr>
-              <w:t xml:space="preserve">Priority: </w:t>
-            </w:r>
-            <w:r>
-              <w:rPr>
-                <w:rFonts w:eastAsia="ＭＳ 明朝" w:cs=""/>
-                <w:kern w:val="0"/>
-                <w:sz w:val="16"/>
-                <w:szCs w:val="22"/>
-                <w:lang w:val="en-US" w:eastAsia="en-US" w:bidi="ar-SA"/>
-              </w:rPr>
-              <w:t>Required</w:t>
-            </w:r>
-          </w:p>
-          <w:p>
-            <w:pPr>
-              <w:pStyle w:val="Normal"/>
-              <w:widowControl/>
-              <w:suppressAutoHyphens w:val="true"/>
-              <w:spacing w:lineRule="auto" w:line="240" w:before="0" w:after="0"/>
-              <w:jc w:val="left"/>
-              <w:rPr>
-                <w:rFonts w:eastAsia="ＭＳ 明朝" w:cs=""/>
-                <w:kern w:val="0"/>
-                <w:szCs w:val="22"/>
-                <w:lang w:val="en-US" w:eastAsia="en-US" w:bidi="ar-SA"/>
-              </w:rPr>
-            </w:pPr>
-            <w:r>
-              <w:rPr>
-                <w:rFonts w:eastAsia="ＭＳ 明朝" w:cs=""/>
-                <w:b/>
-                <w:kern w:val="0"/>
-                <w:sz w:val="16"/>
-                <w:szCs w:val="22"/>
-                <w:lang w:val="en-US" w:eastAsia="en-US" w:bidi="ar-SA"/>
-              </w:rPr>
-              <w:t xml:space="preserve">Recommended item: </w:t>
-            </w:r>
-            <w:r>
-              <w:rPr>
-                <w:rFonts w:eastAsia="ＭＳ 明朝" w:cs=""/>
-                <w:kern w:val="0"/>
-                <w:sz w:val="16"/>
-                <w:szCs w:val="22"/>
-                <w:lang w:val="en-US" w:eastAsia="en-US" w:bidi="ar-SA"/>
-              </w:rPr>
-              <w:t>One 3W-5W compact panel preferred, or 2-4 pcs 0.99W mini panels.</w:t>
-            </w:r>
-          </w:p>
-          <w:p>
-            <w:pPr>
-              <w:pStyle w:val="Normal"/>
-              <w:widowControl/>
-              <w:suppressAutoHyphens w:val="true"/>
-              <w:spacing w:lineRule="auto" w:line="240" w:before="0" w:after="0"/>
-              <w:jc w:val="left"/>
-              <w:rPr>
-                <w:rFonts w:eastAsia="ＭＳ 明朝" w:cs=""/>
-                <w:kern w:val="0"/>
-                <w:szCs w:val="22"/>
-                <w:lang w:val="en-US" w:eastAsia="en-US" w:bidi="ar-SA"/>
-              </w:rPr>
-            </w:pPr>
-            <w:r>
-              <w:rPr>
-                <w:rFonts w:eastAsia="ＭＳ 明朝" w:cs=""/>
-                <w:b/>
-                <w:kern w:val="0"/>
-                <w:sz w:val="16"/>
-                <w:szCs w:val="22"/>
-                <w:lang w:val="en-US" w:eastAsia="en-US" w:bidi="ar-SA"/>
-              </w:rPr>
-              <w:t xml:space="preserve">Planning price: </w:t>
-            </w:r>
-            <w:r>
-              <w:rPr>
-                <w:rFonts w:eastAsia="ＭＳ 明朝" w:cs=""/>
-                <w:kern w:val="0"/>
-                <w:sz w:val="16"/>
-                <w:szCs w:val="22"/>
-                <w:lang w:val="en-US" w:eastAsia="en-US" w:bidi="ar-SA"/>
-              </w:rPr>
-              <w:t>PHP 235-500 planning range.</w:t>
-            </w:r>
-          </w:p>
-          <w:p>
-            <w:pPr>
-              <w:pStyle w:val="Normal"/>
-              <w:widowControl/>
-              <w:suppressAutoHyphens w:val="true"/>
-              <w:spacing w:lineRule="auto" w:line="240" w:before="0" w:after="0"/>
-              <w:jc w:val="left"/>
-              <w:rPr>
-                <w:rFonts w:eastAsia="ＭＳ 明朝" w:cs=""/>
-                <w:kern w:val="0"/>
-                <w:szCs w:val="22"/>
-                <w:lang w:val="en-US" w:eastAsia="en-US" w:bidi="ar-SA"/>
-              </w:rPr>
-            </w:pPr>
-            <w:r>
-              <w:rPr>
-                <w:rFonts w:eastAsia="ＭＳ 明朝" w:cs=""/>
-                <w:b/>
-                <w:kern w:val="0"/>
-                <w:sz w:val="16"/>
-                <w:szCs w:val="22"/>
-                <w:lang w:val="en-US" w:eastAsia="en-US" w:bidi="ar-SA"/>
-              </w:rPr>
-              <w:t xml:space="preserve">Buy from or verify at: </w:t>
-            </w:r>
-            <w:r>
-              <w:rPr>
-                <w:rFonts w:eastAsia="ＭＳ 明朝" w:cs=""/>
-                <w:kern w:val="0"/>
-                <w:sz w:val="16"/>
-                <w:szCs w:val="22"/>
-                <w:lang w:val="en-US" w:eastAsia="en-US" w:bidi="ar-SA"/>
-              </w:rPr>
-              <w:t>Shopee/Lazada/AliExpress mini solar listings.</w:t>
-            </w:r>
-          </w:p>
-          <w:p>
-            <w:pPr>
-              <w:pStyle w:val="Normal"/>
-              <w:widowControl/>
-              <w:suppressAutoHyphens w:val="true"/>
-              <w:spacing w:lineRule="auto" w:line="240" w:before="0" w:after="0"/>
-              <w:jc w:val="left"/>
-              <w:rPr>
-                <w:rFonts w:eastAsia="ＭＳ 明朝" w:cs=""/>
-                <w:kern w:val="0"/>
-                <w:szCs w:val="22"/>
-                <w:lang w:val="en-US" w:eastAsia="en-US" w:bidi="ar-SA"/>
-              </w:rPr>
-            </w:pPr>
-            <w:r>
-              <w:rPr>
-                <w:rFonts w:eastAsia="ＭＳ 明朝" w:cs=""/>
-                <w:b/>
-                <w:kern w:val="0"/>
-                <w:sz w:val="16"/>
-                <w:szCs w:val="22"/>
-                <w:lang w:val="en-US" w:eastAsia="en-US" w:bidi="ar-SA"/>
-              </w:rPr>
-              <w:t xml:space="preserve">Approval note: </w:t>
-            </w:r>
-            <w:r>
-              <w:rPr>
-                <w:rFonts w:eastAsia="ＭＳ 明朝" w:cs=""/>
-                <w:kern w:val="0"/>
-                <w:sz w:val="16"/>
-                <w:szCs w:val="22"/>
-                <w:lang w:val="en-US" w:eastAsia="en-US" w:bidi="ar-SA"/>
-              </w:rPr>
-              <w:t>One 0.99W panel is trickle/design only.</w:t>
+            <w:r>
+              <w:t>Compact solar panel set</w:t>
+              <w:br/>
+              <w:t>Group: Power system</w:t>
+              <w:br/>
+              <w:t>Priority: Required</w:t>
+              <w:br/>
+              <w:t>Recommended item: Six 3 W compact solar panels arranged around the buoy body/top faces.</w:t>
+              <w:br/>
+              <w:t>Planning price: PHP 1,410-3,000 total planning range.</w:t>
+              <w:br/>
+              <w:t>Buy from or verify at: Shopee/Lazada/AliExpress 3 W mini solar panel listings.</w:t>
+              <w:br/>
+              <w:t>Approval note: Six panels provide 18 W nameplate capacity; measured output must still be validated under real sun, angle, heat, salt, shading, and charge losses.</w:t>
             </w:r>
           </w:p>
         </w:tc>

</xml_diff>

<commit_message>
Polish buoy workflow animation for panel review
</commit_message>
<xml_diff>
--- a/THESIS DOCUMENTATION/FALCON Sensor Approval List for Panel.docx
+++ b/THESIS DOCUMENTATION/FALCON Sensor Approval List for Panel.docx
@@ -299,8 +299,8 @@
       <w:tblGrid>
         <w:gridCol w:w="2736"/>
         <w:gridCol w:w="2736"/>
-        <w:gridCol w:w="2738"/>
-        <w:gridCol w:w="2733"/>
+        <w:gridCol w:w="2739"/>
+        <w:gridCol w:w="2732"/>
       </w:tblGrid>
       <w:tr>
         <w:trPr>
@@ -367,7 +367,7 @@
         </w:tc>
         <w:tc>
           <w:tcPr>
-            <w:tcW w:w="2738" w:type="dxa"/>
+            <w:tcW w:w="2739" w:type="dxa"/>
             <w:tcBorders>
               <w:top w:val="single" w:sz="6" w:space="0" w:color="D9D9D9"/>
               <w:left w:val="single" w:sz="6" w:space="0" w:color="D9D9D9"/>
@@ -396,7 +396,7 @@
         </w:tc>
         <w:tc>
           <w:tcPr>
-            <w:tcW w:w="2733" w:type="dxa"/>
+            <w:tcW w:w="2732" w:type="dxa"/>
             <w:tcBorders>
               <w:top w:val="single" w:sz="6" w:space="0" w:color="D9D9D9"/>
               <w:left w:val="single" w:sz="6" w:space="0" w:color="D9D9D9"/>
@@ -486,7 +486,7 @@
         </w:tc>
         <w:tc>
           <w:tcPr>
-            <w:tcW w:w="2738" w:type="dxa"/>
+            <w:tcW w:w="2739" w:type="dxa"/>
             <w:tcBorders>
               <w:top w:val="single" w:sz="6" w:space="0" w:color="D9D9D9"/>
               <w:left w:val="single" w:sz="6" w:space="0" w:color="D9D9D9"/>
@@ -514,7 +514,7 @@
         </w:tc>
         <w:tc>
           <w:tcPr>
-            <w:tcW w:w="2733" w:type="dxa"/>
+            <w:tcW w:w="2732" w:type="dxa"/>
             <w:tcBorders>
               <w:top w:val="single" w:sz="6" w:space="0" w:color="D9D9D9"/>
               <w:left w:val="single" w:sz="6" w:space="0" w:color="D9D9D9"/>
@@ -603,7 +603,7 @@
         </w:tc>
         <w:tc>
           <w:tcPr>
-            <w:tcW w:w="2738" w:type="dxa"/>
+            <w:tcW w:w="2739" w:type="dxa"/>
             <w:tcBorders>
               <w:top w:val="single" w:sz="6" w:space="0" w:color="D9D9D9"/>
               <w:left w:val="single" w:sz="6" w:space="0" w:color="D9D9D9"/>
@@ -631,7 +631,7 @@
         </w:tc>
         <w:tc>
           <w:tcPr>
-            <w:tcW w:w="2733" w:type="dxa"/>
+            <w:tcW w:w="2732" w:type="dxa"/>
             <w:tcBorders>
               <w:top w:val="single" w:sz="6" w:space="0" w:color="D9D9D9"/>
               <w:left w:val="single" w:sz="6" w:space="0" w:color="D9D9D9"/>
@@ -720,7 +720,7 @@
         </w:tc>
         <w:tc>
           <w:tcPr>
-            <w:tcW w:w="2738" w:type="dxa"/>
+            <w:tcW w:w="2739" w:type="dxa"/>
             <w:tcBorders>
               <w:top w:val="single" w:sz="6" w:space="0" w:color="D9D9D9"/>
               <w:left w:val="single" w:sz="6" w:space="0" w:color="D9D9D9"/>
@@ -748,7 +748,7 @@
         </w:tc>
         <w:tc>
           <w:tcPr>
-            <w:tcW w:w="2733" w:type="dxa"/>
+            <w:tcW w:w="2732" w:type="dxa"/>
             <w:tcBorders>
               <w:top w:val="single" w:sz="6" w:space="0" w:color="D9D9D9"/>
               <w:left w:val="single" w:sz="6" w:space="0" w:color="D9D9D9"/>
@@ -837,7 +837,7 @@
         </w:tc>
         <w:tc>
           <w:tcPr>
-            <w:tcW w:w="2738" w:type="dxa"/>
+            <w:tcW w:w="2739" w:type="dxa"/>
             <w:tcBorders>
               <w:top w:val="single" w:sz="6" w:space="0" w:color="D9D9D9"/>
               <w:left w:val="single" w:sz="6" w:space="0" w:color="D9D9D9"/>
@@ -865,7 +865,7 @@
         </w:tc>
         <w:tc>
           <w:tcPr>
-            <w:tcW w:w="2733" w:type="dxa"/>
+            <w:tcW w:w="2732" w:type="dxa"/>
             <w:tcBorders>
               <w:top w:val="single" w:sz="6" w:space="0" w:color="D9D9D9"/>
               <w:left w:val="single" w:sz="6" w:space="0" w:color="D9D9D9"/>
@@ -954,7 +954,7 @@
         </w:tc>
         <w:tc>
           <w:tcPr>
-            <w:tcW w:w="2738" w:type="dxa"/>
+            <w:tcW w:w="2739" w:type="dxa"/>
             <w:tcBorders>
               <w:top w:val="single" w:sz="6" w:space="0" w:color="D9D9D9"/>
               <w:left w:val="single" w:sz="6" w:space="0" w:color="D9D9D9"/>
@@ -982,7 +982,7 @@
         </w:tc>
         <w:tc>
           <w:tcPr>
-            <w:tcW w:w="2733" w:type="dxa"/>
+            <w:tcW w:w="2732" w:type="dxa"/>
             <w:tcBorders>
               <w:top w:val="single" w:sz="6" w:space="0" w:color="D9D9D9"/>
               <w:left w:val="single" w:sz="6" w:space="0" w:color="D9D9D9"/>
@@ -1071,7 +1071,7 @@
         </w:tc>
         <w:tc>
           <w:tcPr>
-            <w:tcW w:w="2738" w:type="dxa"/>
+            <w:tcW w:w="2739" w:type="dxa"/>
             <w:tcBorders>
               <w:top w:val="single" w:sz="6" w:space="0" w:color="D9D9D9"/>
               <w:left w:val="single" w:sz="6" w:space="0" w:color="D9D9D9"/>
@@ -1099,7 +1099,7 @@
         </w:tc>
         <w:tc>
           <w:tcPr>
-            <w:tcW w:w="2733" w:type="dxa"/>
+            <w:tcW w:w="2732" w:type="dxa"/>
             <w:tcBorders>
               <w:top w:val="single" w:sz="6" w:space="0" w:color="D9D9D9"/>
               <w:left w:val="single" w:sz="6" w:space="0" w:color="D9D9D9"/>
@@ -1188,7 +1188,7 @@
         </w:tc>
         <w:tc>
           <w:tcPr>
-            <w:tcW w:w="2738" w:type="dxa"/>
+            <w:tcW w:w="2739" w:type="dxa"/>
             <w:tcBorders>
               <w:top w:val="single" w:sz="6" w:space="0" w:color="D9D9D9"/>
               <w:left w:val="single" w:sz="6" w:space="0" w:color="D9D9D9"/>
@@ -1216,7 +1216,7 @@
         </w:tc>
         <w:tc>
           <w:tcPr>
-            <w:tcW w:w="2733" w:type="dxa"/>
+            <w:tcW w:w="2732" w:type="dxa"/>
             <w:tcBorders>
               <w:top w:val="single" w:sz="6" w:space="0" w:color="D9D9D9"/>
               <w:left w:val="single" w:sz="6" w:space="0" w:color="D9D9D9"/>
@@ -1305,7 +1305,7 @@
         </w:tc>
         <w:tc>
           <w:tcPr>
-            <w:tcW w:w="2738" w:type="dxa"/>
+            <w:tcW w:w="2739" w:type="dxa"/>
             <w:tcBorders>
               <w:top w:val="single" w:sz="6" w:space="0" w:color="D9D9D9"/>
               <w:left w:val="single" w:sz="6" w:space="0" w:color="D9D9D9"/>
@@ -1333,7 +1333,7 @@
         </w:tc>
         <w:tc>
           <w:tcPr>
-            <w:tcW w:w="2733" w:type="dxa"/>
+            <w:tcW w:w="2732" w:type="dxa"/>
             <w:tcBorders>
               <w:top w:val="single" w:sz="6" w:space="0" w:color="D9D9D9"/>
               <w:left w:val="single" w:sz="6" w:space="0" w:color="D9D9D9"/>
@@ -1422,7 +1422,7 @@
         </w:tc>
         <w:tc>
           <w:tcPr>
-            <w:tcW w:w="2738" w:type="dxa"/>
+            <w:tcW w:w="2739" w:type="dxa"/>
             <w:tcBorders>
               <w:top w:val="single" w:sz="6" w:space="0" w:color="D9D9D9"/>
               <w:left w:val="single" w:sz="6" w:space="0" w:color="D9D9D9"/>
@@ -1450,7 +1450,7 @@
         </w:tc>
         <w:tc>
           <w:tcPr>
-            <w:tcW w:w="2733" w:type="dxa"/>
+            <w:tcW w:w="2732" w:type="dxa"/>
             <w:tcBorders>
               <w:top w:val="single" w:sz="6" w:space="0" w:color="D9D9D9"/>
               <w:left w:val="single" w:sz="6" w:space="0" w:color="D9D9D9"/>
@@ -1539,7 +1539,7 @@
         </w:tc>
         <w:tc>
           <w:tcPr>
-            <w:tcW w:w="2738" w:type="dxa"/>
+            <w:tcW w:w="2739" w:type="dxa"/>
             <w:tcBorders>
               <w:top w:val="single" w:sz="6" w:space="0" w:color="D9D9D9"/>
               <w:left w:val="single" w:sz="6" w:space="0" w:color="D9D9D9"/>
@@ -1567,7 +1567,7 @@
         </w:tc>
         <w:tc>
           <w:tcPr>
-            <w:tcW w:w="2733" w:type="dxa"/>
+            <w:tcW w:w="2732" w:type="dxa"/>
             <w:tcBorders>
               <w:top w:val="single" w:sz="6" w:space="0" w:color="D9D9D9"/>
               <w:left w:val="single" w:sz="6" w:space="0" w:color="D9D9D9"/>
@@ -1656,7 +1656,7 @@
         </w:tc>
         <w:tc>
           <w:tcPr>
-            <w:tcW w:w="2738" w:type="dxa"/>
+            <w:tcW w:w="2739" w:type="dxa"/>
             <w:tcBorders>
               <w:top w:val="single" w:sz="6" w:space="0" w:color="D9D9D9"/>
               <w:left w:val="single" w:sz="6" w:space="0" w:color="D9D9D9"/>
@@ -1684,7 +1684,7 @@
         </w:tc>
         <w:tc>
           <w:tcPr>
-            <w:tcW w:w="2733" w:type="dxa"/>
+            <w:tcW w:w="2732" w:type="dxa"/>
             <w:tcBorders>
               <w:top w:val="single" w:sz="6" w:space="0" w:color="D9D9D9"/>
               <w:left w:val="single" w:sz="6" w:space="0" w:color="D9D9D9"/>
@@ -1773,7 +1773,7 @@
         </w:tc>
         <w:tc>
           <w:tcPr>
-            <w:tcW w:w="2738" w:type="dxa"/>
+            <w:tcW w:w="2739" w:type="dxa"/>
             <w:tcBorders>
               <w:top w:val="single" w:sz="6" w:space="0" w:color="D9D9D9"/>
               <w:left w:val="single" w:sz="6" w:space="0" w:color="D9D9D9"/>
@@ -1801,7 +1801,7 @@
         </w:tc>
         <w:tc>
           <w:tcPr>
-            <w:tcW w:w="2733" w:type="dxa"/>
+            <w:tcW w:w="2732" w:type="dxa"/>
             <w:tcBorders>
               <w:top w:val="single" w:sz="6" w:space="0" w:color="D9D9D9"/>
               <w:left w:val="single" w:sz="6" w:space="0" w:color="D9D9D9"/>
@@ -1890,7 +1890,7 @@
         </w:tc>
         <w:tc>
           <w:tcPr>
-            <w:tcW w:w="2738" w:type="dxa"/>
+            <w:tcW w:w="2739" w:type="dxa"/>
             <w:tcBorders>
               <w:top w:val="single" w:sz="6" w:space="0" w:color="D9D9D9"/>
               <w:left w:val="single" w:sz="6" w:space="0" w:color="D9D9D9"/>
@@ -1918,7 +1918,7 @@
         </w:tc>
         <w:tc>
           <w:tcPr>
-            <w:tcW w:w="2733" w:type="dxa"/>
+            <w:tcW w:w="2732" w:type="dxa"/>
             <w:tcBorders>
               <w:top w:val="single" w:sz="6" w:space="0" w:color="D9D9D9"/>
               <w:left w:val="single" w:sz="6" w:space="0" w:color="D9D9D9"/>
@@ -2007,7 +2007,7 @@
         </w:tc>
         <w:tc>
           <w:tcPr>
-            <w:tcW w:w="2738" w:type="dxa"/>
+            <w:tcW w:w="2739" w:type="dxa"/>
             <w:tcBorders>
               <w:top w:val="single" w:sz="6" w:space="0" w:color="D9D9D9"/>
               <w:left w:val="single" w:sz="6" w:space="0" w:color="D9D9D9"/>
@@ -2035,7 +2035,7 @@
         </w:tc>
         <w:tc>
           <w:tcPr>
-            <w:tcW w:w="2733" w:type="dxa"/>
+            <w:tcW w:w="2732" w:type="dxa"/>
             <w:tcBorders>
               <w:top w:val="single" w:sz="6" w:space="0" w:color="D9D9D9"/>
               <w:left w:val="single" w:sz="6" w:space="0" w:color="D9D9D9"/>
@@ -2124,7 +2124,7 @@
         </w:tc>
         <w:tc>
           <w:tcPr>
-            <w:tcW w:w="2738" w:type="dxa"/>
+            <w:tcW w:w="2739" w:type="dxa"/>
             <w:tcBorders>
               <w:top w:val="single" w:sz="6" w:space="0" w:color="D9D9D9"/>
               <w:left w:val="single" w:sz="6" w:space="0" w:color="D9D9D9"/>
@@ -2152,7 +2152,7 @@
         </w:tc>
         <w:tc>
           <w:tcPr>
-            <w:tcW w:w="2733" w:type="dxa"/>
+            <w:tcW w:w="2732" w:type="dxa"/>
             <w:tcBorders>
               <w:top w:val="single" w:sz="6" w:space="0" w:color="D9D9D9"/>
               <w:left w:val="single" w:sz="6" w:space="0" w:color="D9D9D9"/>
@@ -2241,7 +2241,7 @@
         </w:tc>
         <w:tc>
           <w:tcPr>
-            <w:tcW w:w="2738" w:type="dxa"/>
+            <w:tcW w:w="2739" w:type="dxa"/>
             <w:tcBorders>
               <w:top w:val="single" w:sz="6" w:space="0" w:color="D9D9D9"/>
               <w:left w:val="single" w:sz="6" w:space="0" w:color="D9D9D9"/>
@@ -2269,7 +2269,7 @@
         </w:tc>
         <w:tc>
           <w:tcPr>
-            <w:tcW w:w="2733" w:type="dxa"/>
+            <w:tcW w:w="2732" w:type="dxa"/>
             <w:tcBorders>
               <w:top w:val="single" w:sz="6" w:space="0" w:color="D9D9D9"/>
               <w:left w:val="single" w:sz="6" w:space="0" w:color="D9D9D9"/>
@@ -2313,8 +2313,20 @@
             <w:vAlign w:val="center"/>
           </w:tcPr>
           <w:p>
-            <w:r>
-              <w:t>Rechargeable battery pack with BMS</w:t>
+            <w:pPr>
+              <w:pStyle w:val="Normal"/>
+              <w:spacing w:before="0" w:after="200"/>
+              <w:rPr>
+                <w:sz w:val="14"/>
+                <w:szCs w:val="14"/>
+              </w:rPr>
+            </w:pPr>
+            <w:r>
+              <w:rPr>
+                <w:sz w:val="14"/>
+                <w:szCs w:val="14"/>
+              </w:rPr>
+              <w:t>12.8V 10Ah LiFePO4 with BMS</w:t>
             </w:r>
           </w:p>
         </w:tc>
@@ -2331,14 +2343,26 @@
             <w:vAlign w:val="center"/>
           </w:tcPr>
           <w:p>
-            <w:r>
+            <w:pPr>
+              <w:pStyle w:val="Normal"/>
+              <w:spacing w:before="0" w:after="200"/>
+              <w:rPr>
+                <w:sz w:val="14"/>
+                <w:szCs w:val="14"/>
+              </w:rPr>
+            </w:pPr>
+            <w:r>
+              <w:rPr>
+                <w:sz w:val="14"/>
+                <w:szCs w:val="14"/>
+              </w:rPr>
               <w:t>1 pack</w:t>
             </w:r>
           </w:p>
         </w:tc>
         <w:tc>
           <w:tcPr>
-            <w:tcW w:w="2738" w:type="dxa"/>
+            <w:tcW w:w="2739" w:type="dxa"/>
             <w:tcBorders>
               <w:top w:val="single" w:sz="6" w:space="0" w:color="D9D9D9"/>
               <w:left w:val="single" w:sz="6" w:space="0" w:color="D9D9D9"/>
@@ -2349,14 +2373,26 @@
             <w:vAlign w:val="center"/>
           </w:tcPr>
           <w:p>
-            <w:r>
+            <w:pPr>
+              <w:pStyle w:val="Normal"/>
+              <w:spacing w:before="0" w:after="200"/>
+              <w:rPr>
+                <w:sz w:val="14"/>
+                <w:szCs w:val="14"/>
+              </w:rPr>
+            </w:pPr>
+            <w:r>
+              <w:rPr>
+                <w:sz w:val="14"/>
+                <w:szCs w:val="14"/>
+              </w:rPr>
               <w:t>Required</w:t>
             </w:r>
           </w:p>
         </w:tc>
         <w:tc>
           <w:tcPr>
-            <w:tcW w:w="2733" w:type="dxa"/>
+            <w:tcW w:w="2732" w:type="dxa"/>
             <w:tcBorders>
               <w:top w:val="single" w:sz="6" w:space="0" w:color="D9D9D9"/>
               <w:left w:val="single" w:sz="6" w:space="0" w:color="D9D9D9"/>
@@ -2367,8 +2403,20 @@
             <w:vAlign w:val="center"/>
           </w:tcPr>
           <w:p>
-            <w:r>
-              <w:t>Protected Li-ion/LiPo or 18650 pack with BMS; target 37-74 Wh class after measured load.</w:t>
+            <w:pPr>
+              <w:pStyle w:val="Normal"/>
+              <w:spacing w:before="0" w:after="200"/>
+              <w:rPr>
+                <w:sz w:val="14"/>
+                <w:szCs w:val="14"/>
+              </w:rPr>
+            </w:pPr>
+            <w:r>
+              <w:rPr>
+                <w:sz w:val="14"/>
+                <w:szCs w:val="14"/>
+              </w:rPr>
+              <w:t>12.8 V 10 Ah LiFePO4 battery with built-in BMS; 128 Wh nominal capacity. 12.8 V 12 Ah is acceptable if 10 Ah is unavailable.</w:t>
             </w:r>
           </w:p>
         </w:tc>
@@ -2390,7 +2438,19 @@
             <w:vAlign w:val="center"/>
           </w:tcPr>
           <w:p>
-            <w:r>
+            <w:pPr>
+              <w:pStyle w:val="Normal"/>
+              <w:spacing w:before="0" w:after="200"/>
+              <w:rPr>
+                <w:sz w:val="14"/>
+                <w:szCs w:val="14"/>
+              </w:rPr>
+            </w:pPr>
+            <w:r>
+              <w:rPr>
+                <w:sz w:val="14"/>
+                <w:szCs w:val="14"/>
+              </w:rPr>
               <w:t>Compact solar panel set</w:t>
             </w:r>
           </w:p>
@@ -2408,14 +2468,26 @@
             <w:vAlign w:val="center"/>
           </w:tcPr>
           <w:p>
-            <w:r>
+            <w:pPr>
+              <w:pStyle w:val="Normal"/>
+              <w:spacing w:before="0" w:after="200"/>
+              <w:rPr>
+                <w:sz w:val="14"/>
+                <w:szCs w:val="14"/>
+              </w:rPr>
+            </w:pPr>
+            <w:r>
+              <w:rPr>
+                <w:sz w:val="14"/>
+                <w:szCs w:val="14"/>
+              </w:rPr>
               <w:t>6 pcs x 3 W panels</w:t>
             </w:r>
           </w:p>
         </w:tc>
         <w:tc>
           <w:tcPr>
-            <w:tcW w:w="2738" w:type="dxa"/>
+            <w:tcW w:w="2739" w:type="dxa"/>
             <w:tcBorders>
               <w:top w:val="single" w:sz="6" w:space="0" w:color="D9D9D9"/>
               <w:left w:val="single" w:sz="6" w:space="0" w:color="D9D9D9"/>
@@ -2426,14 +2498,26 @@
             <w:vAlign w:val="center"/>
           </w:tcPr>
           <w:p>
-            <w:r>
+            <w:pPr>
+              <w:pStyle w:val="Normal"/>
+              <w:spacing w:before="0" w:after="200"/>
+              <w:rPr>
+                <w:sz w:val="14"/>
+                <w:szCs w:val="14"/>
+              </w:rPr>
+            </w:pPr>
+            <w:r>
+              <w:rPr>
+                <w:sz w:val="14"/>
+                <w:szCs w:val="14"/>
+              </w:rPr>
               <w:t>Required</w:t>
             </w:r>
           </w:p>
         </w:tc>
         <w:tc>
           <w:tcPr>
-            <w:tcW w:w="2733" w:type="dxa"/>
+            <w:tcW w:w="2732" w:type="dxa"/>
             <w:tcBorders>
               <w:top w:val="single" w:sz="6" w:space="0" w:color="D9D9D9"/>
               <w:left w:val="single" w:sz="6" w:space="0" w:color="D9D9D9"/>
@@ -2444,7 +2528,19 @@
             <w:vAlign w:val="center"/>
           </w:tcPr>
           <w:p>
-            <w:r>
+            <w:pPr>
+              <w:pStyle w:val="Normal"/>
+              <w:spacing w:before="0" w:after="200"/>
+              <w:rPr>
+                <w:sz w:val="14"/>
+                <w:szCs w:val="14"/>
+              </w:rPr>
+            </w:pPr>
+            <w:r>
+              <w:rPr>
+                <w:sz w:val="14"/>
+                <w:szCs w:val="14"/>
+              </w:rPr>
               <w:t>Six small 3 W panels for 18 W total nameplate capacity; arrange around buoy body/top faces.</w:t>
             </w:r>
           </w:p>
@@ -2512,7 +2608,7 @@
         </w:tc>
         <w:tc>
           <w:tcPr>
-            <w:tcW w:w="2738" w:type="dxa"/>
+            <w:tcW w:w="2739" w:type="dxa"/>
             <w:tcBorders>
               <w:top w:val="single" w:sz="6" w:space="0" w:color="D9D9D9"/>
               <w:left w:val="single" w:sz="6" w:space="0" w:color="D9D9D9"/>
@@ -2540,7 +2636,7 @@
         </w:tc>
         <w:tc>
           <w:tcPr>
-            <w:tcW w:w="2733" w:type="dxa"/>
+            <w:tcW w:w="2732" w:type="dxa"/>
             <w:tcBorders>
               <w:top w:val="single" w:sz="6" w:space="0" w:color="D9D9D9"/>
               <w:left w:val="single" w:sz="6" w:space="0" w:color="D9D9D9"/>
@@ -2629,7 +2725,7 @@
         </w:tc>
         <w:tc>
           <w:tcPr>
-            <w:tcW w:w="2738" w:type="dxa"/>
+            <w:tcW w:w="2739" w:type="dxa"/>
             <w:tcBorders>
               <w:top w:val="single" w:sz="6" w:space="0" w:color="D9D9D9"/>
               <w:left w:val="single" w:sz="6" w:space="0" w:color="D9D9D9"/>
@@ -2657,7 +2753,7 @@
         </w:tc>
         <w:tc>
           <w:tcPr>
-            <w:tcW w:w="2733" w:type="dxa"/>
+            <w:tcW w:w="2732" w:type="dxa"/>
             <w:tcBorders>
               <w:top w:val="single" w:sz="6" w:space="0" w:color="D9D9D9"/>
               <w:left w:val="single" w:sz="6" w:space="0" w:color="D9D9D9"/>
@@ -2746,7 +2842,7 @@
         </w:tc>
         <w:tc>
           <w:tcPr>
-            <w:tcW w:w="2738" w:type="dxa"/>
+            <w:tcW w:w="2739" w:type="dxa"/>
             <w:tcBorders>
               <w:top w:val="single" w:sz="6" w:space="0" w:color="D9D9D9"/>
               <w:left w:val="single" w:sz="6" w:space="0" w:color="D9D9D9"/>
@@ -2774,7 +2870,7 @@
         </w:tc>
         <w:tc>
           <w:tcPr>
-            <w:tcW w:w="2733" w:type="dxa"/>
+            <w:tcW w:w="2732" w:type="dxa"/>
             <w:tcBorders>
               <w:top w:val="single" w:sz="6" w:space="0" w:color="D9D9D9"/>
               <w:left w:val="single" w:sz="6" w:space="0" w:color="D9D9D9"/>
@@ -2863,7 +2959,7 @@
         </w:tc>
         <w:tc>
           <w:tcPr>
-            <w:tcW w:w="2738" w:type="dxa"/>
+            <w:tcW w:w="2739" w:type="dxa"/>
             <w:tcBorders>
               <w:top w:val="single" w:sz="6" w:space="0" w:color="D9D9D9"/>
               <w:left w:val="single" w:sz="6" w:space="0" w:color="D9D9D9"/>
@@ -2891,7 +2987,7 @@
         </w:tc>
         <w:tc>
           <w:tcPr>
-            <w:tcW w:w="2733" w:type="dxa"/>
+            <w:tcW w:w="2732" w:type="dxa"/>
             <w:tcBorders>
               <w:top w:val="single" w:sz="6" w:space="0" w:color="D9D9D9"/>
               <w:left w:val="single" w:sz="6" w:space="0" w:color="D9D9D9"/>
@@ -2980,7 +3076,7 @@
         </w:tc>
         <w:tc>
           <w:tcPr>
-            <w:tcW w:w="2738" w:type="dxa"/>
+            <w:tcW w:w="2739" w:type="dxa"/>
             <w:tcBorders>
               <w:top w:val="single" w:sz="6" w:space="0" w:color="D9D9D9"/>
               <w:left w:val="single" w:sz="6" w:space="0" w:color="D9D9D9"/>
@@ -3008,7 +3104,7 @@
         </w:tc>
         <w:tc>
           <w:tcPr>
-            <w:tcW w:w="2733" w:type="dxa"/>
+            <w:tcW w:w="2732" w:type="dxa"/>
             <w:tcBorders>
               <w:top w:val="single" w:sz="6" w:space="0" w:color="D9D9D9"/>
               <w:left w:val="single" w:sz="6" w:space="0" w:color="D9D9D9"/>
@@ -3097,7 +3193,7 @@
         </w:tc>
         <w:tc>
           <w:tcPr>
-            <w:tcW w:w="2738" w:type="dxa"/>
+            <w:tcW w:w="2739" w:type="dxa"/>
             <w:tcBorders>
               <w:top w:val="single" w:sz="6" w:space="0" w:color="D9D9D9"/>
               <w:left w:val="single" w:sz="6" w:space="0" w:color="D9D9D9"/>
@@ -3125,7 +3221,7 @@
         </w:tc>
         <w:tc>
           <w:tcPr>
-            <w:tcW w:w="2733" w:type="dxa"/>
+            <w:tcW w:w="2732" w:type="dxa"/>
             <w:tcBorders>
               <w:top w:val="single" w:sz="6" w:space="0" w:color="D9D9D9"/>
               <w:left w:val="single" w:sz="6" w:space="0" w:color="D9D9D9"/>
@@ -3214,7 +3310,7 @@
         </w:tc>
         <w:tc>
           <w:tcPr>
-            <w:tcW w:w="2738" w:type="dxa"/>
+            <w:tcW w:w="2739" w:type="dxa"/>
             <w:tcBorders>
               <w:top w:val="single" w:sz="6" w:space="0" w:color="D9D9D9"/>
               <w:left w:val="single" w:sz="6" w:space="0" w:color="D9D9D9"/>
@@ -3242,7 +3338,7 @@
         </w:tc>
         <w:tc>
           <w:tcPr>
-            <w:tcW w:w="2733" w:type="dxa"/>
+            <w:tcW w:w="2732" w:type="dxa"/>
             <w:tcBorders>
               <w:top w:val="single" w:sz="6" w:space="0" w:color="D9D9D9"/>
               <w:left w:val="single" w:sz="6" w:space="0" w:color="D9D9D9"/>
@@ -3331,7 +3427,7 @@
         </w:tc>
         <w:tc>
           <w:tcPr>
-            <w:tcW w:w="2738" w:type="dxa"/>
+            <w:tcW w:w="2739" w:type="dxa"/>
             <w:tcBorders>
               <w:top w:val="single" w:sz="6" w:space="0" w:color="D9D9D9"/>
               <w:left w:val="single" w:sz="6" w:space="0" w:color="D9D9D9"/>
@@ -3359,7 +3455,7 @@
         </w:tc>
         <w:tc>
           <w:tcPr>
-            <w:tcW w:w="2733" w:type="dxa"/>
+            <w:tcW w:w="2732" w:type="dxa"/>
             <w:tcBorders>
               <w:top w:val="single" w:sz="6" w:space="0" w:color="D9D9D9"/>
               <w:left w:val="single" w:sz="6" w:space="0" w:color="D9D9D9"/>
@@ -3448,7 +3544,7 @@
         </w:tc>
         <w:tc>
           <w:tcPr>
-            <w:tcW w:w="2738" w:type="dxa"/>
+            <w:tcW w:w="2739" w:type="dxa"/>
             <w:tcBorders>
               <w:top w:val="single" w:sz="6" w:space="0" w:color="D9D9D9"/>
               <w:left w:val="single" w:sz="6" w:space="0" w:color="D9D9D9"/>
@@ -3476,7 +3572,7 @@
         </w:tc>
         <w:tc>
           <w:tcPr>
-            <w:tcW w:w="2733" w:type="dxa"/>
+            <w:tcW w:w="2732" w:type="dxa"/>
             <w:tcBorders>
               <w:top w:val="single" w:sz="6" w:space="0" w:color="D9D9D9"/>
               <w:left w:val="single" w:sz="6" w:space="0" w:color="D9D9D9"/>
@@ -3565,7 +3661,7 @@
         </w:tc>
         <w:tc>
           <w:tcPr>
-            <w:tcW w:w="2738" w:type="dxa"/>
+            <w:tcW w:w="2739" w:type="dxa"/>
             <w:tcBorders>
               <w:top w:val="single" w:sz="6" w:space="0" w:color="D9D9D9"/>
               <w:left w:val="single" w:sz="6" w:space="0" w:color="D9D9D9"/>
@@ -3593,7 +3689,7 @@
         </w:tc>
         <w:tc>
           <w:tcPr>
-            <w:tcW w:w="2733" w:type="dxa"/>
+            <w:tcW w:w="2732" w:type="dxa"/>
             <w:tcBorders>
               <w:top w:val="single" w:sz="6" w:space="0" w:color="D9D9D9"/>
               <w:left w:val="single" w:sz="6" w:space="0" w:color="D9D9D9"/>
@@ -3682,7 +3778,7 @@
         </w:tc>
         <w:tc>
           <w:tcPr>
-            <w:tcW w:w="2738" w:type="dxa"/>
+            <w:tcW w:w="2739" w:type="dxa"/>
             <w:tcBorders>
               <w:top w:val="single" w:sz="6" w:space="0" w:color="D9D9D9"/>
               <w:left w:val="single" w:sz="6" w:space="0" w:color="D9D9D9"/>
@@ -3710,7 +3806,7 @@
         </w:tc>
         <w:tc>
           <w:tcPr>
-            <w:tcW w:w="2733" w:type="dxa"/>
+            <w:tcW w:w="2732" w:type="dxa"/>
             <w:tcBorders>
               <w:top w:val="single" w:sz="6" w:space="0" w:color="D9D9D9"/>
               <w:left w:val="single" w:sz="6" w:space="0" w:color="D9D9D9"/>
@@ -3799,7 +3895,7 @@
         </w:tc>
         <w:tc>
           <w:tcPr>
-            <w:tcW w:w="2738" w:type="dxa"/>
+            <w:tcW w:w="2739" w:type="dxa"/>
             <w:tcBorders>
               <w:top w:val="single" w:sz="6" w:space="0" w:color="D9D9D9"/>
               <w:left w:val="single" w:sz="6" w:space="0" w:color="D9D9D9"/>
@@ -3827,7 +3923,7 @@
         </w:tc>
         <w:tc>
           <w:tcPr>
-            <w:tcW w:w="2733" w:type="dxa"/>
+            <w:tcW w:w="2732" w:type="dxa"/>
             <w:tcBorders>
               <w:top w:val="single" w:sz="6" w:space="0" w:color="D9D9D9"/>
               <w:left w:val="single" w:sz="6" w:space="0" w:color="D9D9D9"/>
@@ -3916,7 +4012,7 @@
         </w:tc>
         <w:tc>
           <w:tcPr>
-            <w:tcW w:w="2738" w:type="dxa"/>
+            <w:tcW w:w="2739" w:type="dxa"/>
             <w:tcBorders>
               <w:top w:val="single" w:sz="6" w:space="0" w:color="D9D9D9"/>
               <w:left w:val="single" w:sz="6" w:space="0" w:color="D9D9D9"/>
@@ -3944,7 +4040,7 @@
         </w:tc>
         <w:tc>
           <w:tcPr>
-            <w:tcW w:w="2733" w:type="dxa"/>
+            <w:tcW w:w="2732" w:type="dxa"/>
             <w:tcBorders>
               <w:top w:val="single" w:sz="6" w:space="0" w:color="D9D9D9"/>
               <w:left w:val="single" w:sz="6" w:space="0" w:color="D9D9D9"/>
@@ -4033,7 +4129,7 @@
         </w:tc>
         <w:tc>
           <w:tcPr>
-            <w:tcW w:w="2738" w:type="dxa"/>
+            <w:tcW w:w="2739" w:type="dxa"/>
             <w:tcBorders>
               <w:top w:val="single" w:sz="6" w:space="0" w:color="D9D9D9"/>
               <w:left w:val="single" w:sz="6" w:space="0" w:color="D9D9D9"/>
@@ -4061,7 +4157,7 @@
         </w:tc>
         <w:tc>
           <w:tcPr>
-            <w:tcW w:w="2733" w:type="dxa"/>
+            <w:tcW w:w="2732" w:type="dxa"/>
             <w:tcBorders>
               <w:top w:val="single" w:sz="6" w:space="0" w:color="D9D9D9"/>
               <w:left w:val="single" w:sz="6" w:space="0" w:color="D9D9D9"/>
@@ -4150,7 +4246,7 @@
         </w:tc>
         <w:tc>
           <w:tcPr>
-            <w:tcW w:w="2738" w:type="dxa"/>
+            <w:tcW w:w="2739" w:type="dxa"/>
             <w:tcBorders>
               <w:top w:val="single" w:sz="6" w:space="0" w:color="D9D9D9"/>
               <w:left w:val="single" w:sz="6" w:space="0" w:color="D9D9D9"/>
@@ -4178,7 +4274,7 @@
         </w:tc>
         <w:tc>
           <w:tcPr>
-            <w:tcW w:w="2733" w:type="dxa"/>
+            <w:tcW w:w="2732" w:type="dxa"/>
             <w:tcBorders>
               <w:top w:val="single" w:sz="6" w:space="0" w:color="D9D9D9"/>
               <w:left w:val="single" w:sz="6" w:space="0" w:color="D9D9D9"/>
@@ -4267,7 +4363,7 @@
         </w:tc>
         <w:tc>
           <w:tcPr>
-            <w:tcW w:w="2738" w:type="dxa"/>
+            <w:tcW w:w="2739" w:type="dxa"/>
             <w:tcBorders>
               <w:top w:val="single" w:sz="6" w:space="0" w:color="D9D9D9"/>
               <w:left w:val="single" w:sz="6" w:space="0" w:color="D9D9D9"/>
@@ -4295,7 +4391,7 @@
         </w:tc>
         <w:tc>
           <w:tcPr>
-            <w:tcW w:w="2733" w:type="dxa"/>
+            <w:tcW w:w="2732" w:type="dxa"/>
             <w:tcBorders>
               <w:top w:val="single" w:sz="6" w:space="0" w:color="D9D9D9"/>
               <w:left w:val="single" w:sz="6" w:space="0" w:color="D9D9D9"/>
@@ -4384,7 +4480,7 @@
         </w:tc>
         <w:tc>
           <w:tcPr>
-            <w:tcW w:w="2738" w:type="dxa"/>
+            <w:tcW w:w="2739" w:type="dxa"/>
             <w:tcBorders>
               <w:top w:val="single" w:sz="6" w:space="0" w:color="D9D9D9"/>
               <w:left w:val="single" w:sz="6" w:space="0" w:color="D9D9D9"/>
@@ -4412,7 +4508,7 @@
         </w:tc>
         <w:tc>
           <w:tcPr>
-            <w:tcW w:w="2733" w:type="dxa"/>
+            <w:tcW w:w="2732" w:type="dxa"/>
             <w:tcBorders>
               <w:top w:val="single" w:sz="6" w:space="0" w:color="D9D9D9"/>
               <w:left w:val="single" w:sz="6" w:space="0" w:color="D9D9D9"/>
@@ -4501,7 +4597,7 @@
         </w:tc>
         <w:tc>
           <w:tcPr>
-            <w:tcW w:w="2738" w:type="dxa"/>
+            <w:tcW w:w="2739" w:type="dxa"/>
             <w:tcBorders>
               <w:top w:val="single" w:sz="6" w:space="0" w:color="D9D9D9"/>
               <w:left w:val="single" w:sz="6" w:space="0" w:color="D9D9D9"/>
@@ -4529,7 +4625,7 @@
         </w:tc>
         <w:tc>
           <w:tcPr>
-            <w:tcW w:w="2733" w:type="dxa"/>
+            <w:tcW w:w="2732" w:type="dxa"/>
             <w:tcBorders>
               <w:top w:val="single" w:sz="6" w:space="0" w:color="D9D9D9"/>
               <w:left w:val="single" w:sz="6" w:space="0" w:color="D9D9D9"/>
@@ -4618,7 +4714,7 @@
         </w:tc>
         <w:tc>
           <w:tcPr>
-            <w:tcW w:w="2738" w:type="dxa"/>
+            <w:tcW w:w="2739" w:type="dxa"/>
             <w:tcBorders>
               <w:top w:val="single" w:sz="6" w:space="0" w:color="D9D9D9"/>
               <w:left w:val="single" w:sz="6" w:space="0" w:color="D9D9D9"/>
@@ -4646,7 +4742,7 @@
         </w:tc>
         <w:tc>
           <w:tcPr>
-            <w:tcW w:w="2733" w:type="dxa"/>
+            <w:tcW w:w="2732" w:type="dxa"/>
             <w:tcBorders>
               <w:top w:val="single" w:sz="6" w:space="0" w:color="D9D9D9"/>
               <w:left w:val="single" w:sz="6" w:space="0" w:color="D9D9D9"/>
@@ -8900,8 +8996,20 @@
             <w:vAlign w:val="center"/>
           </w:tcPr>
           <w:p>
-            <w:r>
-              <w:t>Rechargeable battery pack with BMS</w:t>
+            <w:pPr>
+              <w:pStyle w:val="Normal"/>
+              <w:spacing w:before="0" w:after="200"/>
+              <w:rPr>
+                <w:sz w:val="14"/>
+                <w:szCs w:val="14"/>
+              </w:rPr>
+            </w:pPr>
+            <w:r>
+              <w:rPr>
+                <w:sz w:val="14"/>
+                <w:szCs w:val="14"/>
+              </w:rPr>
+              <w:t>12.8V 10Ah LiFePO4 with BMS</w:t>
             </w:r>
           </w:p>
         </w:tc>
@@ -8918,7 +9026,19 @@
             <w:vAlign w:val="center"/>
           </w:tcPr>
           <w:p>
-            <w:r>
+            <w:pPr>
+              <w:pStyle w:val="Normal"/>
+              <w:spacing w:before="0" w:after="200"/>
+              <w:rPr>
+                <w:sz w:val="14"/>
+                <w:szCs w:val="14"/>
+              </w:rPr>
+            </w:pPr>
+            <w:r>
+              <w:rPr>
+                <w:sz w:val="14"/>
+                <w:szCs w:val="14"/>
+              </w:rPr>
               <w:t>1 pack</w:t>
             </w:r>
           </w:p>
@@ -8936,7 +9056,19 @@
             <w:vAlign w:val="center"/>
           </w:tcPr>
           <w:p>
-            <w:r>
+            <w:pPr>
+              <w:pStyle w:val="Normal"/>
+              <w:spacing w:before="0" w:after="200"/>
+              <w:rPr>
+                <w:sz w:val="14"/>
+                <w:szCs w:val="14"/>
+              </w:rPr>
+            </w:pPr>
+            <w:r>
+              <w:rPr>
+                <w:sz w:val="14"/>
+                <w:szCs w:val="14"/>
+              </w:rPr>
               <w:t>PHP 1,500-PHP 3,500</w:t>
             </w:r>
           </w:p>
@@ -8954,7 +9086,19 @@
             <w:vAlign w:val="center"/>
           </w:tcPr>
           <w:p>
-            <w:r>
+            <w:pPr>
+              <w:pStyle w:val="Normal"/>
+              <w:spacing w:before="0" w:after="200"/>
+              <w:rPr>
+                <w:sz w:val="14"/>
+                <w:szCs w:val="14"/>
+              </w:rPr>
+            </w:pPr>
+            <w:r>
+              <w:rPr>
+                <w:sz w:val="14"/>
+                <w:szCs w:val="14"/>
+              </w:rPr>
               <w:t>PHP 1,500-PHP 3,500</w:t>
             </w:r>
           </w:p>
@@ -8972,8 +9116,20 @@
             <w:vAlign w:val="center"/>
           </w:tcPr>
           <w:p>
-            <w:r>
-              <w:t>Protected Li-ion/LiPo or 18650 pack with BMS; target 37-74 Wh class after measured load.</w:t>
+            <w:pPr>
+              <w:pStyle w:val="Normal"/>
+              <w:spacing w:before="0" w:after="200"/>
+              <w:rPr>
+                <w:sz w:val="14"/>
+                <w:szCs w:val="14"/>
+              </w:rPr>
+            </w:pPr>
+            <w:r>
+              <w:rPr>
+                <w:sz w:val="14"/>
+                <w:szCs w:val="14"/>
+              </w:rPr>
+              <w:t>12.8 V 10 Ah LiFePO4 battery with built-in BMS; 128 Wh nominal capacity. 12.8 V 12 Ah is acceptable if 10 Ah is unavailable.</w:t>
             </w:r>
           </w:p>
         </w:tc>
@@ -8995,7 +9151,19 @@
             <w:vAlign w:val="center"/>
           </w:tcPr>
           <w:p>
-            <w:r>
+            <w:pPr>
+              <w:pStyle w:val="Normal"/>
+              <w:spacing w:before="0" w:after="200"/>
+              <w:rPr>
+                <w:sz w:val="14"/>
+                <w:szCs w:val="14"/>
+              </w:rPr>
+            </w:pPr>
+            <w:r>
+              <w:rPr>
+                <w:sz w:val="14"/>
+                <w:szCs w:val="14"/>
+              </w:rPr>
               <w:t>Compact solar panel set</w:t>
             </w:r>
           </w:p>
@@ -9013,7 +9181,19 @@
             <w:vAlign w:val="center"/>
           </w:tcPr>
           <w:p>
-            <w:r>
+            <w:pPr>
+              <w:pStyle w:val="Normal"/>
+              <w:spacing w:before="0" w:after="200"/>
+              <w:rPr>
+                <w:sz w:val="14"/>
+                <w:szCs w:val="14"/>
+              </w:rPr>
+            </w:pPr>
+            <w:r>
+              <w:rPr>
+                <w:sz w:val="14"/>
+                <w:szCs w:val="14"/>
+              </w:rPr>
               <w:t>6 pcs x 3 W panels</w:t>
             </w:r>
           </w:p>
@@ -9031,7 +9211,19 @@
             <w:vAlign w:val="center"/>
           </w:tcPr>
           <w:p>
-            <w:r>
+            <w:pPr>
+              <w:pStyle w:val="Normal"/>
+              <w:spacing w:before="0" w:after="200"/>
+              <w:rPr>
+                <w:sz w:val="14"/>
+                <w:szCs w:val="14"/>
+              </w:rPr>
+            </w:pPr>
+            <w:r>
+              <w:rPr>
+                <w:sz w:val="14"/>
+                <w:szCs w:val="14"/>
+              </w:rPr>
               <w:t>PHP 235-PHP 500 each</w:t>
             </w:r>
           </w:p>
@@ -9049,7 +9241,19 @@
             <w:vAlign w:val="center"/>
           </w:tcPr>
           <w:p>
-            <w:r>
+            <w:pPr>
+              <w:pStyle w:val="Normal"/>
+              <w:spacing w:before="0" w:after="200"/>
+              <w:rPr>
+                <w:sz w:val="14"/>
+                <w:szCs w:val="14"/>
+              </w:rPr>
+            </w:pPr>
+            <w:r>
+              <w:rPr>
+                <w:sz w:val="14"/>
+                <w:szCs w:val="14"/>
+              </w:rPr>
               <w:t>PHP 1,410-PHP 3,000</w:t>
             </w:r>
           </w:p>
@@ -9067,7 +9271,19 @@
             <w:vAlign w:val="center"/>
           </w:tcPr>
           <w:p>
-            <w:r>
+            <w:pPr>
+              <w:pStyle w:val="Normal"/>
+              <w:spacing w:before="0" w:after="200"/>
+              <w:rPr>
+                <w:sz w:val="14"/>
+                <w:szCs w:val="14"/>
+              </w:rPr>
+            </w:pPr>
+            <w:r>
+              <w:rPr>
+                <w:sz w:val="14"/>
+                <w:szCs w:val="14"/>
+              </w:rPr>
               <w:t>Six small 3 W panels for 18 W total nameplate capacity; arrange around buoy body/top faces.</w:t>
             </w:r>
           </w:p>
@@ -15575,20 +15791,30 @@
             <w:vAlign w:val="center"/>
           </w:tcPr>
           <w:p>
-            <w:r>
+            <w:pPr>
+              <w:pStyle w:val="Normal"/>
+              <w:widowControl/>
+              <w:suppressAutoHyphens w:val="true"/>
+              <w:bidi w:val="0"/>
+              <w:spacing w:lineRule="auto" w:line="276" w:before="0" w:after="200"/>
+              <w:jc w:val="left"/>
+              <w:rPr/>
+            </w:pPr>
+            <w:r>
+              <w:rPr/>
               <w:t>Rechargeable battery pack</w:t>
               <w:br/>
               <w:t>Group: Power system</w:t>
               <w:br/>
               <w:t>Priority: Required</w:t>
               <w:br/>
-              <w:t>Recommended item: Protected Li-ion/LiPo or 18650 battery pack with BMS, target 37-74 Wh class after measured load.</w:t>
+              <w:t>Recommended item: 12.8 V 10 Ah LiFePO4 battery with built-in BMS, 128 Wh nominal capacity.</w:t>
               <w:br/>
-              <w:t>Planning price: PHP 1,500-3,500 planning range.</w:t>
+              <w:t>Planning price: PHP 1,500-3,500 planning range; verify current seller price before purchase.</w:t>
               <w:br/>
-              <w:t>Buy from or verify at: Shopee/Lazada battery and BMS listings.</w:t>
+              <w:t>Buy from or verify at: Shopee/Lazada LiFePO4 battery listings; acceptable substitute is 12.8 V 12 Ah if 10 Ah is unavailable.</w:t>
               <w:br/>
-              <w:t>Approval note: Final voltage follows charger/regulator and module requirements; capacity is validated by measured load.</w:t>
+              <w:t>Approval note: Realistic validation baseline for LTE/GPS peaks, night operation, and weak solar recovery. Final endurance still requires a 24-hour current log and solar recovery test.</w:t>
             </w:r>
           </w:p>
         </w:tc>
@@ -15707,7 +15933,17 @@
             <w:vAlign w:val="center"/>
           </w:tcPr>
           <w:p>
-            <w:r>
+            <w:pPr>
+              <w:pStyle w:val="Normal"/>
+              <w:widowControl/>
+              <w:suppressAutoHyphens w:val="true"/>
+              <w:bidi w:val="0"/>
+              <w:spacing w:lineRule="auto" w:line="276" w:before="0" w:after="200"/>
+              <w:jc w:val="left"/>
+              <w:rPr/>
+            </w:pPr>
+            <w:r>
+              <w:rPr/>
               <w:t>Compact solar panel set</w:t>
               <w:br/>
               <w:t>Group: Power system</w:t>

</xml_diff>